<commit_message>
Reduce docx colour saturation for readability
Replaced dark-navy table headers and bright teal code text with a
minimal palette: pale teal header fills with dark-slate text, near-white
alt rows, dark-navy code text on pale-blue background, and a clean white
cover block with a thin teal rule instead of dark fills.

Co-Authored-By: Claude Sonnet 4.6 <noreply@anthropic.com>
</commit_message>
<xml_diff>
--- a/docs/TEAM-BRIEF.docx
+++ b/docs/TEAM-BRIEF.docx
@@ -4,8 +4,20 @@
   <w:body>
     <w:p>
       <w:pPr>
-        <w:spacing w:before="80" w:after="240"/>
-        <w:shd w:val="clear" w:color="auto" w:fill="02374f"/>
+        <w:spacing w:before="0" w:after="0"/>
+        <w:pBdr>
+          <w:bottom w:val="single" w:sz="16" w:space="4" w:color="1FAFC0"/>
+        </w:pBdr>
+        <w:shd w:val="clear" w:color="auto" w:fill="FFFFFF"/>
+      </w:pPr>
+      <w:r>
+        <w:t/>
+      </w:r>
+    </w:p>
+    <w:p>
+      <w:pPr>
+        <w:spacing w:before="40" w:after="280"/>
+        <w:shd w:val="clear" w:color="auto" w:fill="FFFFFF"/>
       </w:pPr>
       <w:r>
         <w:rPr>
@@ -20,15 +32,15 @@
     </w:p>
     <w:p>
       <w:pPr>
-        <w:spacing w:before="40" w:after="40"/>
-        <w:shd w:val="clear" w:color="auto" w:fill="02374f"/>
+        <w:spacing w:before="40" w:after="80"/>
+        <w:shd w:val="clear" w:color="auto" w:fill="FFFFFF"/>
       </w:pPr>
       <w:r>
         <w:rPr>
           <w:rFonts w:ascii="Calibri" w:hAnsi="Calibri"/>
           <w:sz w:val="18"/>
           <w:szCs w:val="18"/>
-          <w:color w:val="FFFFFF"/>
+          <w:color w:val="3C3B43"/>
         </w:rPr>
         <w:t xml:space="preserve">Prepared by: Somesh Bhardwaj · Sr. System Admin, Full Stack AI Engineer</w:t>
       </w:r>
@@ -36,14 +48,14 @@
     <w:p>
       <w:pPr>
         <w:spacing w:before="40" w:after="80"/>
-        <w:shd w:val="clear" w:color="auto" w:fill="02374f"/>
+        <w:shd w:val="clear" w:color="auto" w:fill="FFFFFF"/>
       </w:pPr>
       <w:r>
         <w:rPr>
           <w:rFonts w:ascii="Calibri" w:hAnsi="Calibri"/>
           <w:sz w:val="22"/>
           <w:szCs w:val="22"/>
-          <w:color w:val="BFEEF5"/>
+          <w:color w:val="0080B0"/>
           <w:i/>
         </w:rPr>
         <w:t xml:space="preserve">Q2 2026 · For All Team Members</w:t>
@@ -51,15 +63,15 @@
     </w:p>
     <w:p>
       <w:pPr>
-        <w:spacing w:before="280" w:after="80"/>
-        <w:shd w:val="clear" w:color="auto" w:fill="02374f"/>
+        <w:spacing w:before="320" w:after="80"/>
+        <w:shd w:val="clear" w:color="auto" w:fill="FFFFFF"/>
       </w:pPr>
       <w:r>
         <w:rPr>
           <w:rFonts w:ascii="Calibri" w:hAnsi="Calibri"/>
-          <w:sz w:val="40"/>
-          <w:szCs w:val="40"/>
-          <w:color w:val="FFFFFF"/>
+          <w:sz w:val="44"/>
+          <w:szCs w:val="44"/>
+          <w:color w:val="024E70"/>
           <w:b/>
         </w:rPr>
         <w:t xml:space="preserve">Team Brief — contentment.org</w:t>
@@ -68,14 +80,14 @@
     <w:p>
       <w:pPr>
         <w:spacing w:before="0" w:after="0"/>
-        <w:shd w:val="clear" w:color="auto" w:fill="02374f"/>
+        <w:shd w:val="clear" w:color="auto" w:fill="FFFFFF"/>
       </w:pPr>
       <w:r>
         <w:rPr>
           <w:rFonts w:ascii="Calibri" w:hAnsi="Calibri"/>
           <w:sz w:val="12"/>
           <w:szCs w:val="12"/>
-          <w:color w:val="FFFFFF"/>
+          <w:color w:val="3C3B43"/>
         </w:rPr>
         <w:t xml:space="preserve"/>
       </w:r>
@@ -416,12 +428,12 @@
         </w:trPr>
         <w:tc>
           <w:tcPr>
-            <w:shd w:val="clear" w:color="auto" w:fill="02374f"/>
-            <w:tcBorders>
-              <w:top w:val="single" w:sz="4" w:space="0" w:color="D1D9DC"/>
-              <w:left w:val="single" w:sz="4" w:space="0" w:color="D1D9DC"/>
-              <w:bottom w:val="single" w:sz="4" w:space="0" w:color="D1D9DC"/>
-              <w:right w:val="single" w:sz="4" w:space="0" w:color="D1D9DC"/>
+            <w:shd w:val="clear" w:color="auto" w:fill="D6EFF2"/>
+            <w:tcBorders>
+              <w:top w:val="single" w:sz="4" w:space="0" w:color="C0D6DC"/>
+              <w:left w:val="single" w:sz="4" w:space="0" w:color="C0D6DC"/>
+              <w:bottom w:val="single" w:sz="4" w:space="0" w:color="C0D6DC"/>
+              <w:right w:val="single" w:sz="4" w:space="0" w:color="C0D6DC"/>
             </w:tcBorders>
             <w:tcMar>
               <w:top w:w="60" w:type="dxa"/>
@@ -439,7 +451,7 @@
               <w:rPr>
                 <w:rFonts w:ascii="Calibri" w:hAnsi="Calibri"/>
                 <w:b/>
-                <w:color w:val="FFFFFF"/>
+                <w:color w:val="024E70"/>
                 <w:sz w:val="19"/>
               </w:rPr>
               <w:t xml:space="preserve">Audience</w:t>
@@ -448,12 +460,12 @@
         </w:tc>
         <w:tc>
           <w:tcPr>
-            <w:shd w:val="clear" w:color="auto" w:fill="02374f"/>
-            <w:tcBorders>
-              <w:top w:val="single" w:sz="4" w:space="0" w:color="D1D9DC"/>
-              <w:left w:val="single" w:sz="4" w:space="0" w:color="D1D9DC"/>
-              <w:bottom w:val="single" w:sz="4" w:space="0" w:color="D1D9DC"/>
-              <w:right w:val="single" w:sz="4" w:space="0" w:color="D1D9DC"/>
+            <w:shd w:val="clear" w:color="auto" w:fill="D6EFF2"/>
+            <w:tcBorders>
+              <w:top w:val="single" w:sz="4" w:space="0" w:color="C0D6DC"/>
+              <w:left w:val="single" w:sz="4" w:space="0" w:color="C0D6DC"/>
+              <w:bottom w:val="single" w:sz="4" w:space="0" w:color="C0D6DC"/>
+              <w:right w:val="single" w:sz="4" w:space="0" w:color="C0D6DC"/>
             </w:tcBorders>
             <w:tcMar>
               <w:top w:w="60" w:type="dxa"/>
@@ -471,7 +483,7 @@
               <w:rPr>
                 <w:rFonts w:ascii="Calibri" w:hAnsi="Calibri"/>
                 <w:b/>
-                <w:color w:val="FFFFFF"/>
+                <w:color w:val="024E70"/>
                 <w:sz w:val="19"/>
               </w:rPr>
               <w:t xml:space="preserve">Inner voice</w:t>
@@ -480,12 +492,12 @@
         </w:tc>
         <w:tc>
           <w:tcPr>
-            <w:shd w:val="clear" w:color="auto" w:fill="02374f"/>
-            <w:tcBorders>
-              <w:top w:val="single" w:sz="4" w:space="0" w:color="D1D9DC"/>
-              <w:left w:val="single" w:sz="4" w:space="0" w:color="D1D9DC"/>
-              <w:bottom w:val="single" w:sz="4" w:space="0" w:color="D1D9DC"/>
-              <w:right w:val="single" w:sz="4" w:space="0" w:color="D1D9DC"/>
+            <w:shd w:val="clear" w:color="auto" w:fill="D6EFF2"/>
+            <w:tcBorders>
+              <w:top w:val="single" w:sz="4" w:space="0" w:color="C0D6DC"/>
+              <w:left w:val="single" w:sz="4" w:space="0" w:color="C0D6DC"/>
+              <w:bottom w:val="single" w:sz="4" w:space="0" w:color="C0D6DC"/>
+              <w:right w:val="single" w:sz="4" w:space="0" w:color="C0D6DC"/>
             </w:tcBorders>
             <w:tcMar>
               <w:top w:w="60" w:type="dxa"/>
@@ -503,7 +515,7 @@
               <w:rPr>
                 <w:rFonts w:ascii="Calibri" w:hAnsi="Calibri"/>
                 <w:b/>
-                <w:color w:val="FFFFFF"/>
+                <w:color w:val="024E70"/>
                 <w:sz w:val="19"/>
               </w:rPr>
               <w:t xml:space="preserve">Destination</w:t>
@@ -516,10 +528,10 @@
           <w:tcPr>
             <w:shd w:val="clear" w:color="auto" w:fill="FFFFFF"/>
             <w:tcBorders>
-              <w:top w:val="single" w:sz="4" w:space="0" w:color="D1D9DC"/>
-              <w:left w:val="single" w:sz="4" w:space="0" w:color="D1D9DC"/>
-              <w:bottom w:val="single" w:sz="4" w:space="0" w:color="D1D9DC"/>
-              <w:right w:val="single" w:sz="4" w:space="0" w:color="D1D9DC"/>
+              <w:top w:val="single" w:sz="4" w:space="0" w:color="C0D6DC"/>
+              <w:left w:val="single" w:sz="4" w:space="0" w:color="C0D6DC"/>
+              <w:bottom w:val="single" w:sz="4" w:space="0" w:color="C0D6DC"/>
+              <w:right w:val="single" w:sz="4" w:space="0" w:color="C0D6DC"/>
             </w:tcBorders>
             <w:tcMar>
               <w:top w:w="60" w:type="dxa"/>
@@ -565,10 +577,10 @@
           <w:tcPr>
             <w:shd w:val="clear" w:color="auto" w:fill="FFFFFF"/>
             <w:tcBorders>
-              <w:top w:val="single" w:sz="4" w:space="0" w:color="D1D9DC"/>
-              <w:left w:val="single" w:sz="4" w:space="0" w:color="D1D9DC"/>
-              <w:bottom w:val="single" w:sz="4" w:space="0" w:color="D1D9DC"/>
-              <w:right w:val="single" w:sz="4" w:space="0" w:color="D1D9DC"/>
+              <w:top w:val="single" w:sz="4" w:space="0" w:color="C0D6DC"/>
+              <w:left w:val="single" w:sz="4" w:space="0" w:color="C0D6DC"/>
+              <w:bottom w:val="single" w:sz="4" w:space="0" w:color="C0D6DC"/>
+              <w:right w:val="single" w:sz="4" w:space="0" w:color="C0D6DC"/>
             </w:tcBorders>
             <w:tcMar>
               <w:top w:w="60" w:type="dxa"/>
@@ -596,10 +608,10 @@
           <w:tcPr>
             <w:shd w:val="clear" w:color="auto" w:fill="FFFFFF"/>
             <w:tcBorders>
-              <w:top w:val="single" w:sz="4" w:space="0" w:color="D1D9DC"/>
-              <w:left w:val="single" w:sz="4" w:space="0" w:color="D1D9DC"/>
-              <w:bottom w:val="single" w:sz="4" w:space="0" w:color="D1D9DC"/>
-              <w:right w:val="single" w:sz="4" w:space="0" w:color="D1D9DC"/>
+              <w:top w:val="single" w:sz="4" w:space="0" w:color="C0D6DC"/>
+              <w:left w:val="single" w:sz="4" w:space="0" w:color="C0D6DC"/>
+              <w:bottom w:val="single" w:sz="4" w:space="0" w:color="C0D6DC"/>
+              <w:right w:val="single" w:sz="4" w:space="0" w:color="C0D6DC"/>
             </w:tcBorders>
             <w:tcMar>
               <w:top w:w="60" w:type="dxa"/>
@@ -627,12 +639,12 @@
       <w:tr>
         <w:tc>
           <w:tcPr>
-            <w:shd w:val="clear" w:color="auto" w:fill="E8F1F2"/>
-            <w:tcBorders>
-              <w:top w:val="single" w:sz="4" w:space="0" w:color="D1D9DC"/>
-              <w:left w:val="single" w:sz="4" w:space="0" w:color="D1D9DC"/>
-              <w:bottom w:val="single" w:sz="4" w:space="0" w:color="D1D9DC"/>
-              <w:right w:val="single" w:sz="4" w:space="0" w:color="D1D9DC"/>
+            <w:shd w:val="clear" w:color="auto" w:fill="F7FAFB"/>
+            <w:tcBorders>
+              <w:top w:val="single" w:sz="4" w:space="0" w:color="C0D6DC"/>
+              <w:left w:val="single" w:sz="4" w:space="0" w:color="C0D6DC"/>
+              <w:bottom w:val="single" w:sz="4" w:space="0" w:color="C0D6DC"/>
+              <w:right w:val="single" w:sz="4" w:space="0" w:color="C0D6DC"/>
             </w:tcBorders>
             <w:tcMar>
               <w:top w:w="60" w:type="dxa"/>
@@ -660,12 +672,12 @@
         </w:tc>
         <w:tc>
           <w:tcPr>
-            <w:shd w:val="clear" w:color="auto" w:fill="E8F1F2"/>
-            <w:tcBorders>
-              <w:top w:val="single" w:sz="4" w:space="0" w:color="D1D9DC"/>
-              <w:left w:val="single" w:sz="4" w:space="0" w:color="D1D9DC"/>
-              <w:bottom w:val="single" w:sz="4" w:space="0" w:color="D1D9DC"/>
-              <w:right w:val="single" w:sz="4" w:space="0" w:color="D1D9DC"/>
+            <w:shd w:val="clear" w:color="auto" w:fill="F7FAFB"/>
+            <w:tcBorders>
+              <w:top w:val="single" w:sz="4" w:space="0" w:color="C0D6DC"/>
+              <w:left w:val="single" w:sz="4" w:space="0" w:color="C0D6DC"/>
+              <w:bottom w:val="single" w:sz="4" w:space="0" w:color="C0D6DC"/>
+              <w:right w:val="single" w:sz="4" w:space="0" w:color="C0D6DC"/>
             </w:tcBorders>
             <w:tcMar>
               <w:top w:w="60" w:type="dxa"/>
@@ -691,12 +703,12 @@
         </w:tc>
         <w:tc>
           <w:tcPr>
-            <w:shd w:val="clear" w:color="auto" w:fill="E8F1F2"/>
-            <w:tcBorders>
-              <w:top w:val="single" w:sz="4" w:space="0" w:color="D1D9DC"/>
-              <w:left w:val="single" w:sz="4" w:space="0" w:color="D1D9DC"/>
-              <w:bottom w:val="single" w:sz="4" w:space="0" w:color="D1D9DC"/>
-              <w:right w:val="single" w:sz="4" w:space="0" w:color="D1D9DC"/>
+            <w:shd w:val="clear" w:color="auto" w:fill="F7FAFB"/>
+            <w:tcBorders>
+              <w:top w:val="single" w:sz="4" w:space="0" w:color="C0D6DC"/>
+              <w:left w:val="single" w:sz="4" w:space="0" w:color="C0D6DC"/>
+              <w:bottom w:val="single" w:sz="4" w:space="0" w:color="C0D6DC"/>
+              <w:right w:val="single" w:sz="4" w:space="0" w:color="C0D6DC"/>
             </w:tcBorders>
             <w:tcMar>
               <w:top w:w="60" w:type="dxa"/>
@@ -726,10 +738,10 @@
           <w:tcPr>
             <w:shd w:val="clear" w:color="auto" w:fill="FFFFFF"/>
             <w:tcBorders>
-              <w:top w:val="single" w:sz="4" w:space="0" w:color="D1D9DC"/>
-              <w:left w:val="single" w:sz="4" w:space="0" w:color="D1D9DC"/>
-              <w:bottom w:val="single" w:sz="4" w:space="0" w:color="D1D9DC"/>
-              <w:right w:val="single" w:sz="4" w:space="0" w:color="D1D9DC"/>
+              <w:top w:val="single" w:sz="4" w:space="0" w:color="C0D6DC"/>
+              <w:left w:val="single" w:sz="4" w:space="0" w:color="C0D6DC"/>
+              <w:bottom w:val="single" w:sz="4" w:space="0" w:color="C0D6DC"/>
+              <w:right w:val="single" w:sz="4" w:space="0" w:color="C0D6DC"/>
             </w:tcBorders>
             <w:tcMar>
               <w:top w:w="60" w:type="dxa"/>
@@ -759,10 +771,10 @@
           <w:tcPr>
             <w:shd w:val="clear" w:color="auto" w:fill="FFFFFF"/>
             <w:tcBorders>
-              <w:top w:val="single" w:sz="4" w:space="0" w:color="D1D9DC"/>
-              <w:left w:val="single" w:sz="4" w:space="0" w:color="D1D9DC"/>
-              <w:bottom w:val="single" w:sz="4" w:space="0" w:color="D1D9DC"/>
-              <w:right w:val="single" w:sz="4" w:space="0" w:color="D1D9DC"/>
+              <w:top w:val="single" w:sz="4" w:space="0" w:color="C0D6DC"/>
+              <w:left w:val="single" w:sz="4" w:space="0" w:color="C0D6DC"/>
+              <w:bottom w:val="single" w:sz="4" w:space="0" w:color="C0D6DC"/>
+              <w:right w:val="single" w:sz="4" w:space="0" w:color="C0D6DC"/>
             </w:tcBorders>
             <w:tcMar>
               <w:top w:w="60" w:type="dxa"/>
@@ -790,10 +802,10 @@
           <w:tcPr>
             <w:shd w:val="clear" w:color="auto" w:fill="FFFFFF"/>
             <w:tcBorders>
-              <w:top w:val="single" w:sz="4" w:space="0" w:color="D1D9DC"/>
-              <w:left w:val="single" w:sz="4" w:space="0" w:color="D1D9DC"/>
-              <w:bottom w:val="single" w:sz="4" w:space="0" w:color="D1D9DC"/>
-              <w:right w:val="single" w:sz="4" w:space="0" w:color="D1D9DC"/>
+              <w:top w:val="single" w:sz="4" w:space="0" w:color="C0D6DC"/>
+              <w:left w:val="single" w:sz="4" w:space="0" w:color="C0D6DC"/>
+              <w:bottom w:val="single" w:sz="4" w:space="0" w:color="C0D6DC"/>
+              <w:right w:val="single" w:sz="4" w:space="0" w:color="C0D6DC"/>
             </w:tcBorders>
             <w:tcMar>
               <w:top w:w="60" w:type="dxa"/>
@@ -862,12 +874,12 @@
         </w:trPr>
         <w:tc>
           <w:tcPr>
-            <w:shd w:val="clear" w:color="auto" w:fill="02374f"/>
-            <w:tcBorders>
-              <w:top w:val="single" w:sz="4" w:space="0" w:color="D1D9DC"/>
-              <w:left w:val="single" w:sz="4" w:space="0" w:color="D1D9DC"/>
-              <w:bottom w:val="single" w:sz="4" w:space="0" w:color="D1D9DC"/>
-              <w:right w:val="single" w:sz="4" w:space="0" w:color="D1D9DC"/>
+            <w:shd w:val="clear" w:color="auto" w:fill="D6EFF2"/>
+            <w:tcBorders>
+              <w:top w:val="single" w:sz="4" w:space="0" w:color="C0D6DC"/>
+              <w:left w:val="single" w:sz="4" w:space="0" w:color="C0D6DC"/>
+              <w:bottom w:val="single" w:sz="4" w:space="0" w:color="C0D6DC"/>
+              <w:right w:val="single" w:sz="4" w:space="0" w:color="C0D6DC"/>
             </w:tcBorders>
             <w:tcMar>
               <w:top w:w="60" w:type="dxa"/>
@@ -885,7 +897,7 @@
               <w:rPr>
                 <w:rFonts w:ascii="Calibri" w:hAnsi="Calibri"/>
                 <w:b/>
-                <w:color w:val="FFFFFF"/>
+                <w:color w:val="024E70"/>
                 <w:sz w:val="19"/>
               </w:rPr>
               <w:t xml:space="preserve">Step</w:t>
@@ -894,12 +906,12 @@
         </w:tc>
         <w:tc>
           <w:tcPr>
-            <w:shd w:val="clear" w:color="auto" w:fill="02374f"/>
-            <w:tcBorders>
-              <w:top w:val="single" w:sz="4" w:space="0" w:color="D1D9DC"/>
-              <w:left w:val="single" w:sz="4" w:space="0" w:color="D1D9DC"/>
-              <w:bottom w:val="single" w:sz="4" w:space="0" w:color="D1D9DC"/>
-              <w:right w:val="single" w:sz="4" w:space="0" w:color="D1D9DC"/>
+            <w:shd w:val="clear" w:color="auto" w:fill="D6EFF2"/>
+            <w:tcBorders>
+              <w:top w:val="single" w:sz="4" w:space="0" w:color="C0D6DC"/>
+              <w:left w:val="single" w:sz="4" w:space="0" w:color="C0D6DC"/>
+              <w:bottom w:val="single" w:sz="4" w:space="0" w:color="C0D6DC"/>
+              <w:right w:val="single" w:sz="4" w:space="0" w:color="C0D6DC"/>
             </w:tcBorders>
             <w:tcMar>
               <w:top w:w="60" w:type="dxa"/>
@@ -917,7 +929,7 @@
               <w:rPr>
                 <w:rFonts w:ascii="Calibri" w:hAnsi="Calibri"/>
                 <w:b/>
-                <w:color w:val="FFFFFF"/>
+                <w:color w:val="024E70"/>
                 <w:sz w:val="19"/>
               </w:rPr>
               <w:t xml:space="preserve">Visitor’s inner voice</w:t>
@@ -926,12 +938,12 @@
         </w:tc>
         <w:tc>
           <w:tcPr>
-            <w:shd w:val="clear" w:color="auto" w:fill="02374f"/>
-            <w:tcBorders>
-              <w:top w:val="single" w:sz="4" w:space="0" w:color="D1D9DC"/>
-              <w:left w:val="single" w:sz="4" w:space="0" w:color="D1D9DC"/>
-              <w:bottom w:val="single" w:sz="4" w:space="0" w:color="D1D9DC"/>
-              <w:right w:val="single" w:sz="4" w:space="0" w:color="D1D9DC"/>
+            <w:shd w:val="clear" w:color="auto" w:fill="D6EFF2"/>
+            <w:tcBorders>
+              <w:top w:val="single" w:sz="4" w:space="0" w:color="C0D6DC"/>
+              <w:left w:val="single" w:sz="4" w:space="0" w:color="C0D6DC"/>
+              <w:bottom w:val="single" w:sz="4" w:space="0" w:color="C0D6DC"/>
+              <w:right w:val="single" w:sz="4" w:space="0" w:color="C0D6DC"/>
             </w:tcBorders>
             <w:tcMar>
               <w:top w:w="60" w:type="dxa"/>
@@ -949,7 +961,7 @@
               <w:rPr>
                 <w:rFonts w:ascii="Calibri" w:hAnsi="Calibri"/>
                 <w:b/>
-                <w:color w:val="FFFFFF"/>
+                <w:color w:val="024E70"/>
                 <w:sz w:val="19"/>
               </w:rPr>
               <w:t xml:space="preserve">Key proof at this step</w:t>
@@ -962,10 +974,10 @@
           <w:tcPr>
             <w:shd w:val="clear" w:color="auto" w:fill="FFFFFF"/>
             <w:tcBorders>
-              <w:top w:val="single" w:sz="4" w:space="0" w:color="D1D9DC"/>
-              <w:left w:val="single" w:sz="4" w:space="0" w:color="D1D9DC"/>
-              <w:bottom w:val="single" w:sz="4" w:space="0" w:color="D1D9DC"/>
-              <w:right w:val="single" w:sz="4" w:space="0" w:color="D1D9DC"/>
+              <w:top w:val="single" w:sz="4" w:space="0" w:color="C0D6DC"/>
+              <w:left w:val="single" w:sz="4" w:space="0" w:color="C0D6DC"/>
+              <w:bottom w:val="single" w:sz="4" w:space="0" w:color="C0D6DC"/>
+              <w:right w:val="single" w:sz="4" w:space="0" w:color="C0D6DC"/>
             </w:tcBorders>
             <w:tcMar>
               <w:top w:w="60" w:type="dxa"/>
@@ -993,10 +1005,10 @@
           <w:tcPr>
             <w:shd w:val="clear" w:color="auto" w:fill="FFFFFF"/>
             <w:tcBorders>
-              <w:top w:val="single" w:sz="4" w:space="0" w:color="D1D9DC"/>
-              <w:left w:val="single" w:sz="4" w:space="0" w:color="D1D9DC"/>
-              <w:bottom w:val="single" w:sz="4" w:space="0" w:color="D1D9DC"/>
-              <w:right w:val="single" w:sz="4" w:space="0" w:color="D1D9DC"/>
+              <w:top w:val="single" w:sz="4" w:space="0" w:color="C0D6DC"/>
+              <w:left w:val="single" w:sz="4" w:space="0" w:color="C0D6DC"/>
+              <w:bottom w:val="single" w:sz="4" w:space="0" w:color="C0D6DC"/>
+              <w:right w:val="single" w:sz="4" w:space="0" w:color="C0D6DC"/>
             </w:tcBorders>
             <w:tcMar>
               <w:top w:w="60" w:type="dxa"/>
@@ -1024,10 +1036,10 @@
           <w:tcPr>
             <w:shd w:val="clear" w:color="auto" w:fill="FFFFFF"/>
             <w:tcBorders>
-              <w:top w:val="single" w:sz="4" w:space="0" w:color="D1D9DC"/>
-              <w:left w:val="single" w:sz="4" w:space="0" w:color="D1D9DC"/>
-              <w:bottom w:val="single" w:sz="4" w:space="0" w:color="D1D9DC"/>
-              <w:right w:val="single" w:sz="4" w:space="0" w:color="D1D9DC"/>
+              <w:top w:val="single" w:sz="4" w:space="0" w:color="C0D6DC"/>
+              <w:left w:val="single" w:sz="4" w:space="0" w:color="C0D6DC"/>
+              <w:bottom w:val="single" w:sz="4" w:space="0" w:color="C0D6DC"/>
+              <w:right w:val="single" w:sz="4" w:space="0" w:color="C0D6DC"/>
             </w:tcBorders>
             <w:tcMar>
               <w:top w:w="60" w:type="dxa"/>
@@ -1055,12 +1067,12 @@
       <w:tr>
         <w:tc>
           <w:tcPr>
-            <w:shd w:val="clear" w:color="auto" w:fill="E8F1F2"/>
-            <w:tcBorders>
-              <w:top w:val="single" w:sz="4" w:space="0" w:color="D1D9DC"/>
-              <w:left w:val="single" w:sz="4" w:space="0" w:color="D1D9DC"/>
-              <w:bottom w:val="single" w:sz="4" w:space="0" w:color="D1D9DC"/>
-              <w:right w:val="single" w:sz="4" w:space="0" w:color="D1D9DC"/>
+            <w:shd w:val="clear" w:color="auto" w:fill="F7FAFB"/>
+            <w:tcBorders>
+              <w:top w:val="single" w:sz="4" w:space="0" w:color="C0D6DC"/>
+              <w:left w:val="single" w:sz="4" w:space="0" w:color="C0D6DC"/>
+              <w:bottom w:val="single" w:sz="4" w:space="0" w:color="C0D6DC"/>
+              <w:right w:val="single" w:sz="4" w:space="0" w:color="C0D6DC"/>
             </w:tcBorders>
             <w:tcMar>
               <w:top w:w="60" w:type="dxa"/>
@@ -1086,12 +1098,12 @@
         </w:tc>
         <w:tc>
           <w:tcPr>
-            <w:shd w:val="clear" w:color="auto" w:fill="E8F1F2"/>
-            <w:tcBorders>
-              <w:top w:val="single" w:sz="4" w:space="0" w:color="D1D9DC"/>
-              <w:left w:val="single" w:sz="4" w:space="0" w:color="D1D9DC"/>
-              <w:bottom w:val="single" w:sz="4" w:space="0" w:color="D1D9DC"/>
-              <w:right w:val="single" w:sz="4" w:space="0" w:color="D1D9DC"/>
+            <w:shd w:val="clear" w:color="auto" w:fill="F7FAFB"/>
+            <w:tcBorders>
+              <w:top w:val="single" w:sz="4" w:space="0" w:color="C0D6DC"/>
+              <w:left w:val="single" w:sz="4" w:space="0" w:color="C0D6DC"/>
+              <w:bottom w:val="single" w:sz="4" w:space="0" w:color="C0D6DC"/>
+              <w:right w:val="single" w:sz="4" w:space="0" w:color="C0D6DC"/>
             </w:tcBorders>
             <w:tcMar>
               <w:top w:w="60" w:type="dxa"/>
@@ -1117,12 +1129,12 @@
         </w:tc>
         <w:tc>
           <w:tcPr>
-            <w:shd w:val="clear" w:color="auto" w:fill="E8F1F2"/>
-            <w:tcBorders>
-              <w:top w:val="single" w:sz="4" w:space="0" w:color="D1D9DC"/>
-              <w:left w:val="single" w:sz="4" w:space="0" w:color="D1D9DC"/>
-              <w:bottom w:val="single" w:sz="4" w:space="0" w:color="D1D9DC"/>
-              <w:right w:val="single" w:sz="4" w:space="0" w:color="D1D9DC"/>
+            <w:shd w:val="clear" w:color="auto" w:fill="F7FAFB"/>
+            <w:tcBorders>
+              <w:top w:val="single" w:sz="4" w:space="0" w:color="C0D6DC"/>
+              <w:left w:val="single" w:sz="4" w:space="0" w:color="C0D6DC"/>
+              <w:bottom w:val="single" w:sz="4" w:space="0" w:color="C0D6DC"/>
+              <w:right w:val="single" w:sz="4" w:space="0" w:color="C0D6DC"/>
             </w:tcBorders>
             <w:tcMar>
               <w:top w:w="60" w:type="dxa"/>
@@ -1152,10 +1164,10 @@
           <w:tcPr>
             <w:shd w:val="clear" w:color="auto" w:fill="FFFFFF"/>
             <w:tcBorders>
-              <w:top w:val="single" w:sz="4" w:space="0" w:color="D1D9DC"/>
-              <w:left w:val="single" w:sz="4" w:space="0" w:color="D1D9DC"/>
-              <w:bottom w:val="single" w:sz="4" w:space="0" w:color="D1D9DC"/>
-              <w:right w:val="single" w:sz="4" w:space="0" w:color="D1D9DC"/>
+              <w:top w:val="single" w:sz="4" w:space="0" w:color="C0D6DC"/>
+              <w:left w:val="single" w:sz="4" w:space="0" w:color="C0D6DC"/>
+              <w:bottom w:val="single" w:sz="4" w:space="0" w:color="C0D6DC"/>
+              <w:right w:val="single" w:sz="4" w:space="0" w:color="C0D6DC"/>
             </w:tcBorders>
             <w:tcMar>
               <w:top w:w="60" w:type="dxa"/>
@@ -1183,10 +1195,10 @@
           <w:tcPr>
             <w:shd w:val="clear" w:color="auto" w:fill="FFFFFF"/>
             <w:tcBorders>
-              <w:top w:val="single" w:sz="4" w:space="0" w:color="D1D9DC"/>
-              <w:left w:val="single" w:sz="4" w:space="0" w:color="D1D9DC"/>
-              <w:bottom w:val="single" w:sz="4" w:space="0" w:color="D1D9DC"/>
-              <w:right w:val="single" w:sz="4" w:space="0" w:color="D1D9DC"/>
+              <w:top w:val="single" w:sz="4" w:space="0" w:color="C0D6DC"/>
+              <w:left w:val="single" w:sz="4" w:space="0" w:color="C0D6DC"/>
+              <w:bottom w:val="single" w:sz="4" w:space="0" w:color="C0D6DC"/>
+              <w:right w:val="single" w:sz="4" w:space="0" w:color="C0D6DC"/>
             </w:tcBorders>
             <w:tcMar>
               <w:top w:w="60" w:type="dxa"/>
@@ -1214,10 +1226,10 @@
           <w:tcPr>
             <w:shd w:val="clear" w:color="auto" w:fill="FFFFFF"/>
             <w:tcBorders>
-              <w:top w:val="single" w:sz="4" w:space="0" w:color="D1D9DC"/>
-              <w:left w:val="single" w:sz="4" w:space="0" w:color="D1D9DC"/>
-              <w:bottom w:val="single" w:sz="4" w:space="0" w:color="D1D9DC"/>
-              <w:right w:val="single" w:sz="4" w:space="0" w:color="D1D9DC"/>
+              <w:top w:val="single" w:sz="4" w:space="0" w:color="C0D6DC"/>
+              <w:left w:val="single" w:sz="4" w:space="0" w:color="C0D6DC"/>
+              <w:bottom w:val="single" w:sz="4" w:space="0" w:color="C0D6DC"/>
+              <w:right w:val="single" w:sz="4" w:space="0" w:color="C0D6DC"/>
             </w:tcBorders>
             <w:tcMar>
               <w:top w:w="60" w:type="dxa"/>
@@ -1245,12 +1257,12 @@
       <w:tr>
         <w:tc>
           <w:tcPr>
-            <w:shd w:val="clear" w:color="auto" w:fill="E8F1F2"/>
-            <w:tcBorders>
-              <w:top w:val="single" w:sz="4" w:space="0" w:color="D1D9DC"/>
-              <w:left w:val="single" w:sz="4" w:space="0" w:color="D1D9DC"/>
-              <w:bottom w:val="single" w:sz="4" w:space="0" w:color="D1D9DC"/>
-              <w:right w:val="single" w:sz="4" w:space="0" w:color="D1D9DC"/>
+            <w:shd w:val="clear" w:color="auto" w:fill="F7FAFB"/>
+            <w:tcBorders>
+              <w:top w:val="single" w:sz="4" w:space="0" w:color="C0D6DC"/>
+              <w:left w:val="single" w:sz="4" w:space="0" w:color="C0D6DC"/>
+              <w:bottom w:val="single" w:sz="4" w:space="0" w:color="C0D6DC"/>
+              <w:right w:val="single" w:sz="4" w:space="0" w:color="C0D6DC"/>
             </w:tcBorders>
             <w:tcMar>
               <w:top w:w="60" w:type="dxa"/>
@@ -1276,12 +1288,12 @@
         </w:tc>
         <w:tc>
           <w:tcPr>
-            <w:shd w:val="clear" w:color="auto" w:fill="E8F1F2"/>
-            <w:tcBorders>
-              <w:top w:val="single" w:sz="4" w:space="0" w:color="D1D9DC"/>
-              <w:left w:val="single" w:sz="4" w:space="0" w:color="D1D9DC"/>
-              <w:bottom w:val="single" w:sz="4" w:space="0" w:color="D1D9DC"/>
-              <w:right w:val="single" w:sz="4" w:space="0" w:color="D1D9DC"/>
+            <w:shd w:val="clear" w:color="auto" w:fill="F7FAFB"/>
+            <w:tcBorders>
+              <w:top w:val="single" w:sz="4" w:space="0" w:color="C0D6DC"/>
+              <w:left w:val="single" w:sz="4" w:space="0" w:color="C0D6DC"/>
+              <w:bottom w:val="single" w:sz="4" w:space="0" w:color="C0D6DC"/>
+              <w:right w:val="single" w:sz="4" w:space="0" w:color="C0D6DC"/>
             </w:tcBorders>
             <w:tcMar>
               <w:top w:w="60" w:type="dxa"/>
@@ -1307,12 +1319,12 @@
         </w:tc>
         <w:tc>
           <w:tcPr>
-            <w:shd w:val="clear" w:color="auto" w:fill="E8F1F2"/>
-            <w:tcBorders>
-              <w:top w:val="single" w:sz="4" w:space="0" w:color="D1D9DC"/>
-              <w:left w:val="single" w:sz="4" w:space="0" w:color="D1D9DC"/>
-              <w:bottom w:val="single" w:sz="4" w:space="0" w:color="D1D9DC"/>
-              <w:right w:val="single" w:sz="4" w:space="0" w:color="D1D9DC"/>
+            <w:shd w:val="clear" w:color="auto" w:fill="F7FAFB"/>
+            <w:tcBorders>
+              <w:top w:val="single" w:sz="4" w:space="0" w:color="C0D6DC"/>
+              <w:left w:val="single" w:sz="4" w:space="0" w:color="C0D6DC"/>
+              <w:bottom w:val="single" w:sz="4" w:space="0" w:color="C0D6DC"/>
+              <w:right w:val="single" w:sz="4" w:space="0" w:color="C0D6DC"/>
             </w:tcBorders>
             <w:tcMar>
               <w:top w:w="60" w:type="dxa"/>
@@ -1342,10 +1354,10 @@
           <w:tcPr>
             <w:shd w:val="clear" w:color="auto" w:fill="FFFFFF"/>
             <w:tcBorders>
-              <w:top w:val="single" w:sz="4" w:space="0" w:color="D1D9DC"/>
-              <w:left w:val="single" w:sz="4" w:space="0" w:color="D1D9DC"/>
-              <w:bottom w:val="single" w:sz="4" w:space="0" w:color="D1D9DC"/>
-              <w:right w:val="single" w:sz="4" w:space="0" w:color="D1D9DC"/>
+              <w:top w:val="single" w:sz="4" w:space="0" w:color="C0D6DC"/>
+              <w:left w:val="single" w:sz="4" w:space="0" w:color="C0D6DC"/>
+              <w:bottom w:val="single" w:sz="4" w:space="0" w:color="C0D6DC"/>
+              <w:right w:val="single" w:sz="4" w:space="0" w:color="C0D6DC"/>
             </w:tcBorders>
             <w:tcMar>
               <w:top w:w="60" w:type="dxa"/>
@@ -1373,10 +1385,10 @@
           <w:tcPr>
             <w:shd w:val="clear" w:color="auto" w:fill="FFFFFF"/>
             <w:tcBorders>
-              <w:top w:val="single" w:sz="4" w:space="0" w:color="D1D9DC"/>
-              <w:left w:val="single" w:sz="4" w:space="0" w:color="D1D9DC"/>
-              <w:bottom w:val="single" w:sz="4" w:space="0" w:color="D1D9DC"/>
-              <w:right w:val="single" w:sz="4" w:space="0" w:color="D1D9DC"/>
+              <w:top w:val="single" w:sz="4" w:space="0" w:color="C0D6DC"/>
+              <w:left w:val="single" w:sz="4" w:space="0" w:color="C0D6DC"/>
+              <w:bottom w:val="single" w:sz="4" w:space="0" w:color="C0D6DC"/>
+              <w:right w:val="single" w:sz="4" w:space="0" w:color="C0D6DC"/>
             </w:tcBorders>
             <w:tcMar>
               <w:top w:w="60" w:type="dxa"/>
@@ -1404,10 +1416,10 @@
           <w:tcPr>
             <w:shd w:val="clear" w:color="auto" w:fill="FFFFFF"/>
             <w:tcBorders>
-              <w:top w:val="single" w:sz="4" w:space="0" w:color="D1D9DC"/>
-              <w:left w:val="single" w:sz="4" w:space="0" w:color="D1D9DC"/>
-              <w:bottom w:val="single" w:sz="4" w:space="0" w:color="D1D9DC"/>
-              <w:right w:val="single" w:sz="4" w:space="0" w:color="D1D9DC"/>
+              <w:top w:val="single" w:sz="4" w:space="0" w:color="C0D6DC"/>
+              <w:left w:val="single" w:sz="4" w:space="0" w:color="C0D6DC"/>
+              <w:bottom w:val="single" w:sz="4" w:space="0" w:color="C0D6DC"/>
+              <w:right w:val="single" w:sz="4" w:space="0" w:color="C0D6DC"/>
             </w:tcBorders>
             <w:tcMar>
               <w:top w:w="60" w:type="dxa"/>
@@ -1469,12 +1481,12 @@
         </w:trPr>
         <w:tc>
           <w:tcPr>
-            <w:shd w:val="clear" w:color="auto" w:fill="02374f"/>
-            <w:tcBorders>
-              <w:top w:val="single" w:sz="4" w:space="0" w:color="D1D9DC"/>
-              <w:left w:val="single" w:sz="4" w:space="0" w:color="D1D9DC"/>
-              <w:bottom w:val="single" w:sz="4" w:space="0" w:color="D1D9DC"/>
-              <w:right w:val="single" w:sz="4" w:space="0" w:color="D1D9DC"/>
+            <w:shd w:val="clear" w:color="auto" w:fill="D6EFF2"/>
+            <w:tcBorders>
+              <w:top w:val="single" w:sz="4" w:space="0" w:color="C0D6DC"/>
+              <w:left w:val="single" w:sz="4" w:space="0" w:color="C0D6DC"/>
+              <w:bottom w:val="single" w:sz="4" w:space="0" w:color="C0D6DC"/>
+              <w:right w:val="single" w:sz="4" w:space="0" w:color="C0D6DC"/>
             </w:tcBorders>
             <w:tcMar>
               <w:top w:w="60" w:type="dxa"/>
@@ -1492,7 +1504,7 @@
               <w:rPr>
                 <w:rFonts w:ascii="Calibri" w:hAnsi="Calibri"/>
                 <w:b/>
-                <w:color w:val="FFFFFF"/>
+                <w:color w:val="024E70"/>
                 <w:sz w:val="19"/>
               </w:rPr>
               <w:t xml:space="preserve">Page</w:t>
@@ -1501,12 +1513,12 @@
         </w:tc>
         <w:tc>
           <w:tcPr>
-            <w:shd w:val="clear" w:color="auto" w:fill="02374f"/>
-            <w:tcBorders>
-              <w:top w:val="single" w:sz="4" w:space="0" w:color="D1D9DC"/>
-              <w:left w:val="single" w:sz="4" w:space="0" w:color="D1D9DC"/>
-              <w:bottom w:val="single" w:sz="4" w:space="0" w:color="D1D9DC"/>
-              <w:right w:val="single" w:sz="4" w:space="0" w:color="D1D9DC"/>
+            <w:shd w:val="clear" w:color="auto" w:fill="D6EFF2"/>
+            <w:tcBorders>
+              <w:top w:val="single" w:sz="4" w:space="0" w:color="C0D6DC"/>
+              <w:left w:val="single" w:sz="4" w:space="0" w:color="C0D6DC"/>
+              <w:bottom w:val="single" w:sz="4" w:space="0" w:color="C0D6DC"/>
+              <w:right w:val="single" w:sz="4" w:space="0" w:color="C0D6DC"/>
             </w:tcBorders>
             <w:tcMar>
               <w:top w:w="60" w:type="dxa"/>
@@ -1524,7 +1536,7 @@
               <w:rPr>
                 <w:rFonts w:ascii="Calibri" w:hAnsi="Calibri"/>
                 <w:b/>
-                <w:color w:val="FFFFFF"/>
+                <w:color w:val="024E70"/>
                 <w:sz w:val="19"/>
               </w:rPr>
               <w:t xml:space="preserve">URL</w:t>
@@ -1533,12 +1545,12 @@
         </w:tc>
         <w:tc>
           <w:tcPr>
-            <w:shd w:val="clear" w:color="auto" w:fill="02374f"/>
-            <w:tcBorders>
-              <w:top w:val="single" w:sz="4" w:space="0" w:color="D1D9DC"/>
-              <w:left w:val="single" w:sz="4" w:space="0" w:color="D1D9DC"/>
-              <w:bottom w:val="single" w:sz="4" w:space="0" w:color="D1D9DC"/>
-              <w:right w:val="single" w:sz="4" w:space="0" w:color="D1D9DC"/>
+            <w:shd w:val="clear" w:color="auto" w:fill="D6EFF2"/>
+            <w:tcBorders>
+              <w:top w:val="single" w:sz="4" w:space="0" w:color="C0D6DC"/>
+              <w:left w:val="single" w:sz="4" w:space="0" w:color="C0D6DC"/>
+              <w:bottom w:val="single" w:sz="4" w:space="0" w:color="C0D6DC"/>
+              <w:right w:val="single" w:sz="4" w:space="0" w:color="C0D6DC"/>
             </w:tcBorders>
             <w:tcMar>
               <w:top w:w="60" w:type="dxa"/>
@@ -1556,7 +1568,7 @@
               <w:rPr>
                 <w:rFonts w:ascii="Calibri" w:hAnsi="Calibri"/>
                 <w:b/>
-                <w:color w:val="FFFFFF"/>
+                <w:color w:val="024E70"/>
                 <w:sz w:val="19"/>
               </w:rPr>
               <w:t xml:space="preserve">Steps</w:t>
@@ -1565,12 +1577,12 @@
         </w:tc>
         <w:tc>
           <w:tcPr>
-            <w:shd w:val="clear" w:color="auto" w:fill="02374f"/>
-            <w:tcBorders>
-              <w:top w:val="single" w:sz="4" w:space="0" w:color="D1D9DC"/>
-              <w:left w:val="single" w:sz="4" w:space="0" w:color="D1D9DC"/>
-              <w:bottom w:val="single" w:sz="4" w:space="0" w:color="D1D9DC"/>
-              <w:right w:val="single" w:sz="4" w:space="0" w:color="D1D9DC"/>
+            <w:shd w:val="clear" w:color="auto" w:fill="D6EFF2"/>
+            <w:tcBorders>
+              <w:top w:val="single" w:sz="4" w:space="0" w:color="C0D6DC"/>
+              <w:left w:val="single" w:sz="4" w:space="0" w:color="C0D6DC"/>
+              <w:bottom w:val="single" w:sz="4" w:space="0" w:color="C0D6DC"/>
+              <w:right w:val="single" w:sz="4" w:space="0" w:color="C0D6DC"/>
             </w:tcBorders>
             <w:tcMar>
               <w:top w:w="60" w:type="dxa"/>
@@ -1588,7 +1600,7 @@
               <w:rPr>
                 <w:rFonts w:ascii="Calibri" w:hAnsi="Calibri"/>
                 <w:b/>
-                <w:color w:val="FFFFFF"/>
+                <w:color w:val="024E70"/>
                 <w:sz w:val="19"/>
               </w:rPr>
               <w:t xml:space="preserve">Primary CTA</w:t>
@@ -1601,10 +1613,10 @@
           <w:tcPr>
             <w:shd w:val="clear" w:color="auto" w:fill="FFFFFF"/>
             <w:tcBorders>
-              <w:top w:val="single" w:sz="4" w:space="0" w:color="D1D9DC"/>
-              <w:left w:val="single" w:sz="4" w:space="0" w:color="D1D9DC"/>
-              <w:bottom w:val="single" w:sz="4" w:space="0" w:color="D1D9DC"/>
-              <w:right w:val="single" w:sz="4" w:space="0" w:color="D1D9DC"/>
+              <w:top w:val="single" w:sz="4" w:space="0" w:color="C0D6DC"/>
+              <w:left w:val="single" w:sz="4" w:space="0" w:color="C0D6DC"/>
+              <w:bottom w:val="single" w:sz="4" w:space="0" w:color="C0D6DC"/>
+              <w:right w:val="single" w:sz="4" w:space="0" w:color="C0D6DC"/>
             </w:tcBorders>
             <w:tcMar>
               <w:top w:w="60" w:type="dxa"/>
@@ -1632,10 +1644,10 @@
           <w:tcPr>
             <w:shd w:val="clear" w:color="auto" w:fill="FFFFFF"/>
             <w:tcBorders>
-              <w:top w:val="single" w:sz="4" w:space="0" w:color="D1D9DC"/>
-              <w:left w:val="single" w:sz="4" w:space="0" w:color="D1D9DC"/>
-              <w:bottom w:val="single" w:sz="4" w:space="0" w:color="D1D9DC"/>
-              <w:right w:val="single" w:sz="4" w:space="0" w:color="D1D9DC"/>
+              <w:top w:val="single" w:sz="4" w:space="0" w:color="C0D6DC"/>
+              <w:left w:val="single" w:sz="4" w:space="0" w:color="C0D6DC"/>
+              <w:bottom w:val="single" w:sz="4" w:space="0" w:color="C0D6DC"/>
+              <w:right w:val="single" w:sz="4" w:space="0" w:color="C0D6DC"/>
             </w:tcBorders>
             <w:tcMar>
               <w:top w:w="60" w:type="dxa"/>
@@ -1664,10 +1676,10 @@
           <w:tcPr>
             <w:shd w:val="clear" w:color="auto" w:fill="FFFFFF"/>
             <w:tcBorders>
-              <w:top w:val="single" w:sz="4" w:space="0" w:color="D1D9DC"/>
-              <w:left w:val="single" w:sz="4" w:space="0" w:color="D1D9DC"/>
-              <w:bottom w:val="single" w:sz="4" w:space="0" w:color="D1D9DC"/>
-              <w:right w:val="single" w:sz="4" w:space="0" w:color="D1D9DC"/>
+              <w:top w:val="single" w:sz="4" w:space="0" w:color="C0D6DC"/>
+              <w:left w:val="single" w:sz="4" w:space="0" w:color="C0D6DC"/>
+              <w:bottom w:val="single" w:sz="4" w:space="0" w:color="C0D6DC"/>
+              <w:right w:val="single" w:sz="4" w:space="0" w:color="C0D6DC"/>
             </w:tcBorders>
             <w:tcMar>
               <w:top w:w="60" w:type="dxa"/>
@@ -1695,10 +1707,10 @@
           <w:tcPr>
             <w:shd w:val="clear" w:color="auto" w:fill="FFFFFF"/>
             <w:tcBorders>
-              <w:top w:val="single" w:sz="4" w:space="0" w:color="D1D9DC"/>
-              <w:left w:val="single" w:sz="4" w:space="0" w:color="D1D9DC"/>
-              <w:bottom w:val="single" w:sz="4" w:space="0" w:color="D1D9DC"/>
-              <w:right w:val="single" w:sz="4" w:space="0" w:color="D1D9DC"/>
+              <w:top w:val="single" w:sz="4" w:space="0" w:color="C0D6DC"/>
+              <w:left w:val="single" w:sz="4" w:space="0" w:color="C0D6DC"/>
+              <w:bottom w:val="single" w:sz="4" w:space="0" w:color="C0D6DC"/>
+              <w:right w:val="single" w:sz="4" w:space="0" w:color="C0D6DC"/>
             </w:tcBorders>
             <w:tcMar>
               <w:top w:w="60" w:type="dxa"/>
@@ -1726,12 +1738,12 @@
       <w:tr>
         <w:tc>
           <w:tcPr>
-            <w:shd w:val="clear" w:color="auto" w:fill="E8F1F2"/>
-            <w:tcBorders>
-              <w:top w:val="single" w:sz="4" w:space="0" w:color="D1D9DC"/>
-              <w:left w:val="single" w:sz="4" w:space="0" w:color="D1D9DC"/>
-              <w:bottom w:val="single" w:sz="4" w:space="0" w:color="D1D9DC"/>
-              <w:right w:val="single" w:sz="4" w:space="0" w:color="D1D9DC"/>
+            <w:shd w:val="clear" w:color="auto" w:fill="F7FAFB"/>
+            <w:tcBorders>
+              <w:top w:val="single" w:sz="4" w:space="0" w:color="C0D6DC"/>
+              <w:left w:val="single" w:sz="4" w:space="0" w:color="C0D6DC"/>
+              <w:bottom w:val="single" w:sz="4" w:space="0" w:color="C0D6DC"/>
+              <w:right w:val="single" w:sz="4" w:space="0" w:color="C0D6DC"/>
             </w:tcBorders>
             <w:tcMar>
               <w:top w:w="60" w:type="dxa"/>
@@ -1757,12 +1769,12 @@
         </w:tc>
         <w:tc>
           <w:tcPr>
-            <w:shd w:val="clear" w:color="auto" w:fill="E8F1F2"/>
-            <w:tcBorders>
-              <w:top w:val="single" w:sz="4" w:space="0" w:color="D1D9DC"/>
-              <w:left w:val="single" w:sz="4" w:space="0" w:color="D1D9DC"/>
-              <w:bottom w:val="single" w:sz="4" w:space="0" w:color="D1D9DC"/>
-              <w:right w:val="single" w:sz="4" w:space="0" w:color="D1D9DC"/>
+            <w:shd w:val="clear" w:color="auto" w:fill="F7FAFB"/>
+            <w:tcBorders>
+              <w:top w:val="single" w:sz="4" w:space="0" w:color="C0D6DC"/>
+              <w:left w:val="single" w:sz="4" w:space="0" w:color="C0D6DC"/>
+              <w:bottom w:val="single" w:sz="4" w:space="0" w:color="C0D6DC"/>
+              <w:right w:val="single" w:sz="4" w:space="0" w:color="C0D6DC"/>
             </w:tcBorders>
             <w:tcMar>
               <w:top w:w="60" w:type="dxa"/>
@@ -1789,12 +1801,12 @@
         </w:tc>
         <w:tc>
           <w:tcPr>
-            <w:shd w:val="clear" w:color="auto" w:fill="E8F1F2"/>
-            <w:tcBorders>
-              <w:top w:val="single" w:sz="4" w:space="0" w:color="D1D9DC"/>
-              <w:left w:val="single" w:sz="4" w:space="0" w:color="D1D9DC"/>
-              <w:bottom w:val="single" w:sz="4" w:space="0" w:color="D1D9DC"/>
-              <w:right w:val="single" w:sz="4" w:space="0" w:color="D1D9DC"/>
+            <w:shd w:val="clear" w:color="auto" w:fill="F7FAFB"/>
+            <w:tcBorders>
+              <w:top w:val="single" w:sz="4" w:space="0" w:color="C0D6DC"/>
+              <w:left w:val="single" w:sz="4" w:space="0" w:color="C0D6DC"/>
+              <w:bottom w:val="single" w:sz="4" w:space="0" w:color="C0D6DC"/>
+              <w:right w:val="single" w:sz="4" w:space="0" w:color="C0D6DC"/>
             </w:tcBorders>
             <w:tcMar>
               <w:top w:w="60" w:type="dxa"/>
@@ -1820,12 +1832,12 @@
         </w:tc>
         <w:tc>
           <w:tcPr>
-            <w:shd w:val="clear" w:color="auto" w:fill="E8F1F2"/>
-            <w:tcBorders>
-              <w:top w:val="single" w:sz="4" w:space="0" w:color="D1D9DC"/>
-              <w:left w:val="single" w:sz="4" w:space="0" w:color="D1D9DC"/>
-              <w:bottom w:val="single" w:sz="4" w:space="0" w:color="D1D9DC"/>
-              <w:right w:val="single" w:sz="4" w:space="0" w:color="D1D9DC"/>
+            <w:shd w:val="clear" w:color="auto" w:fill="F7FAFB"/>
+            <w:tcBorders>
+              <w:top w:val="single" w:sz="4" w:space="0" w:color="C0D6DC"/>
+              <w:left w:val="single" w:sz="4" w:space="0" w:color="C0D6DC"/>
+              <w:bottom w:val="single" w:sz="4" w:space="0" w:color="C0D6DC"/>
+              <w:right w:val="single" w:sz="4" w:space="0" w:color="C0D6DC"/>
             </w:tcBorders>
             <w:tcMar>
               <w:top w:w="60" w:type="dxa"/>
@@ -1855,10 +1867,10 @@
           <w:tcPr>
             <w:shd w:val="clear" w:color="auto" w:fill="FFFFFF"/>
             <w:tcBorders>
-              <w:top w:val="single" w:sz="4" w:space="0" w:color="D1D9DC"/>
-              <w:left w:val="single" w:sz="4" w:space="0" w:color="D1D9DC"/>
-              <w:bottom w:val="single" w:sz="4" w:space="0" w:color="D1D9DC"/>
-              <w:right w:val="single" w:sz="4" w:space="0" w:color="D1D9DC"/>
+              <w:top w:val="single" w:sz="4" w:space="0" w:color="C0D6DC"/>
+              <w:left w:val="single" w:sz="4" w:space="0" w:color="C0D6DC"/>
+              <w:bottom w:val="single" w:sz="4" w:space="0" w:color="C0D6DC"/>
+              <w:right w:val="single" w:sz="4" w:space="0" w:color="C0D6DC"/>
             </w:tcBorders>
             <w:tcMar>
               <w:top w:w="60" w:type="dxa"/>
@@ -1886,10 +1898,10 @@
           <w:tcPr>
             <w:shd w:val="clear" w:color="auto" w:fill="FFFFFF"/>
             <w:tcBorders>
-              <w:top w:val="single" w:sz="4" w:space="0" w:color="D1D9DC"/>
-              <w:left w:val="single" w:sz="4" w:space="0" w:color="D1D9DC"/>
-              <w:bottom w:val="single" w:sz="4" w:space="0" w:color="D1D9DC"/>
-              <w:right w:val="single" w:sz="4" w:space="0" w:color="D1D9DC"/>
+              <w:top w:val="single" w:sz="4" w:space="0" w:color="C0D6DC"/>
+              <w:left w:val="single" w:sz="4" w:space="0" w:color="C0D6DC"/>
+              <w:bottom w:val="single" w:sz="4" w:space="0" w:color="C0D6DC"/>
+              <w:right w:val="single" w:sz="4" w:space="0" w:color="C0D6DC"/>
             </w:tcBorders>
             <w:tcMar>
               <w:top w:w="60" w:type="dxa"/>
@@ -1918,10 +1930,10 @@
           <w:tcPr>
             <w:shd w:val="clear" w:color="auto" w:fill="FFFFFF"/>
             <w:tcBorders>
-              <w:top w:val="single" w:sz="4" w:space="0" w:color="D1D9DC"/>
-              <w:left w:val="single" w:sz="4" w:space="0" w:color="D1D9DC"/>
-              <w:bottom w:val="single" w:sz="4" w:space="0" w:color="D1D9DC"/>
-              <w:right w:val="single" w:sz="4" w:space="0" w:color="D1D9DC"/>
+              <w:top w:val="single" w:sz="4" w:space="0" w:color="C0D6DC"/>
+              <w:left w:val="single" w:sz="4" w:space="0" w:color="C0D6DC"/>
+              <w:bottom w:val="single" w:sz="4" w:space="0" w:color="C0D6DC"/>
+              <w:right w:val="single" w:sz="4" w:space="0" w:color="C0D6DC"/>
             </w:tcBorders>
             <w:tcMar>
               <w:top w:w="60" w:type="dxa"/>
@@ -1949,10 +1961,10 @@
           <w:tcPr>
             <w:shd w:val="clear" w:color="auto" w:fill="FFFFFF"/>
             <w:tcBorders>
-              <w:top w:val="single" w:sz="4" w:space="0" w:color="D1D9DC"/>
-              <w:left w:val="single" w:sz="4" w:space="0" w:color="D1D9DC"/>
-              <w:bottom w:val="single" w:sz="4" w:space="0" w:color="D1D9DC"/>
-              <w:right w:val="single" w:sz="4" w:space="0" w:color="D1D9DC"/>
+              <w:top w:val="single" w:sz="4" w:space="0" w:color="C0D6DC"/>
+              <w:left w:val="single" w:sz="4" w:space="0" w:color="C0D6DC"/>
+              <w:bottom w:val="single" w:sz="4" w:space="0" w:color="C0D6DC"/>
+              <w:right w:val="single" w:sz="4" w:space="0" w:color="C0D6DC"/>
             </w:tcBorders>
             <w:tcMar>
               <w:top w:w="60" w:type="dxa"/>
@@ -1980,12 +1992,12 @@
       <w:tr>
         <w:tc>
           <w:tcPr>
-            <w:shd w:val="clear" w:color="auto" w:fill="E8F1F2"/>
-            <w:tcBorders>
-              <w:top w:val="single" w:sz="4" w:space="0" w:color="D1D9DC"/>
-              <w:left w:val="single" w:sz="4" w:space="0" w:color="D1D9DC"/>
-              <w:bottom w:val="single" w:sz="4" w:space="0" w:color="D1D9DC"/>
-              <w:right w:val="single" w:sz="4" w:space="0" w:color="D1D9DC"/>
+            <w:shd w:val="clear" w:color="auto" w:fill="F7FAFB"/>
+            <w:tcBorders>
+              <w:top w:val="single" w:sz="4" w:space="0" w:color="C0D6DC"/>
+              <w:left w:val="single" w:sz="4" w:space="0" w:color="C0D6DC"/>
+              <w:bottom w:val="single" w:sz="4" w:space="0" w:color="C0D6DC"/>
+              <w:right w:val="single" w:sz="4" w:space="0" w:color="C0D6DC"/>
             </w:tcBorders>
             <w:tcMar>
               <w:top w:w="60" w:type="dxa"/>
@@ -2011,12 +2023,12 @@
         </w:tc>
         <w:tc>
           <w:tcPr>
-            <w:shd w:val="clear" w:color="auto" w:fill="E8F1F2"/>
-            <w:tcBorders>
-              <w:top w:val="single" w:sz="4" w:space="0" w:color="D1D9DC"/>
-              <w:left w:val="single" w:sz="4" w:space="0" w:color="D1D9DC"/>
-              <w:bottom w:val="single" w:sz="4" w:space="0" w:color="D1D9DC"/>
-              <w:right w:val="single" w:sz="4" w:space="0" w:color="D1D9DC"/>
+            <w:shd w:val="clear" w:color="auto" w:fill="F7FAFB"/>
+            <w:tcBorders>
+              <w:top w:val="single" w:sz="4" w:space="0" w:color="C0D6DC"/>
+              <w:left w:val="single" w:sz="4" w:space="0" w:color="C0D6DC"/>
+              <w:bottom w:val="single" w:sz="4" w:space="0" w:color="C0D6DC"/>
+              <w:right w:val="single" w:sz="4" w:space="0" w:color="C0D6DC"/>
             </w:tcBorders>
             <w:tcMar>
               <w:top w:w="60" w:type="dxa"/>
@@ -2043,12 +2055,12 @@
         </w:tc>
         <w:tc>
           <w:tcPr>
-            <w:shd w:val="clear" w:color="auto" w:fill="E8F1F2"/>
-            <w:tcBorders>
-              <w:top w:val="single" w:sz="4" w:space="0" w:color="D1D9DC"/>
-              <w:left w:val="single" w:sz="4" w:space="0" w:color="D1D9DC"/>
-              <w:bottom w:val="single" w:sz="4" w:space="0" w:color="D1D9DC"/>
-              <w:right w:val="single" w:sz="4" w:space="0" w:color="D1D9DC"/>
+            <w:shd w:val="clear" w:color="auto" w:fill="F7FAFB"/>
+            <w:tcBorders>
+              <w:top w:val="single" w:sz="4" w:space="0" w:color="C0D6DC"/>
+              <w:left w:val="single" w:sz="4" w:space="0" w:color="C0D6DC"/>
+              <w:bottom w:val="single" w:sz="4" w:space="0" w:color="C0D6DC"/>
+              <w:right w:val="single" w:sz="4" w:space="0" w:color="C0D6DC"/>
             </w:tcBorders>
             <w:tcMar>
               <w:top w:w="60" w:type="dxa"/>
@@ -2074,12 +2086,12 @@
         </w:tc>
         <w:tc>
           <w:tcPr>
-            <w:shd w:val="clear" w:color="auto" w:fill="E8F1F2"/>
-            <w:tcBorders>
-              <w:top w:val="single" w:sz="4" w:space="0" w:color="D1D9DC"/>
-              <w:left w:val="single" w:sz="4" w:space="0" w:color="D1D9DC"/>
-              <w:bottom w:val="single" w:sz="4" w:space="0" w:color="D1D9DC"/>
-              <w:right w:val="single" w:sz="4" w:space="0" w:color="D1D9DC"/>
+            <w:shd w:val="clear" w:color="auto" w:fill="F7FAFB"/>
+            <w:tcBorders>
+              <w:top w:val="single" w:sz="4" w:space="0" w:color="C0D6DC"/>
+              <w:left w:val="single" w:sz="4" w:space="0" w:color="C0D6DC"/>
+              <w:bottom w:val="single" w:sz="4" w:space="0" w:color="C0D6DC"/>
+              <w:right w:val="single" w:sz="4" w:space="0" w:color="C0D6DC"/>
             </w:tcBorders>
             <w:tcMar>
               <w:top w:w="60" w:type="dxa"/>
@@ -2109,10 +2121,10 @@
           <w:tcPr>
             <w:shd w:val="clear" w:color="auto" w:fill="FFFFFF"/>
             <w:tcBorders>
-              <w:top w:val="single" w:sz="4" w:space="0" w:color="D1D9DC"/>
-              <w:left w:val="single" w:sz="4" w:space="0" w:color="D1D9DC"/>
-              <w:bottom w:val="single" w:sz="4" w:space="0" w:color="D1D9DC"/>
-              <w:right w:val="single" w:sz="4" w:space="0" w:color="D1D9DC"/>
+              <w:top w:val="single" w:sz="4" w:space="0" w:color="C0D6DC"/>
+              <w:left w:val="single" w:sz="4" w:space="0" w:color="C0D6DC"/>
+              <w:bottom w:val="single" w:sz="4" w:space="0" w:color="C0D6DC"/>
+              <w:right w:val="single" w:sz="4" w:space="0" w:color="C0D6DC"/>
             </w:tcBorders>
             <w:tcMar>
               <w:top w:w="60" w:type="dxa"/>
@@ -2140,10 +2152,10 @@
           <w:tcPr>
             <w:shd w:val="clear" w:color="auto" w:fill="FFFFFF"/>
             <w:tcBorders>
-              <w:top w:val="single" w:sz="4" w:space="0" w:color="D1D9DC"/>
-              <w:left w:val="single" w:sz="4" w:space="0" w:color="D1D9DC"/>
-              <w:bottom w:val="single" w:sz="4" w:space="0" w:color="D1D9DC"/>
-              <w:right w:val="single" w:sz="4" w:space="0" w:color="D1D9DC"/>
+              <w:top w:val="single" w:sz="4" w:space="0" w:color="C0D6DC"/>
+              <w:left w:val="single" w:sz="4" w:space="0" w:color="C0D6DC"/>
+              <w:bottom w:val="single" w:sz="4" w:space="0" w:color="C0D6DC"/>
+              <w:right w:val="single" w:sz="4" w:space="0" w:color="C0D6DC"/>
             </w:tcBorders>
             <w:tcMar>
               <w:top w:w="60" w:type="dxa"/>
@@ -2172,10 +2184,10 @@
           <w:tcPr>
             <w:shd w:val="clear" w:color="auto" w:fill="FFFFFF"/>
             <w:tcBorders>
-              <w:top w:val="single" w:sz="4" w:space="0" w:color="D1D9DC"/>
-              <w:left w:val="single" w:sz="4" w:space="0" w:color="D1D9DC"/>
-              <w:bottom w:val="single" w:sz="4" w:space="0" w:color="D1D9DC"/>
-              <w:right w:val="single" w:sz="4" w:space="0" w:color="D1D9DC"/>
+              <w:top w:val="single" w:sz="4" w:space="0" w:color="C0D6DC"/>
+              <w:left w:val="single" w:sz="4" w:space="0" w:color="C0D6DC"/>
+              <w:bottom w:val="single" w:sz="4" w:space="0" w:color="C0D6DC"/>
+              <w:right w:val="single" w:sz="4" w:space="0" w:color="C0D6DC"/>
             </w:tcBorders>
             <w:tcMar>
               <w:top w:w="60" w:type="dxa"/>
@@ -2203,10 +2215,10 @@
           <w:tcPr>
             <w:shd w:val="clear" w:color="auto" w:fill="FFFFFF"/>
             <w:tcBorders>
-              <w:top w:val="single" w:sz="4" w:space="0" w:color="D1D9DC"/>
-              <w:left w:val="single" w:sz="4" w:space="0" w:color="D1D9DC"/>
-              <w:bottom w:val="single" w:sz="4" w:space="0" w:color="D1D9DC"/>
-              <w:right w:val="single" w:sz="4" w:space="0" w:color="D1D9DC"/>
+              <w:top w:val="single" w:sz="4" w:space="0" w:color="C0D6DC"/>
+              <w:left w:val="single" w:sz="4" w:space="0" w:color="C0D6DC"/>
+              <w:bottom w:val="single" w:sz="4" w:space="0" w:color="C0D6DC"/>
+              <w:right w:val="single" w:sz="4" w:space="0" w:color="C0D6DC"/>
             </w:tcBorders>
             <w:tcMar>
               <w:top w:w="60" w:type="dxa"/>
@@ -2234,12 +2246,12 @@
       <w:tr>
         <w:tc>
           <w:tcPr>
-            <w:shd w:val="clear" w:color="auto" w:fill="E8F1F2"/>
-            <w:tcBorders>
-              <w:top w:val="single" w:sz="4" w:space="0" w:color="D1D9DC"/>
-              <w:left w:val="single" w:sz="4" w:space="0" w:color="D1D9DC"/>
-              <w:bottom w:val="single" w:sz="4" w:space="0" w:color="D1D9DC"/>
-              <w:right w:val="single" w:sz="4" w:space="0" w:color="D1D9DC"/>
+            <w:shd w:val="clear" w:color="auto" w:fill="F7FAFB"/>
+            <w:tcBorders>
+              <w:top w:val="single" w:sz="4" w:space="0" w:color="C0D6DC"/>
+              <w:left w:val="single" w:sz="4" w:space="0" w:color="C0D6DC"/>
+              <w:bottom w:val="single" w:sz="4" w:space="0" w:color="C0D6DC"/>
+              <w:right w:val="single" w:sz="4" w:space="0" w:color="C0D6DC"/>
             </w:tcBorders>
             <w:tcMar>
               <w:top w:w="60" w:type="dxa"/>
@@ -2265,12 +2277,12 @@
         </w:tc>
         <w:tc>
           <w:tcPr>
-            <w:shd w:val="clear" w:color="auto" w:fill="E8F1F2"/>
-            <w:tcBorders>
-              <w:top w:val="single" w:sz="4" w:space="0" w:color="D1D9DC"/>
-              <w:left w:val="single" w:sz="4" w:space="0" w:color="D1D9DC"/>
-              <w:bottom w:val="single" w:sz="4" w:space="0" w:color="D1D9DC"/>
-              <w:right w:val="single" w:sz="4" w:space="0" w:color="D1D9DC"/>
+            <w:shd w:val="clear" w:color="auto" w:fill="F7FAFB"/>
+            <w:tcBorders>
+              <w:top w:val="single" w:sz="4" w:space="0" w:color="C0D6DC"/>
+              <w:left w:val="single" w:sz="4" w:space="0" w:color="C0D6DC"/>
+              <w:bottom w:val="single" w:sz="4" w:space="0" w:color="C0D6DC"/>
+              <w:right w:val="single" w:sz="4" w:space="0" w:color="C0D6DC"/>
             </w:tcBorders>
             <w:tcMar>
               <w:top w:w="60" w:type="dxa"/>
@@ -2297,12 +2309,12 @@
         </w:tc>
         <w:tc>
           <w:tcPr>
-            <w:shd w:val="clear" w:color="auto" w:fill="E8F1F2"/>
-            <w:tcBorders>
-              <w:top w:val="single" w:sz="4" w:space="0" w:color="D1D9DC"/>
-              <w:left w:val="single" w:sz="4" w:space="0" w:color="D1D9DC"/>
-              <w:bottom w:val="single" w:sz="4" w:space="0" w:color="D1D9DC"/>
-              <w:right w:val="single" w:sz="4" w:space="0" w:color="D1D9DC"/>
+            <w:shd w:val="clear" w:color="auto" w:fill="F7FAFB"/>
+            <w:tcBorders>
+              <w:top w:val="single" w:sz="4" w:space="0" w:color="C0D6DC"/>
+              <w:left w:val="single" w:sz="4" w:space="0" w:color="C0D6DC"/>
+              <w:bottom w:val="single" w:sz="4" w:space="0" w:color="C0D6DC"/>
+              <w:right w:val="single" w:sz="4" w:space="0" w:color="C0D6DC"/>
             </w:tcBorders>
             <w:tcMar>
               <w:top w:w="60" w:type="dxa"/>
@@ -2328,12 +2340,12 @@
         </w:tc>
         <w:tc>
           <w:tcPr>
-            <w:shd w:val="clear" w:color="auto" w:fill="E8F1F2"/>
-            <w:tcBorders>
-              <w:top w:val="single" w:sz="4" w:space="0" w:color="D1D9DC"/>
-              <w:left w:val="single" w:sz="4" w:space="0" w:color="D1D9DC"/>
-              <w:bottom w:val="single" w:sz="4" w:space="0" w:color="D1D9DC"/>
-              <w:right w:val="single" w:sz="4" w:space="0" w:color="D1D9DC"/>
+            <w:shd w:val="clear" w:color="auto" w:fill="F7FAFB"/>
+            <w:tcBorders>
+              <w:top w:val="single" w:sz="4" w:space="0" w:color="C0D6DC"/>
+              <w:left w:val="single" w:sz="4" w:space="0" w:color="C0D6DC"/>
+              <w:bottom w:val="single" w:sz="4" w:space="0" w:color="C0D6DC"/>
+              <w:right w:val="single" w:sz="4" w:space="0" w:color="C0D6DC"/>
             </w:tcBorders>
             <w:tcMar>
               <w:top w:w="60" w:type="dxa"/>
@@ -2363,10 +2375,10 @@
           <w:tcPr>
             <w:shd w:val="clear" w:color="auto" w:fill="FFFFFF"/>
             <w:tcBorders>
-              <w:top w:val="single" w:sz="4" w:space="0" w:color="D1D9DC"/>
-              <w:left w:val="single" w:sz="4" w:space="0" w:color="D1D9DC"/>
-              <w:bottom w:val="single" w:sz="4" w:space="0" w:color="D1D9DC"/>
-              <w:right w:val="single" w:sz="4" w:space="0" w:color="D1D9DC"/>
+              <w:top w:val="single" w:sz="4" w:space="0" w:color="C0D6DC"/>
+              <w:left w:val="single" w:sz="4" w:space="0" w:color="C0D6DC"/>
+              <w:bottom w:val="single" w:sz="4" w:space="0" w:color="C0D6DC"/>
+              <w:right w:val="single" w:sz="4" w:space="0" w:color="C0D6DC"/>
             </w:tcBorders>
             <w:tcMar>
               <w:top w:w="60" w:type="dxa"/>
@@ -2394,10 +2406,10 @@
           <w:tcPr>
             <w:shd w:val="clear" w:color="auto" w:fill="FFFFFF"/>
             <w:tcBorders>
-              <w:top w:val="single" w:sz="4" w:space="0" w:color="D1D9DC"/>
-              <w:left w:val="single" w:sz="4" w:space="0" w:color="D1D9DC"/>
-              <w:bottom w:val="single" w:sz="4" w:space="0" w:color="D1D9DC"/>
-              <w:right w:val="single" w:sz="4" w:space="0" w:color="D1D9DC"/>
+              <w:top w:val="single" w:sz="4" w:space="0" w:color="C0D6DC"/>
+              <w:left w:val="single" w:sz="4" w:space="0" w:color="C0D6DC"/>
+              <w:bottom w:val="single" w:sz="4" w:space="0" w:color="C0D6DC"/>
+              <w:right w:val="single" w:sz="4" w:space="0" w:color="C0D6DC"/>
             </w:tcBorders>
             <w:tcMar>
               <w:top w:w="60" w:type="dxa"/>
@@ -2459,10 +2471,10 @@
           <w:tcPr>
             <w:shd w:val="clear" w:color="auto" w:fill="FFFFFF"/>
             <w:tcBorders>
-              <w:top w:val="single" w:sz="4" w:space="0" w:color="D1D9DC"/>
-              <w:left w:val="single" w:sz="4" w:space="0" w:color="D1D9DC"/>
-              <w:bottom w:val="single" w:sz="4" w:space="0" w:color="D1D9DC"/>
-              <w:right w:val="single" w:sz="4" w:space="0" w:color="D1D9DC"/>
+              <w:top w:val="single" w:sz="4" w:space="0" w:color="C0D6DC"/>
+              <w:left w:val="single" w:sz="4" w:space="0" w:color="C0D6DC"/>
+              <w:bottom w:val="single" w:sz="4" w:space="0" w:color="C0D6DC"/>
+              <w:right w:val="single" w:sz="4" w:space="0" w:color="C0D6DC"/>
             </w:tcBorders>
             <w:tcMar>
               <w:top w:w="60" w:type="dxa"/>
@@ -2490,10 +2502,10 @@
           <w:tcPr>
             <w:shd w:val="clear" w:color="auto" w:fill="FFFFFF"/>
             <w:tcBorders>
-              <w:top w:val="single" w:sz="4" w:space="0" w:color="D1D9DC"/>
-              <w:left w:val="single" w:sz="4" w:space="0" w:color="D1D9DC"/>
-              <w:bottom w:val="single" w:sz="4" w:space="0" w:color="D1D9DC"/>
-              <w:right w:val="single" w:sz="4" w:space="0" w:color="D1D9DC"/>
+              <w:top w:val="single" w:sz="4" w:space="0" w:color="C0D6DC"/>
+              <w:left w:val="single" w:sz="4" w:space="0" w:color="C0D6DC"/>
+              <w:bottom w:val="single" w:sz="4" w:space="0" w:color="C0D6DC"/>
+              <w:right w:val="single" w:sz="4" w:space="0" w:color="C0D6DC"/>
             </w:tcBorders>
             <w:tcMar>
               <w:top w:w="60" w:type="dxa"/>
@@ -2595,12 +2607,12 @@
         </w:trPr>
         <w:tc>
           <w:tcPr>
-            <w:shd w:val="clear" w:color="auto" w:fill="02374f"/>
-            <w:tcBorders>
-              <w:top w:val="single" w:sz="4" w:space="0" w:color="D1D9DC"/>
-              <w:left w:val="single" w:sz="4" w:space="0" w:color="D1D9DC"/>
-              <w:bottom w:val="single" w:sz="4" w:space="0" w:color="D1D9DC"/>
-              <w:right w:val="single" w:sz="4" w:space="0" w:color="D1D9DC"/>
+            <w:shd w:val="clear" w:color="auto" w:fill="D6EFF2"/>
+            <w:tcBorders>
+              <w:top w:val="single" w:sz="4" w:space="0" w:color="C0D6DC"/>
+              <w:left w:val="single" w:sz="4" w:space="0" w:color="C0D6DC"/>
+              <w:bottom w:val="single" w:sz="4" w:space="0" w:color="C0D6DC"/>
+              <w:right w:val="single" w:sz="4" w:space="0" w:color="C0D6DC"/>
             </w:tcBorders>
             <w:tcMar>
               <w:top w:w="60" w:type="dxa"/>
@@ -2618,7 +2630,7 @@
               <w:rPr>
                 <w:rFonts w:ascii="Calibri" w:hAnsi="Calibri"/>
                 <w:b/>
-                <w:color w:val="FFFFFF"/>
+                <w:color w:val="024E70"/>
                 <w:sz w:val="19"/>
               </w:rPr>
               <w:t xml:space="preserve">Pillar</w:t>
@@ -2627,12 +2639,12 @@
         </w:tc>
         <w:tc>
           <w:tcPr>
-            <w:shd w:val="clear" w:color="auto" w:fill="02374f"/>
-            <w:tcBorders>
-              <w:top w:val="single" w:sz="4" w:space="0" w:color="D1D9DC"/>
-              <w:left w:val="single" w:sz="4" w:space="0" w:color="D1D9DC"/>
-              <w:bottom w:val="single" w:sz="4" w:space="0" w:color="D1D9DC"/>
-              <w:right w:val="single" w:sz="4" w:space="0" w:color="D1D9DC"/>
+            <w:shd w:val="clear" w:color="auto" w:fill="D6EFF2"/>
+            <w:tcBorders>
+              <w:top w:val="single" w:sz="4" w:space="0" w:color="C0D6DC"/>
+              <w:left w:val="single" w:sz="4" w:space="0" w:color="C0D6DC"/>
+              <w:bottom w:val="single" w:sz="4" w:space="0" w:color="C0D6DC"/>
+              <w:right w:val="single" w:sz="4" w:space="0" w:color="C0D6DC"/>
             </w:tcBorders>
             <w:tcMar>
               <w:top w:w="60" w:type="dxa"/>
@@ -2650,7 +2662,7 @@
               <w:rPr>
                 <w:rFonts w:ascii="Calibri" w:hAnsi="Calibri"/>
                 <w:b/>
-                <w:color w:val="FFFFFF"/>
+                <w:color w:val="024E70"/>
                 <w:sz w:val="19"/>
               </w:rPr>
               <w:t xml:space="preserve">Official definition</w:t>
@@ -2663,10 +2675,10 @@
           <w:tcPr>
             <w:shd w:val="clear" w:color="auto" w:fill="FFFFFF"/>
             <w:tcBorders>
-              <w:top w:val="single" w:sz="4" w:space="0" w:color="D1D9DC"/>
-              <w:left w:val="single" w:sz="4" w:space="0" w:color="D1D9DC"/>
-              <w:bottom w:val="single" w:sz="4" w:space="0" w:color="D1D9DC"/>
-              <w:right w:val="single" w:sz="4" w:space="0" w:color="D1D9DC"/>
+              <w:top w:val="single" w:sz="4" w:space="0" w:color="C0D6DC"/>
+              <w:left w:val="single" w:sz="4" w:space="0" w:color="C0D6DC"/>
+              <w:bottom w:val="single" w:sz="4" w:space="0" w:color="C0D6DC"/>
+              <w:right w:val="single" w:sz="4" w:space="0" w:color="C0D6DC"/>
             </w:tcBorders>
             <w:tcMar>
               <w:top w:w="60" w:type="dxa"/>
@@ -2696,10 +2708,10 @@
           <w:tcPr>
             <w:shd w:val="clear" w:color="auto" w:fill="FFFFFF"/>
             <w:tcBorders>
-              <w:top w:val="single" w:sz="4" w:space="0" w:color="D1D9DC"/>
-              <w:left w:val="single" w:sz="4" w:space="0" w:color="D1D9DC"/>
-              <w:bottom w:val="single" w:sz="4" w:space="0" w:color="D1D9DC"/>
-              <w:right w:val="single" w:sz="4" w:space="0" w:color="D1D9DC"/>
+              <w:top w:val="single" w:sz="4" w:space="0" w:color="C0D6DC"/>
+              <w:left w:val="single" w:sz="4" w:space="0" w:color="C0D6DC"/>
+              <w:bottom w:val="single" w:sz="4" w:space="0" w:color="C0D6DC"/>
+              <w:right w:val="single" w:sz="4" w:space="0" w:color="C0D6DC"/>
             </w:tcBorders>
             <w:tcMar>
               <w:top w:w="60" w:type="dxa"/>
@@ -2727,12 +2739,12 @@
       <w:tr>
         <w:tc>
           <w:tcPr>
-            <w:shd w:val="clear" w:color="auto" w:fill="E8F1F2"/>
-            <w:tcBorders>
-              <w:top w:val="single" w:sz="4" w:space="0" w:color="D1D9DC"/>
-              <w:left w:val="single" w:sz="4" w:space="0" w:color="D1D9DC"/>
-              <w:bottom w:val="single" w:sz="4" w:space="0" w:color="D1D9DC"/>
-              <w:right w:val="single" w:sz="4" w:space="0" w:color="D1D9DC"/>
+            <w:shd w:val="clear" w:color="auto" w:fill="F7FAFB"/>
+            <w:tcBorders>
+              <w:top w:val="single" w:sz="4" w:space="0" w:color="C0D6DC"/>
+              <w:left w:val="single" w:sz="4" w:space="0" w:color="C0D6DC"/>
+              <w:bottom w:val="single" w:sz="4" w:space="0" w:color="C0D6DC"/>
+              <w:right w:val="single" w:sz="4" w:space="0" w:color="C0D6DC"/>
             </w:tcBorders>
             <w:tcMar>
               <w:top w:w="60" w:type="dxa"/>
@@ -2760,12 +2772,12 @@
         </w:tc>
         <w:tc>
           <w:tcPr>
-            <w:shd w:val="clear" w:color="auto" w:fill="E8F1F2"/>
-            <w:tcBorders>
-              <w:top w:val="single" w:sz="4" w:space="0" w:color="D1D9DC"/>
-              <w:left w:val="single" w:sz="4" w:space="0" w:color="D1D9DC"/>
-              <w:bottom w:val="single" w:sz="4" w:space="0" w:color="D1D9DC"/>
-              <w:right w:val="single" w:sz="4" w:space="0" w:color="D1D9DC"/>
+            <w:shd w:val="clear" w:color="auto" w:fill="F7FAFB"/>
+            <w:tcBorders>
+              <w:top w:val="single" w:sz="4" w:space="0" w:color="C0D6DC"/>
+              <w:left w:val="single" w:sz="4" w:space="0" w:color="C0D6DC"/>
+              <w:bottom w:val="single" w:sz="4" w:space="0" w:color="C0D6DC"/>
+              <w:right w:val="single" w:sz="4" w:space="0" w:color="C0D6DC"/>
             </w:tcBorders>
             <w:tcMar>
               <w:top w:w="60" w:type="dxa"/>
@@ -2795,10 +2807,10 @@
           <w:tcPr>
             <w:shd w:val="clear" w:color="auto" w:fill="FFFFFF"/>
             <w:tcBorders>
-              <w:top w:val="single" w:sz="4" w:space="0" w:color="D1D9DC"/>
-              <w:left w:val="single" w:sz="4" w:space="0" w:color="D1D9DC"/>
-              <w:bottom w:val="single" w:sz="4" w:space="0" w:color="D1D9DC"/>
-              <w:right w:val="single" w:sz="4" w:space="0" w:color="D1D9DC"/>
+              <w:top w:val="single" w:sz="4" w:space="0" w:color="C0D6DC"/>
+              <w:left w:val="single" w:sz="4" w:space="0" w:color="C0D6DC"/>
+              <w:bottom w:val="single" w:sz="4" w:space="0" w:color="C0D6DC"/>
+              <w:right w:val="single" w:sz="4" w:space="0" w:color="C0D6DC"/>
             </w:tcBorders>
             <w:tcMar>
               <w:top w:w="60" w:type="dxa"/>
@@ -2828,10 +2840,10 @@
           <w:tcPr>
             <w:shd w:val="clear" w:color="auto" w:fill="FFFFFF"/>
             <w:tcBorders>
-              <w:top w:val="single" w:sz="4" w:space="0" w:color="D1D9DC"/>
-              <w:left w:val="single" w:sz="4" w:space="0" w:color="D1D9DC"/>
-              <w:bottom w:val="single" w:sz="4" w:space="0" w:color="D1D9DC"/>
-              <w:right w:val="single" w:sz="4" w:space="0" w:color="D1D9DC"/>
+              <w:top w:val="single" w:sz="4" w:space="0" w:color="C0D6DC"/>
+              <w:left w:val="single" w:sz="4" w:space="0" w:color="C0D6DC"/>
+              <w:bottom w:val="single" w:sz="4" w:space="0" w:color="C0D6DC"/>
+              <w:right w:val="single" w:sz="4" w:space="0" w:color="C0D6DC"/>
             </w:tcBorders>
             <w:tcMar>
               <w:top w:w="60" w:type="dxa"/>
@@ -2859,12 +2871,12 @@
       <w:tr>
         <w:tc>
           <w:tcPr>
-            <w:shd w:val="clear" w:color="auto" w:fill="E8F1F2"/>
-            <w:tcBorders>
-              <w:top w:val="single" w:sz="4" w:space="0" w:color="D1D9DC"/>
-              <w:left w:val="single" w:sz="4" w:space="0" w:color="D1D9DC"/>
-              <w:bottom w:val="single" w:sz="4" w:space="0" w:color="D1D9DC"/>
-              <w:right w:val="single" w:sz="4" w:space="0" w:color="D1D9DC"/>
+            <w:shd w:val="clear" w:color="auto" w:fill="F7FAFB"/>
+            <w:tcBorders>
+              <w:top w:val="single" w:sz="4" w:space="0" w:color="C0D6DC"/>
+              <w:left w:val="single" w:sz="4" w:space="0" w:color="C0D6DC"/>
+              <w:bottom w:val="single" w:sz="4" w:space="0" w:color="C0D6DC"/>
+              <w:right w:val="single" w:sz="4" w:space="0" w:color="C0D6DC"/>
             </w:tcBorders>
             <w:tcMar>
               <w:top w:w="60" w:type="dxa"/>
@@ -2892,12 +2904,12 @@
         </w:tc>
         <w:tc>
           <w:tcPr>
-            <w:shd w:val="clear" w:color="auto" w:fill="E8F1F2"/>
-            <w:tcBorders>
-              <w:top w:val="single" w:sz="4" w:space="0" w:color="D1D9DC"/>
-              <w:left w:val="single" w:sz="4" w:space="0" w:color="D1D9DC"/>
-              <w:bottom w:val="single" w:sz="4" w:space="0" w:color="D1D9DC"/>
-              <w:right w:val="single" w:sz="4" w:space="0" w:color="D1D9DC"/>
+            <w:shd w:val="clear" w:color="auto" w:fill="F7FAFB"/>
+            <w:tcBorders>
+              <w:top w:val="single" w:sz="4" w:space="0" w:color="C0D6DC"/>
+              <w:left w:val="single" w:sz="4" w:space="0" w:color="C0D6DC"/>
+              <w:bottom w:val="single" w:sz="4" w:space="0" w:color="C0D6DC"/>
+              <w:right w:val="single" w:sz="4" w:space="0" w:color="C0D6DC"/>
             </w:tcBorders>
             <w:tcMar>
               <w:top w:w="60" w:type="dxa"/>
@@ -3083,12 +3095,12 @@
         </w:trPr>
         <w:tc>
           <w:tcPr>
-            <w:shd w:val="clear" w:color="auto" w:fill="02374f"/>
-            <w:tcBorders>
-              <w:top w:val="single" w:sz="4" w:space="0" w:color="D1D9DC"/>
-              <w:left w:val="single" w:sz="4" w:space="0" w:color="D1D9DC"/>
-              <w:bottom w:val="single" w:sz="4" w:space="0" w:color="D1D9DC"/>
-              <w:right w:val="single" w:sz="4" w:space="0" w:color="D1D9DC"/>
+            <w:shd w:val="clear" w:color="auto" w:fill="D6EFF2"/>
+            <w:tcBorders>
+              <w:top w:val="single" w:sz="4" w:space="0" w:color="C0D6DC"/>
+              <w:left w:val="single" w:sz="4" w:space="0" w:color="C0D6DC"/>
+              <w:bottom w:val="single" w:sz="4" w:space="0" w:color="C0D6DC"/>
+              <w:right w:val="single" w:sz="4" w:space="0" w:color="C0D6DC"/>
             </w:tcBorders>
             <w:tcMar>
               <w:top w:w="60" w:type="dxa"/>
@@ -3106,7 +3118,7 @@
               <w:rPr>
                 <w:rFonts w:ascii="Calibri" w:hAnsi="Calibri"/>
                 <w:b/>
-                <w:color w:val="FFFFFF"/>
+                <w:color w:val="024E70"/>
                 <w:sz w:val="19"/>
               </w:rPr>
               <w:t xml:space="preserve">Layer</w:t>
@@ -3115,12 +3127,12 @@
         </w:tc>
         <w:tc>
           <w:tcPr>
-            <w:shd w:val="clear" w:color="auto" w:fill="02374f"/>
-            <w:tcBorders>
-              <w:top w:val="single" w:sz="4" w:space="0" w:color="D1D9DC"/>
-              <w:left w:val="single" w:sz="4" w:space="0" w:color="D1D9DC"/>
-              <w:bottom w:val="single" w:sz="4" w:space="0" w:color="D1D9DC"/>
-              <w:right w:val="single" w:sz="4" w:space="0" w:color="D1D9DC"/>
+            <w:shd w:val="clear" w:color="auto" w:fill="D6EFF2"/>
+            <w:tcBorders>
+              <w:top w:val="single" w:sz="4" w:space="0" w:color="C0D6DC"/>
+              <w:left w:val="single" w:sz="4" w:space="0" w:color="C0D6DC"/>
+              <w:bottom w:val="single" w:sz="4" w:space="0" w:color="C0D6DC"/>
+              <w:right w:val="single" w:sz="4" w:space="0" w:color="C0D6DC"/>
             </w:tcBorders>
             <w:tcMar>
               <w:top w:w="60" w:type="dxa"/>
@@ -3138,7 +3150,7 @@
               <w:rPr>
                 <w:rFonts w:ascii="Calibri" w:hAnsi="Calibri"/>
                 <w:b/>
-                <w:color w:val="FFFFFF"/>
+                <w:color w:val="024E70"/>
                 <w:sz w:val="19"/>
               </w:rPr>
               <w:t xml:space="preserve">Tool</w:t>
@@ -3147,12 +3159,12 @@
         </w:tc>
         <w:tc>
           <w:tcPr>
-            <w:shd w:val="clear" w:color="auto" w:fill="02374f"/>
-            <w:tcBorders>
-              <w:top w:val="single" w:sz="4" w:space="0" w:color="D1D9DC"/>
-              <w:left w:val="single" w:sz="4" w:space="0" w:color="D1D9DC"/>
-              <w:bottom w:val="single" w:sz="4" w:space="0" w:color="D1D9DC"/>
-              <w:right w:val="single" w:sz="4" w:space="0" w:color="D1D9DC"/>
+            <w:shd w:val="clear" w:color="auto" w:fill="D6EFF2"/>
+            <w:tcBorders>
+              <w:top w:val="single" w:sz="4" w:space="0" w:color="C0D6DC"/>
+              <w:left w:val="single" w:sz="4" w:space="0" w:color="C0D6DC"/>
+              <w:bottom w:val="single" w:sz="4" w:space="0" w:color="C0D6DC"/>
+              <w:right w:val="single" w:sz="4" w:space="0" w:color="C0D6DC"/>
             </w:tcBorders>
             <w:tcMar>
               <w:top w:w="60" w:type="dxa"/>
@@ -3170,7 +3182,7 @@
               <w:rPr>
                 <w:rFonts w:ascii="Calibri" w:hAnsi="Calibri"/>
                 <w:b/>
-                <w:color w:val="FFFFFF"/>
+                <w:color w:val="024E70"/>
                 <w:sz w:val="19"/>
               </w:rPr>
               <w:t xml:space="preserve">Status</w:t>
@@ -3183,10 +3195,10 @@
           <w:tcPr>
             <w:shd w:val="clear" w:color="auto" w:fill="FFFFFF"/>
             <w:tcBorders>
-              <w:top w:val="single" w:sz="4" w:space="0" w:color="D1D9DC"/>
-              <w:left w:val="single" w:sz="4" w:space="0" w:color="D1D9DC"/>
-              <w:bottom w:val="single" w:sz="4" w:space="0" w:color="D1D9DC"/>
-              <w:right w:val="single" w:sz="4" w:space="0" w:color="D1D9DC"/>
+              <w:top w:val="single" w:sz="4" w:space="0" w:color="C0D6DC"/>
+              <w:left w:val="single" w:sz="4" w:space="0" w:color="C0D6DC"/>
+              <w:bottom w:val="single" w:sz="4" w:space="0" w:color="C0D6DC"/>
+              <w:right w:val="single" w:sz="4" w:space="0" w:color="C0D6DC"/>
             </w:tcBorders>
             <w:tcMar>
               <w:top w:w="60" w:type="dxa"/>
@@ -3214,10 +3226,10 @@
           <w:tcPr>
             <w:shd w:val="clear" w:color="auto" w:fill="FFFFFF"/>
             <w:tcBorders>
-              <w:top w:val="single" w:sz="4" w:space="0" w:color="D1D9DC"/>
-              <w:left w:val="single" w:sz="4" w:space="0" w:color="D1D9DC"/>
-              <w:bottom w:val="single" w:sz="4" w:space="0" w:color="D1D9DC"/>
-              <w:right w:val="single" w:sz="4" w:space="0" w:color="D1D9DC"/>
+              <w:top w:val="single" w:sz="4" w:space="0" w:color="C0D6DC"/>
+              <w:left w:val="single" w:sz="4" w:space="0" w:color="C0D6DC"/>
+              <w:bottom w:val="single" w:sz="4" w:space="0" w:color="C0D6DC"/>
+              <w:right w:val="single" w:sz="4" w:space="0" w:color="C0D6DC"/>
             </w:tcBorders>
             <w:tcMar>
               <w:top w:w="60" w:type="dxa"/>
@@ -3245,10 +3257,10 @@
           <w:tcPr>
             <w:shd w:val="clear" w:color="auto" w:fill="FFFFFF"/>
             <w:tcBorders>
-              <w:top w:val="single" w:sz="4" w:space="0" w:color="D1D9DC"/>
-              <w:left w:val="single" w:sz="4" w:space="0" w:color="D1D9DC"/>
-              <w:bottom w:val="single" w:sz="4" w:space="0" w:color="D1D9DC"/>
-              <w:right w:val="single" w:sz="4" w:space="0" w:color="D1D9DC"/>
+              <w:top w:val="single" w:sz="4" w:space="0" w:color="C0D6DC"/>
+              <w:left w:val="single" w:sz="4" w:space="0" w:color="C0D6DC"/>
+              <w:bottom w:val="single" w:sz="4" w:space="0" w:color="C0D6DC"/>
+              <w:right w:val="single" w:sz="4" w:space="0" w:color="C0D6DC"/>
             </w:tcBorders>
             <w:tcMar>
               <w:top w:w="60" w:type="dxa"/>
@@ -3276,12 +3288,12 @@
       <w:tr>
         <w:tc>
           <w:tcPr>
-            <w:shd w:val="clear" w:color="auto" w:fill="E8F1F2"/>
-            <w:tcBorders>
-              <w:top w:val="single" w:sz="4" w:space="0" w:color="D1D9DC"/>
-              <w:left w:val="single" w:sz="4" w:space="0" w:color="D1D9DC"/>
-              <w:bottom w:val="single" w:sz="4" w:space="0" w:color="D1D9DC"/>
-              <w:right w:val="single" w:sz="4" w:space="0" w:color="D1D9DC"/>
+            <w:shd w:val="clear" w:color="auto" w:fill="F7FAFB"/>
+            <w:tcBorders>
+              <w:top w:val="single" w:sz="4" w:space="0" w:color="C0D6DC"/>
+              <w:left w:val="single" w:sz="4" w:space="0" w:color="C0D6DC"/>
+              <w:bottom w:val="single" w:sz="4" w:space="0" w:color="C0D6DC"/>
+              <w:right w:val="single" w:sz="4" w:space="0" w:color="C0D6DC"/>
             </w:tcBorders>
             <w:tcMar>
               <w:top w:w="60" w:type="dxa"/>
@@ -3307,12 +3319,12 @@
         </w:tc>
         <w:tc>
           <w:tcPr>
-            <w:shd w:val="clear" w:color="auto" w:fill="E8F1F2"/>
-            <w:tcBorders>
-              <w:top w:val="single" w:sz="4" w:space="0" w:color="D1D9DC"/>
-              <w:left w:val="single" w:sz="4" w:space="0" w:color="D1D9DC"/>
-              <w:bottom w:val="single" w:sz="4" w:space="0" w:color="D1D9DC"/>
-              <w:right w:val="single" w:sz="4" w:space="0" w:color="D1D9DC"/>
+            <w:shd w:val="clear" w:color="auto" w:fill="F7FAFB"/>
+            <w:tcBorders>
+              <w:top w:val="single" w:sz="4" w:space="0" w:color="C0D6DC"/>
+              <w:left w:val="single" w:sz="4" w:space="0" w:color="C0D6DC"/>
+              <w:bottom w:val="single" w:sz="4" w:space="0" w:color="C0D6DC"/>
+              <w:right w:val="single" w:sz="4" w:space="0" w:color="C0D6DC"/>
             </w:tcBorders>
             <w:tcMar>
               <w:top w:w="60" w:type="dxa"/>
@@ -3338,12 +3350,12 @@
         </w:tc>
         <w:tc>
           <w:tcPr>
-            <w:shd w:val="clear" w:color="auto" w:fill="E8F1F2"/>
-            <w:tcBorders>
-              <w:top w:val="single" w:sz="4" w:space="0" w:color="D1D9DC"/>
-              <w:left w:val="single" w:sz="4" w:space="0" w:color="D1D9DC"/>
-              <w:bottom w:val="single" w:sz="4" w:space="0" w:color="D1D9DC"/>
-              <w:right w:val="single" w:sz="4" w:space="0" w:color="D1D9DC"/>
+            <w:shd w:val="clear" w:color="auto" w:fill="F7FAFB"/>
+            <w:tcBorders>
+              <w:top w:val="single" w:sz="4" w:space="0" w:color="C0D6DC"/>
+              <w:left w:val="single" w:sz="4" w:space="0" w:color="C0D6DC"/>
+              <w:bottom w:val="single" w:sz="4" w:space="0" w:color="C0D6DC"/>
+              <w:right w:val="single" w:sz="4" w:space="0" w:color="C0D6DC"/>
             </w:tcBorders>
             <w:tcMar>
               <w:top w:w="60" w:type="dxa"/>
@@ -3373,10 +3385,10 @@
           <w:tcPr>
             <w:shd w:val="clear" w:color="auto" w:fill="FFFFFF"/>
             <w:tcBorders>
-              <w:top w:val="single" w:sz="4" w:space="0" w:color="D1D9DC"/>
-              <w:left w:val="single" w:sz="4" w:space="0" w:color="D1D9DC"/>
-              <w:bottom w:val="single" w:sz="4" w:space="0" w:color="D1D9DC"/>
-              <w:right w:val="single" w:sz="4" w:space="0" w:color="D1D9DC"/>
+              <w:top w:val="single" w:sz="4" w:space="0" w:color="C0D6DC"/>
+              <w:left w:val="single" w:sz="4" w:space="0" w:color="C0D6DC"/>
+              <w:bottom w:val="single" w:sz="4" w:space="0" w:color="C0D6DC"/>
+              <w:right w:val="single" w:sz="4" w:space="0" w:color="C0D6DC"/>
             </w:tcBorders>
             <w:tcMar>
               <w:top w:w="60" w:type="dxa"/>
@@ -3404,10 +3416,10 @@
           <w:tcPr>
             <w:shd w:val="clear" w:color="auto" w:fill="FFFFFF"/>
             <w:tcBorders>
-              <w:top w:val="single" w:sz="4" w:space="0" w:color="D1D9DC"/>
-              <w:left w:val="single" w:sz="4" w:space="0" w:color="D1D9DC"/>
-              <w:bottom w:val="single" w:sz="4" w:space="0" w:color="D1D9DC"/>
-              <w:right w:val="single" w:sz="4" w:space="0" w:color="D1D9DC"/>
+              <w:top w:val="single" w:sz="4" w:space="0" w:color="C0D6DC"/>
+              <w:left w:val="single" w:sz="4" w:space="0" w:color="C0D6DC"/>
+              <w:bottom w:val="single" w:sz="4" w:space="0" w:color="C0D6DC"/>
+              <w:right w:val="single" w:sz="4" w:space="0" w:color="C0D6DC"/>
             </w:tcBorders>
             <w:tcMar>
               <w:top w:w="60" w:type="dxa"/>
@@ -3435,10 +3447,10 @@
           <w:tcPr>
             <w:shd w:val="clear" w:color="auto" w:fill="FFFFFF"/>
             <w:tcBorders>
-              <w:top w:val="single" w:sz="4" w:space="0" w:color="D1D9DC"/>
-              <w:left w:val="single" w:sz="4" w:space="0" w:color="D1D9DC"/>
-              <w:bottom w:val="single" w:sz="4" w:space="0" w:color="D1D9DC"/>
-              <w:right w:val="single" w:sz="4" w:space="0" w:color="D1D9DC"/>
+              <w:top w:val="single" w:sz="4" w:space="0" w:color="C0D6DC"/>
+              <w:left w:val="single" w:sz="4" w:space="0" w:color="C0D6DC"/>
+              <w:bottom w:val="single" w:sz="4" w:space="0" w:color="C0D6DC"/>
+              <w:right w:val="single" w:sz="4" w:space="0" w:color="C0D6DC"/>
             </w:tcBorders>
             <w:tcMar>
               <w:top w:w="60" w:type="dxa"/>
@@ -3483,12 +3495,12 @@
       <w:tr>
         <w:tc>
           <w:tcPr>
-            <w:shd w:val="clear" w:color="auto" w:fill="E8F1F2"/>
-            <w:tcBorders>
-              <w:top w:val="single" w:sz="4" w:space="0" w:color="D1D9DC"/>
-              <w:left w:val="single" w:sz="4" w:space="0" w:color="D1D9DC"/>
-              <w:bottom w:val="single" w:sz="4" w:space="0" w:color="D1D9DC"/>
-              <w:right w:val="single" w:sz="4" w:space="0" w:color="D1D9DC"/>
+            <w:shd w:val="clear" w:color="auto" w:fill="F7FAFB"/>
+            <w:tcBorders>
+              <w:top w:val="single" w:sz="4" w:space="0" w:color="C0D6DC"/>
+              <w:left w:val="single" w:sz="4" w:space="0" w:color="C0D6DC"/>
+              <w:bottom w:val="single" w:sz="4" w:space="0" w:color="C0D6DC"/>
+              <w:right w:val="single" w:sz="4" w:space="0" w:color="C0D6DC"/>
             </w:tcBorders>
             <w:tcMar>
               <w:top w:w="60" w:type="dxa"/>
@@ -3514,12 +3526,12 @@
         </w:tc>
         <w:tc>
           <w:tcPr>
-            <w:shd w:val="clear" w:color="auto" w:fill="E8F1F2"/>
-            <w:tcBorders>
-              <w:top w:val="single" w:sz="4" w:space="0" w:color="D1D9DC"/>
-              <w:left w:val="single" w:sz="4" w:space="0" w:color="D1D9DC"/>
-              <w:bottom w:val="single" w:sz="4" w:space="0" w:color="D1D9DC"/>
-              <w:right w:val="single" w:sz="4" w:space="0" w:color="D1D9DC"/>
+            <w:shd w:val="clear" w:color="auto" w:fill="F7FAFB"/>
+            <w:tcBorders>
+              <w:top w:val="single" w:sz="4" w:space="0" w:color="C0D6DC"/>
+              <w:left w:val="single" w:sz="4" w:space="0" w:color="C0D6DC"/>
+              <w:bottom w:val="single" w:sz="4" w:space="0" w:color="C0D6DC"/>
+              <w:right w:val="single" w:sz="4" w:space="0" w:color="C0D6DC"/>
             </w:tcBorders>
             <w:tcMar>
               <w:top w:w="60" w:type="dxa"/>
@@ -3545,12 +3557,12 @@
         </w:tc>
         <w:tc>
           <w:tcPr>
-            <w:shd w:val="clear" w:color="auto" w:fill="E8F1F2"/>
-            <w:tcBorders>
-              <w:top w:val="single" w:sz="4" w:space="0" w:color="D1D9DC"/>
-              <w:left w:val="single" w:sz="4" w:space="0" w:color="D1D9DC"/>
-              <w:bottom w:val="single" w:sz="4" w:space="0" w:color="D1D9DC"/>
-              <w:right w:val="single" w:sz="4" w:space="0" w:color="D1D9DC"/>
+            <w:shd w:val="clear" w:color="auto" w:fill="F7FAFB"/>
+            <w:tcBorders>
+              <w:top w:val="single" w:sz="4" w:space="0" w:color="C0D6DC"/>
+              <w:left w:val="single" w:sz="4" w:space="0" w:color="C0D6DC"/>
+              <w:bottom w:val="single" w:sz="4" w:space="0" w:color="C0D6DC"/>
+              <w:right w:val="single" w:sz="4" w:space="0" w:color="C0D6DC"/>
             </w:tcBorders>
             <w:tcMar>
               <w:top w:w="60" w:type="dxa"/>
@@ -3580,10 +3592,10 @@
           <w:tcPr>
             <w:shd w:val="clear" w:color="auto" w:fill="FFFFFF"/>
             <w:tcBorders>
-              <w:top w:val="single" w:sz="4" w:space="0" w:color="D1D9DC"/>
-              <w:left w:val="single" w:sz="4" w:space="0" w:color="D1D9DC"/>
-              <w:bottom w:val="single" w:sz="4" w:space="0" w:color="D1D9DC"/>
-              <w:right w:val="single" w:sz="4" w:space="0" w:color="D1D9DC"/>
+              <w:top w:val="single" w:sz="4" w:space="0" w:color="C0D6DC"/>
+              <w:left w:val="single" w:sz="4" w:space="0" w:color="C0D6DC"/>
+              <w:bottom w:val="single" w:sz="4" w:space="0" w:color="C0D6DC"/>
+              <w:right w:val="single" w:sz="4" w:space="0" w:color="C0D6DC"/>
             </w:tcBorders>
             <w:tcMar>
               <w:top w:w="60" w:type="dxa"/>
@@ -3611,10 +3623,10 @@
           <w:tcPr>
             <w:shd w:val="clear" w:color="auto" w:fill="FFFFFF"/>
             <w:tcBorders>
-              <w:top w:val="single" w:sz="4" w:space="0" w:color="D1D9DC"/>
-              <w:left w:val="single" w:sz="4" w:space="0" w:color="D1D9DC"/>
-              <w:bottom w:val="single" w:sz="4" w:space="0" w:color="D1D9DC"/>
-              <w:right w:val="single" w:sz="4" w:space="0" w:color="D1D9DC"/>
+              <w:top w:val="single" w:sz="4" w:space="0" w:color="C0D6DC"/>
+              <w:left w:val="single" w:sz="4" w:space="0" w:color="C0D6DC"/>
+              <w:bottom w:val="single" w:sz="4" w:space="0" w:color="C0D6DC"/>
+              <w:right w:val="single" w:sz="4" w:space="0" w:color="C0D6DC"/>
             </w:tcBorders>
             <w:tcMar>
               <w:top w:w="60" w:type="dxa"/>
@@ -3642,10 +3654,10 @@
           <w:tcPr>
             <w:shd w:val="clear" w:color="auto" w:fill="FFFFFF"/>
             <w:tcBorders>
-              <w:top w:val="single" w:sz="4" w:space="0" w:color="D1D9DC"/>
-              <w:left w:val="single" w:sz="4" w:space="0" w:color="D1D9DC"/>
-              <w:bottom w:val="single" w:sz="4" w:space="0" w:color="D1D9DC"/>
-              <w:right w:val="single" w:sz="4" w:space="0" w:color="D1D9DC"/>
+              <w:top w:val="single" w:sz="4" w:space="0" w:color="C0D6DC"/>
+              <w:left w:val="single" w:sz="4" w:space="0" w:color="C0D6DC"/>
+              <w:bottom w:val="single" w:sz="4" w:space="0" w:color="C0D6DC"/>
+              <w:right w:val="single" w:sz="4" w:space="0" w:color="C0D6DC"/>
             </w:tcBorders>
             <w:tcMar>
               <w:top w:w="60" w:type="dxa"/>
@@ -3673,12 +3685,12 @@
       <w:tr>
         <w:tc>
           <w:tcPr>
-            <w:shd w:val="clear" w:color="auto" w:fill="E8F1F2"/>
-            <w:tcBorders>
-              <w:top w:val="single" w:sz="4" w:space="0" w:color="D1D9DC"/>
-              <w:left w:val="single" w:sz="4" w:space="0" w:color="D1D9DC"/>
-              <w:bottom w:val="single" w:sz="4" w:space="0" w:color="D1D9DC"/>
-              <w:right w:val="single" w:sz="4" w:space="0" w:color="D1D9DC"/>
+            <w:shd w:val="clear" w:color="auto" w:fill="F7FAFB"/>
+            <w:tcBorders>
+              <w:top w:val="single" w:sz="4" w:space="0" w:color="C0D6DC"/>
+              <w:left w:val="single" w:sz="4" w:space="0" w:color="C0D6DC"/>
+              <w:bottom w:val="single" w:sz="4" w:space="0" w:color="C0D6DC"/>
+              <w:right w:val="single" w:sz="4" w:space="0" w:color="C0D6DC"/>
             </w:tcBorders>
             <w:tcMar>
               <w:top w:w="60" w:type="dxa"/>
@@ -3704,12 +3716,12 @@
         </w:tc>
         <w:tc>
           <w:tcPr>
-            <w:shd w:val="clear" w:color="auto" w:fill="E8F1F2"/>
-            <w:tcBorders>
-              <w:top w:val="single" w:sz="4" w:space="0" w:color="D1D9DC"/>
-              <w:left w:val="single" w:sz="4" w:space="0" w:color="D1D9DC"/>
-              <w:bottom w:val="single" w:sz="4" w:space="0" w:color="D1D9DC"/>
-              <w:right w:val="single" w:sz="4" w:space="0" w:color="D1D9DC"/>
+            <w:shd w:val="clear" w:color="auto" w:fill="F7FAFB"/>
+            <w:tcBorders>
+              <w:top w:val="single" w:sz="4" w:space="0" w:color="C0D6DC"/>
+              <w:left w:val="single" w:sz="4" w:space="0" w:color="C0D6DC"/>
+              <w:bottom w:val="single" w:sz="4" w:space="0" w:color="C0D6DC"/>
+              <w:right w:val="single" w:sz="4" w:space="0" w:color="C0D6DC"/>
             </w:tcBorders>
             <w:tcMar>
               <w:top w:w="60" w:type="dxa"/>
@@ -3735,12 +3747,12 @@
         </w:tc>
         <w:tc>
           <w:tcPr>
-            <w:shd w:val="clear" w:color="auto" w:fill="E8F1F2"/>
-            <w:tcBorders>
-              <w:top w:val="single" w:sz="4" w:space="0" w:color="D1D9DC"/>
-              <w:left w:val="single" w:sz="4" w:space="0" w:color="D1D9DC"/>
-              <w:bottom w:val="single" w:sz="4" w:space="0" w:color="D1D9DC"/>
-              <w:right w:val="single" w:sz="4" w:space="0" w:color="D1D9DC"/>
+            <w:shd w:val="clear" w:color="auto" w:fill="F7FAFB"/>
+            <w:tcBorders>
+              <w:top w:val="single" w:sz="4" w:space="0" w:color="C0D6DC"/>
+              <w:left w:val="single" w:sz="4" w:space="0" w:color="C0D6DC"/>
+              <w:bottom w:val="single" w:sz="4" w:space="0" w:color="C0D6DC"/>
+              <w:right w:val="single" w:sz="4" w:space="0" w:color="C0D6DC"/>
             </w:tcBorders>
             <w:tcMar>
               <w:top w:w="60" w:type="dxa"/>
@@ -3770,10 +3782,10 @@
           <w:tcPr>
             <w:shd w:val="clear" w:color="auto" w:fill="FFFFFF"/>
             <w:tcBorders>
-              <w:top w:val="single" w:sz="4" w:space="0" w:color="D1D9DC"/>
-              <w:left w:val="single" w:sz="4" w:space="0" w:color="D1D9DC"/>
-              <w:bottom w:val="single" w:sz="4" w:space="0" w:color="D1D9DC"/>
-              <w:right w:val="single" w:sz="4" w:space="0" w:color="D1D9DC"/>
+              <w:top w:val="single" w:sz="4" w:space="0" w:color="C0D6DC"/>
+              <w:left w:val="single" w:sz="4" w:space="0" w:color="C0D6DC"/>
+              <w:bottom w:val="single" w:sz="4" w:space="0" w:color="C0D6DC"/>
+              <w:right w:val="single" w:sz="4" w:space="0" w:color="C0D6DC"/>
             </w:tcBorders>
             <w:tcMar>
               <w:top w:w="60" w:type="dxa"/>
@@ -3801,10 +3813,10 @@
           <w:tcPr>
             <w:shd w:val="clear" w:color="auto" w:fill="FFFFFF"/>
             <w:tcBorders>
-              <w:top w:val="single" w:sz="4" w:space="0" w:color="D1D9DC"/>
-              <w:left w:val="single" w:sz="4" w:space="0" w:color="D1D9DC"/>
-              <w:bottom w:val="single" w:sz="4" w:space="0" w:color="D1D9DC"/>
-              <w:right w:val="single" w:sz="4" w:space="0" w:color="D1D9DC"/>
+              <w:top w:val="single" w:sz="4" w:space="0" w:color="C0D6DC"/>
+              <w:left w:val="single" w:sz="4" w:space="0" w:color="C0D6DC"/>
+              <w:bottom w:val="single" w:sz="4" w:space="0" w:color="C0D6DC"/>
+              <w:right w:val="single" w:sz="4" w:space="0" w:color="C0D6DC"/>
             </w:tcBorders>
             <w:tcMar>
               <w:top w:w="60" w:type="dxa"/>
@@ -3832,10 +3844,10 @@
           <w:tcPr>
             <w:shd w:val="clear" w:color="auto" w:fill="FFFFFF"/>
             <w:tcBorders>
-              <w:top w:val="single" w:sz="4" w:space="0" w:color="D1D9DC"/>
-              <w:left w:val="single" w:sz="4" w:space="0" w:color="D1D9DC"/>
-              <w:bottom w:val="single" w:sz="4" w:space="0" w:color="D1D9DC"/>
-              <w:right w:val="single" w:sz="4" w:space="0" w:color="D1D9DC"/>
+              <w:top w:val="single" w:sz="4" w:space="0" w:color="C0D6DC"/>
+              <w:left w:val="single" w:sz="4" w:space="0" w:color="C0D6DC"/>
+              <w:bottom w:val="single" w:sz="4" w:space="0" w:color="C0D6DC"/>
+              <w:right w:val="single" w:sz="4" w:space="0" w:color="C0D6DC"/>
             </w:tcBorders>
             <w:tcMar>
               <w:top w:w="60" w:type="dxa"/>
@@ -3863,12 +3875,12 @@
       <w:tr>
         <w:tc>
           <w:tcPr>
-            <w:shd w:val="clear" w:color="auto" w:fill="E8F1F2"/>
-            <w:tcBorders>
-              <w:top w:val="single" w:sz="4" w:space="0" w:color="D1D9DC"/>
-              <w:left w:val="single" w:sz="4" w:space="0" w:color="D1D9DC"/>
-              <w:bottom w:val="single" w:sz="4" w:space="0" w:color="D1D9DC"/>
-              <w:right w:val="single" w:sz="4" w:space="0" w:color="D1D9DC"/>
+            <w:shd w:val="clear" w:color="auto" w:fill="F7FAFB"/>
+            <w:tcBorders>
+              <w:top w:val="single" w:sz="4" w:space="0" w:color="C0D6DC"/>
+              <w:left w:val="single" w:sz="4" w:space="0" w:color="C0D6DC"/>
+              <w:bottom w:val="single" w:sz="4" w:space="0" w:color="C0D6DC"/>
+              <w:right w:val="single" w:sz="4" w:space="0" w:color="C0D6DC"/>
             </w:tcBorders>
             <w:tcMar>
               <w:top w:w="60" w:type="dxa"/>
@@ -3894,12 +3906,12 @@
         </w:tc>
         <w:tc>
           <w:tcPr>
-            <w:shd w:val="clear" w:color="auto" w:fill="E8F1F2"/>
-            <w:tcBorders>
-              <w:top w:val="single" w:sz="4" w:space="0" w:color="D1D9DC"/>
-              <w:left w:val="single" w:sz="4" w:space="0" w:color="D1D9DC"/>
-              <w:bottom w:val="single" w:sz="4" w:space="0" w:color="D1D9DC"/>
-              <w:right w:val="single" w:sz="4" w:space="0" w:color="D1D9DC"/>
+            <w:shd w:val="clear" w:color="auto" w:fill="F7FAFB"/>
+            <w:tcBorders>
+              <w:top w:val="single" w:sz="4" w:space="0" w:color="C0D6DC"/>
+              <w:left w:val="single" w:sz="4" w:space="0" w:color="C0D6DC"/>
+              <w:bottom w:val="single" w:sz="4" w:space="0" w:color="C0D6DC"/>
+              <w:right w:val="single" w:sz="4" w:space="0" w:color="C0D6DC"/>
             </w:tcBorders>
             <w:tcMar>
               <w:top w:w="60" w:type="dxa"/>
@@ -3925,12 +3937,12 @@
         </w:tc>
         <w:tc>
           <w:tcPr>
-            <w:shd w:val="clear" w:color="auto" w:fill="E8F1F2"/>
-            <w:tcBorders>
-              <w:top w:val="single" w:sz="4" w:space="0" w:color="D1D9DC"/>
-              <w:left w:val="single" w:sz="4" w:space="0" w:color="D1D9DC"/>
-              <w:bottom w:val="single" w:sz="4" w:space="0" w:color="D1D9DC"/>
-              <w:right w:val="single" w:sz="4" w:space="0" w:color="D1D9DC"/>
+            <w:shd w:val="clear" w:color="auto" w:fill="F7FAFB"/>
+            <w:tcBorders>
+              <w:top w:val="single" w:sz="4" w:space="0" w:color="C0D6DC"/>
+              <w:left w:val="single" w:sz="4" w:space="0" w:color="C0D6DC"/>
+              <w:bottom w:val="single" w:sz="4" w:space="0" w:color="C0D6DC"/>
+              <w:right w:val="single" w:sz="4" w:space="0" w:color="C0D6DC"/>
             </w:tcBorders>
             <w:tcMar>
               <w:top w:w="60" w:type="dxa"/>
@@ -3960,10 +3972,10 @@
           <w:tcPr>
             <w:shd w:val="clear" w:color="auto" w:fill="FFFFFF"/>
             <w:tcBorders>
-              <w:top w:val="single" w:sz="4" w:space="0" w:color="D1D9DC"/>
-              <w:left w:val="single" w:sz="4" w:space="0" w:color="D1D9DC"/>
-              <w:bottom w:val="single" w:sz="4" w:space="0" w:color="D1D9DC"/>
-              <w:right w:val="single" w:sz="4" w:space="0" w:color="D1D9DC"/>
+              <w:top w:val="single" w:sz="4" w:space="0" w:color="C0D6DC"/>
+              <w:left w:val="single" w:sz="4" w:space="0" w:color="C0D6DC"/>
+              <w:bottom w:val="single" w:sz="4" w:space="0" w:color="C0D6DC"/>
+              <w:right w:val="single" w:sz="4" w:space="0" w:color="C0D6DC"/>
             </w:tcBorders>
             <w:tcMar>
               <w:top w:w="60" w:type="dxa"/>
@@ -3991,10 +4003,10 @@
           <w:tcPr>
             <w:shd w:val="clear" w:color="auto" w:fill="FFFFFF"/>
             <w:tcBorders>
-              <w:top w:val="single" w:sz="4" w:space="0" w:color="D1D9DC"/>
-              <w:left w:val="single" w:sz="4" w:space="0" w:color="D1D9DC"/>
-              <w:bottom w:val="single" w:sz="4" w:space="0" w:color="D1D9DC"/>
-              <w:right w:val="single" w:sz="4" w:space="0" w:color="D1D9DC"/>
+              <w:top w:val="single" w:sz="4" w:space="0" w:color="C0D6DC"/>
+              <w:left w:val="single" w:sz="4" w:space="0" w:color="C0D6DC"/>
+              <w:bottom w:val="single" w:sz="4" w:space="0" w:color="C0D6DC"/>
+              <w:right w:val="single" w:sz="4" w:space="0" w:color="C0D6DC"/>
             </w:tcBorders>
             <w:tcMar>
               <w:top w:w="60" w:type="dxa"/>
@@ -4022,10 +4034,10 @@
           <w:tcPr>
             <w:shd w:val="clear" w:color="auto" w:fill="FFFFFF"/>
             <w:tcBorders>
-              <w:top w:val="single" w:sz="4" w:space="0" w:color="D1D9DC"/>
-              <w:left w:val="single" w:sz="4" w:space="0" w:color="D1D9DC"/>
-              <w:bottom w:val="single" w:sz="4" w:space="0" w:color="D1D9DC"/>
-              <w:right w:val="single" w:sz="4" w:space="0" w:color="D1D9DC"/>
+              <w:top w:val="single" w:sz="4" w:space="0" w:color="C0D6DC"/>
+              <w:left w:val="single" w:sz="4" w:space="0" w:color="C0D6DC"/>
+              <w:bottom w:val="single" w:sz="4" w:space="0" w:color="C0D6DC"/>
+              <w:right w:val="single" w:sz="4" w:space="0" w:color="C0D6DC"/>
             </w:tcBorders>
             <w:tcMar>
               <w:top w:w="60" w:type="dxa"/>
@@ -4094,12 +4106,12 @@
         </w:trPr>
         <w:tc>
           <w:tcPr>
-            <w:shd w:val="clear" w:color="auto" w:fill="02374f"/>
-            <w:tcBorders>
-              <w:top w:val="single" w:sz="4" w:space="0" w:color="D1D9DC"/>
-              <w:left w:val="single" w:sz="4" w:space="0" w:color="D1D9DC"/>
-              <w:bottom w:val="single" w:sz="4" w:space="0" w:color="D1D9DC"/>
-              <w:right w:val="single" w:sz="4" w:space="0" w:color="D1D9DC"/>
+            <w:shd w:val="clear" w:color="auto" w:fill="D6EFF2"/>
+            <w:tcBorders>
+              <w:top w:val="single" w:sz="4" w:space="0" w:color="C0D6DC"/>
+              <w:left w:val="single" w:sz="4" w:space="0" w:color="C0D6DC"/>
+              <w:bottom w:val="single" w:sz="4" w:space="0" w:color="C0D6DC"/>
+              <w:right w:val="single" w:sz="4" w:space="0" w:color="C0D6DC"/>
             </w:tcBorders>
             <w:tcMar>
               <w:top w:w="60" w:type="dxa"/>
@@ -4117,7 +4129,7 @@
               <w:rPr>
                 <w:rFonts w:ascii="Calibri" w:hAnsi="Calibri"/>
                 <w:b/>
-                <w:color w:val="FFFFFF"/>
+                <w:color w:val="024E70"/>
                 <w:sz w:val="19"/>
               </w:rPr>
               <w:t xml:space="preserve">Environment</w:t>
@@ -4126,12 +4138,12 @@
         </w:tc>
         <w:tc>
           <w:tcPr>
-            <w:shd w:val="clear" w:color="auto" w:fill="02374f"/>
-            <w:tcBorders>
-              <w:top w:val="single" w:sz="4" w:space="0" w:color="D1D9DC"/>
-              <w:left w:val="single" w:sz="4" w:space="0" w:color="D1D9DC"/>
-              <w:bottom w:val="single" w:sz="4" w:space="0" w:color="D1D9DC"/>
-              <w:right w:val="single" w:sz="4" w:space="0" w:color="D1D9DC"/>
+            <w:shd w:val="clear" w:color="auto" w:fill="D6EFF2"/>
+            <w:tcBorders>
+              <w:top w:val="single" w:sz="4" w:space="0" w:color="C0D6DC"/>
+              <w:left w:val="single" w:sz="4" w:space="0" w:color="C0D6DC"/>
+              <w:bottom w:val="single" w:sz="4" w:space="0" w:color="C0D6DC"/>
+              <w:right w:val="single" w:sz="4" w:space="0" w:color="C0D6DC"/>
             </w:tcBorders>
             <w:tcMar>
               <w:top w:w="60" w:type="dxa"/>
@@ -4149,7 +4161,7 @@
               <w:rPr>
                 <w:rFonts w:ascii="Calibri" w:hAnsi="Calibri"/>
                 <w:b/>
-                <w:color w:val="FFFFFF"/>
+                <w:color w:val="024E70"/>
                 <w:sz w:val="19"/>
               </w:rPr>
               <w:t xml:space="preserve">Host</w:t>
@@ -4158,12 +4170,12 @@
         </w:tc>
         <w:tc>
           <w:tcPr>
-            <w:shd w:val="clear" w:color="auto" w:fill="02374f"/>
-            <w:tcBorders>
-              <w:top w:val="single" w:sz="4" w:space="0" w:color="D1D9DC"/>
-              <w:left w:val="single" w:sz="4" w:space="0" w:color="D1D9DC"/>
-              <w:bottom w:val="single" w:sz="4" w:space="0" w:color="D1D9DC"/>
-              <w:right w:val="single" w:sz="4" w:space="0" w:color="D1D9DC"/>
+            <w:shd w:val="clear" w:color="auto" w:fill="D6EFF2"/>
+            <w:tcBorders>
+              <w:top w:val="single" w:sz="4" w:space="0" w:color="C0D6DC"/>
+              <w:left w:val="single" w:sz="4" w:space="0" w:color="C0D6DC"/>
+              <w:bottom w:val="single" w:sz="4" w:space="0" w:color="C0D6DC"/>
+              <w:right w:val="single" w:sz="4" w:space="0" w:color="C0D6DC"/>
             </w:tcBorders>
             <w:tcMar>
               <w:top w:w="60" w:type="dxa"/>
@@ -4181,7 +4193,7 @@
               <w:rPr>
                 <w:rFonts w:ascii="Calibri" w:hAnsi="Calibri"/>
                 <w:b/>
-                <w:color w:val="FFFFFF"/>
+                <w:color w:val="024E70"/>
                 <w:sz w:val="19"/>
               </w:rPr>
               <w:t xml:space="preserve">URL</w:t>
@@ -4194,10 +4206,10 @@
           <w:tcPr>
             <w:shd w:val="clear" w:color="auto" w:fill="FFFFFF"/>
             <w:tcBorders>
-              <w:top w:val="single" w:sz="4" w:space="0" w:color="D1D9DC"/>
-              <w:left w:val="single" w:sz="4" w:space="0" w:color="D1D9DC"/>
-              <w:bottom w:val="single" w:sz="4" w:space="0" w:color="D1D9DC"/>
-              <w:right w:val="single" w:sz="4" w:space="0" w:color="D1D9DC"/>
+              <w:top w:val="single" w:sz="4" w:space="0" w:color="C0D6DC"/>
+              <w:left w:val="single" w:sz="4" w:space="0" w:color="C0D6DC"/>
+              <w:bottom w:val="single" w:sz="4" w:space="0" w:color="C0D6DC"/>
+              <w:right w:val="single" w:sz="4" w:space="0" w:color="C0D6DC"/>
             </w:tcBorders>
             <w:tcMar>
               <w:top w:w="60" w:type="dxa"/>
@@ -4225,10 +4237,10 @@
           <w:tcPr>
             <w:shd w:val="clear" w:color="auto" w:fill="FFFFFF"/>
             <w:tcBorders>
-              <w:top w:val="single" w:sz="4" w:space="0" w:color="D1D9DC"/>
-              <w:left w:val="single" w:sz="4" w:space="0" w:color="D1D9DC"/>
-              <w:bottom w:val="single" w:sz="4" w:space="0" w:color="D1D9DC"/>
-              <w:right w:val="single" w:sz="4" w:space="0" w:color="D1D9DC"/>
+              <w:top w:val="single" w:sz="4" w:space="0" w:color="C0D6DC"/>
+              <w:left w:val="single" w:sz="4" w:space="0" w:color="C0D6DC"/>
+              <w:bottom w:val="single" w:sz="4" w:space="0" w:color="C0D6DC"/>
+              <w:right w:val="single" w:sz="4" w:space="0" w:color="C0D6DC"/>
             </w:tcBorders>
             <w:tcMar>
               <w:top w:w="60" w:type="dxa"/>
@@ -4256,10 +4268,10 @@
           <w:tcPr>
             <w:shd w:val="clear" w:color="auto" w:fill="FFFFFF"/>
             <w:tcBorders>
-              <w:top w:val="single" w:sz="4" w:space="0" w:color="D1D9DC"/>
-              <w:left w:val="single" w:sz="4" w:space="0" w:color="D1D9DC"/>
-              <w:bottom w:val="single" w:sz="4" w:space="0" w:color="D1D9DC"/>
-              <w:right w:val="single" w:sz="4" w:space="0" w:color="D1D9DC"/>
+              <w:top w:val="single" w:sz="4" w:space="0" w:color="C0D6DC"/>
+              <w:left w:val="single" w:sz="4" w:space="0" w:color="C0D6DC"/>
+              <w:bottom w:val="single" w:sz="4" w:space="0" w:color="C0D6DC"/>
+              <w:right w:val="single" w:sz="4" w:space="0" w:color="C0D6DC"/>
             </w:tcBorders>
             <w:tcMar>
               <w:top w:w="60" w:type="dxa"/>
@@ -4287,12 +4299,12 @@
       <w:tr>
         <w:tc>
           <w:tcPr>
-            <w:shd w:val="clear" w:color="auto" w:fill="E8F1F2"/>
-            <w:tcBorders>
-              <w:top w:val="single" w:sz="4" w:space="0" w:color="D1D9DC"/>
-              <w:left w:val="single" w:sz="4" w:space="0" w:color="D1D9DC"/>
-              <w:bottom w:val="single" w:sz="4" w:space="0" w:color="D1D9DC"/>
-              <w:right w:val="single" w:sz="4" w:space="0" w:color="D1D9DC"/>
+            <w:shd w:val="clear" w:color="auto" w:fill="F7FAFB"/>
+            <w:tcBorders>
+              <w:top w:val="single" w:sz="4" w:space="0" w:color="C0D6DC"/>
+              <w:left w:val="single" w:sz="4" w:space="0" w:color="C0D6DC"/>
+              <w:bottom w:val="single" w:sz="4" w:space="0" w:color="C0D6DC"/>
+              <w:right w:val="single" w:sz="4" w:space="0" w:color="C0D6DC"/>
             </w:tcBorders>
             <w:tcMar>
               <w:top w:w="60" w:type="dxa"/>
@@ -4318,12 +4330,12 @@
         </w:tc>
         <w:tc>
           <w:tcPr>
-            <w:shd w:val="clear" w:color="auto" w:fill="E8F1F2"/>
-            <w:tcBorders>
-              <w:top w:val="single" w:sz="4" w:space="0" w:color="D1D9DC"/>
-              <w:left w:val="single" w:sz="4" w:space="0" w:color="D1D9DC"/>
-              <w:bottom w:val="single" w:sz="4" w:space="0" w:color="D1D9DC"/>
-              <w:right w:val="single" w:sz="4" w:space="0" w:color="D1D9DC"/>
+            <w:shd w:val="clear" w:color="auto" w:fill="F7FAFB"/>
+            <w:tcBorders>
+              <w:top w:val="single" w:sz="4" w:space="0" w:color="C0D6DC"/>
+              <w:left w:val="single" w:sz="4" w:space="0" w:color="C0D6DC"/>
+              <w:bottom w:val="single" w:sz="4" w:space="0" w:color="C0D6DC"/>
+              <w:right w:val="single" w:sz="4" w:space="0" w:color="C0D6DC"/>
             </w:tcBorders>
             <w:tcMar>
               <w:top w:w="60" w:type="dxa"/>
@@ -4349,12 +4361,12 @@
         </w:tc>
         <w:tc>
           <w:tcPr>
-            <w:shd w:val="clear" w:color="auto" w:fill="E8F1F2"/>
-            <w:tcBorders>
-              <w:top w:val="single" w:sz="4" w:space="0" w:color="D1D9DC"/>
-              <w:left w:val="single" w:sz="4" w:space="0" w:color="D1D9DC"/>
-              <w:bottom w:val="single" w:sz="4" w:space="0" w:color="D1D9DC"/>
-              <w:right w:val="single" w:sz="4" w:space="0" w:color="D1D9DC"/>
+            <w:shd w:val="clear" w:color="auto" w:fill="F7FAFB"/>
+            <w:tcBorders>
+              <w:top w:val="single" w:sz="4" w:space="0" w:color="C0D6DC"/>
+              <w:left w:val="single" w:sz="4" w:space="0" w:color="C0D6DC"/>
+              <w:bottom w:val="single" w:sz="4" w:space="0" w:color="C0D6DC"/>
+              <w:right w:val="single" w:sz="4" w:space="0" w:color="C0D6DC"/>
             </w:tcBorders>
             <w:tcMar>
               <w:top w:w="60" w:type="dxa"/>
@@ -4384,10 +4396,10 @@
           <w:tcPr>
             <w:shd w:val="clear" w:color="auto" w:fill="FFFFFF"/>
             <w:tcBorders>
-              <w:top w:val="single" w:sz="4" w:space="0" w:color="D1D9DC"/>
-              <w:left w:val="single" w:sz="4" w:space="0" w:color="D1D9DC"/>
-              <w:bottom w:val="single" w:sz="4" w:space="0" w:color="D1D9DC"/>
-              <w:right w:val="single" w:sz="4" w:space="0" w:color="D1D9DC"/>
+              <w:top w:val="single" w:sz="4" w:space="0" w:color="C0D6DC"/>
+              <w:left w:val="single" w:sz="4" w:space="0" w:color="C0D6DC"/>
+              <w:bottom w:val="single" w:sz="4" w:space="0" w:color="C0D6DC"/>
+              <w:right w:val="single" w:sz="4" w:space="0" w:color="C0D6DC"/>
             </w:tcBorders>
             <w:tcMar>
               <w:top w:w="60" w:type="dxa"/>
@@ -4415,10 +4427,10 @@
           <w:tcPr>
             <w:shd w:val="clear" w:color="auto" w:fill="FFFFFF"/>
             <w:tcBorders>
-              <w:top w:val="single" w:sz="4" w:space="0" w:color="D1D9DC"/>
-              <w:left w:val="single" w:sz="4" w:space="0" w:color="D1D9DC"/>
-              <w:bottom w:val="single" w:sz="4" w:space="0" w:color="D1D9DC"/>
-              <w:right w:val="single" w:sz="4" w:space="0" w:color="D1D9DC"/>
+              <w:top w:val="single" w:sz="4" w:space="0" w:color="C0D6DC"/>
+              <w:left w:val="single" w:sz="4" w:space="0" w:color="C0D6DC"/>
+              <w:bottom w:val="single" w:sz="4" w:space="0" w:color="C0D6DC"/>
+              <w:right w:val="single" w:sz="4" w:space="0" w:color="C0D6DC"/>
             </w:tcBorders>
             <w:tcMar>
               <w:top w:w="60" w:type="dxa"/>
@@ -4446,10 +4458,10 @@
           <w:tcPr>
             <w:shd w:val="clear" w:color="auto" w:fill="FFFFFF"/>
             <w:tcBorders>
-              <w:top w:val="single" w:sz="4" w:space="0" w:color="D1D9DC"/>
-              <w:left w:val="single" w:sz="4" w:space="0" w:color="D1D9DC"/>
-              <w:bottom w:val="single" w:sz="4" w:space="0" w:color="D1D9DC"/>
-              <w:right w:val="single" w:sz="4" w:space="0" w:color="D1D9DC"/>
+              <w:top w:val="single" w:sz="4" w:space="0" w:color="C0D6DC"/>
+              <w:left w:val="single" w:sz="4" w:space="0" w:color="C0D6DC"/>
+              <w:bottom w:val="single" w:sz="4" w:space="0" w:color="C0D6DC"/>
+              <w:right w:val="single" w:sz="4" w:space="0" w:color="C0D6DC"/>
             </w:tcBorders>
             <w:tcMar>
               <w:top w:w="60" w:type="dxa"/>
@@ -4497,6 +4509,7 @@
     <w:p>
       <w:pPr>
         <w:pStyle w:val="SourceCode"/>
+        <w:shd w:val="clear" w:color="auto" w:fill="EFF7FF"/>
         <w:spacing w:before="20" w:after="20"/>
         <w:ind w:left="283"/>
       </w:pPr>
@@ -4505,8 +4518,8 @@
           <w:rStyle w:val="VerbatimChar"/>
           <w:rFonts w:ascii="Courier New" w:hAnsi="Courier New"/>
           <w:b w:val="0"/>
-          <w:color w:val="7DD3FC"/>
-          <w:sz w:val="17"/>
+          <w:color w:val="02374F"/>
+          <w:sz w:val="18"/>
         </w:rPr>
         <w:t xml:space="preserve">001 Layout extraction</w:t>
       </w:r>
@@ -4514,8 +4527,8 @@
         <w:rPr>
           <w:rFonts w:ascii="Courier New" w:hAnsi="Courier New"/>
           <w:b w:val="0"/>
-          <w:color w:val="7DD3FC"/>
-          <w:sz w:val="17"/>
+          <w:color w:val="02374F"/>
+          <w:sz w:val="18"/>
         </w:rPr>
         <w:br/>
       </w:r>
@@ -4524,8 +4537,8 @@
           <w:rStyle w:val="VerbatimChar"/>
           <w:rFonts w:ascii="Courier New" w:hAnsi="Courier New"/>
           <w:b w:val="0"/>
-          <w:color w:val="7DD3FC"/>
-          <w:sz w:val="17"/>
+          <w:color w:val="02374F"/>
+          <w:sz w:val="18"/>
         </w:rPr>
         <w:t xml:space="preserve">  → 002 Routing scaffold</w:t>
       </w:r>
@@ -4533,8 +4546,8 @@
         <w:rPr>
           <w:rFonts w:ascii="Courier New" w:hAnsi="Courier New"/>
           <w:b w:val="0"/>
-          <w:color w:val="7DD3FC"/>
-          <w:sz w:val="17"/>
+          <w:color w:val="02374F"/>
+          <w:sz w:val="18"/>
         </w:rPr>
         <w:br/>
       </w:r>
@@ -4543,8 +4556,8 @@
           <w:rStyle w:val="VerbatimChar"/>
           <w:rFonts w:ascii="Courier New" w:hAnsi="Courier New"/>
           <w:b w:val="0"/>
-          <w:color w:val="7DD3FC"/>
-          <w:sz w:val="17"/>
+          <w:color w:val="02374F"/>
+          <w:sz w:val="18"/>
         </w:rPr>
         <w:t xml:space="preserve">    → 003 Mobile nav drawer</w:t>
       </w:r>
@@ -4552,8 +4565,8 @@
         <w:rPr>
           <w:rFonts w:ascii="Courier New" w:hAnsi="Courier New"/>
           <w:b w:val="0"/>
-          <w:color w:val="7DD3FC"/>
-          <w:sz w:val="17"/>
+          <w:color w:val="02374F"/>
+          <w:sz w:val="18"/>
         </w:rPr>
         <w:br/>
       </w:r>
@@ -4562,8 +4575,8 @@
           <w:rStyle w:val="VerbatimChar"/>
           <w:rFonts w:ascii="Courier New" w:hAnsi="Courier New"/>
           <w:b w:val="0"/>
-          <w:color w:val="7DD3FC"/>
-          <w:sz w:val="17"/>
+          <w:color w:val="02374F"/>
+          <w:sz w:val="18"/>
         </w:rPr>
         <w:t xml:space="preserve">    → 010 Homepage migration</w:t>
       </w:r>
@@ -4571,8 +4584,8 @@
         <w:rPr>
           <w:rFonts w:ascii="Courier New" w:hAnsi="Courier New"/>
           <w:b w:val="0"/>
-          <w:color w:val="7DD3FC"/>
-          <w:sz w:val="17"/>
+          <w:color w:val="02374F"/>
+          <w:sz w:val="18"/>
         </w:rPr>
         <w:br/>
       </w:r>
@@ -4581,8 +4594,8 @@
           <w:rStyle w:val="VerbatimChar"/>
           <w:rFonts w:ascii="Courier New" w:hAnsi="Courier New"/>
           <w:b w:val="0"/>
-          <w:color w:val="7DD3FC"/>
-          <w:sz w:val="17"/>
+          <w:color w:val="02374F"/>
+          <w:sz w:val="18"/>
         </w:rPr>
         <w:t xml:space="preserve">      → 004 Wire nav/footer links</w:t>
       </w:r>
@@ -4590,8 +4603,8 @@
         <w:rPr>
           <w:rFonts w:ascii="Courier New" w:hAnsi="Courier New"/>
           <w:b w:val="0"/>
-          <w:color w:val="7DD3FC"/>
-          <w:sz w:val="17"/>
+          <w:color w:val="02374F"/>
+          <w:sz w:val="18"/>
         </w:rPr>
         <w:br/>
       </w:r>
@@ -4600,8 +4613,8 @@
           <w:rStyle w:val="VerbatimChar"/>
           <w:rFonts w:ascii="Courier New" w:hAnsi="Courier New"/>
           <w:b w:val="0"/>
-          <w:color w:val="7DD3FC"/>
-          <w:sz w:val="17"/>
+          <w:color w:val="02374F"/>
+          <w:sz w:val="18"/>
         </w:rPr>
         <w:t xml:space="preserve">      → 020 /why page</w:t>
       </w:r>
@@ -4609,8 +4622,8 @@
         <w:rPr>
           <w:rFonts w:ascii="Courier New" w:hAnsi="Courier New"/>
           <w:b w:val="0"/>
-          <w:color w:val="7DD3FC"/>
-          <w:sz w:val="17"/>
+          <w:color w:val="02374F"/>
+          <w:sz w:val="18"/>
         </w:rPr>
         <w:br/>
       </w:r>
@@ -4619,8 +4632,8 @@
           <w:rStyle w:val="VerbatimChar"/>
           <w:rFonts w:ascii="Courier New" w:hAnsi="Courier New"/>
           <w:b w:val="0"/>
-          <w:color w:val="7DD3FC"/>
-          <w:sz w:val="17"/>
+          <w:color w:val="02374F"/>
+          <w:sz w:val="18"/>
         </w:rPr>
         <w:t xml:space="preserve">      → 030 Stories data + JSON  ← needs comms content</w:t>
       </w:r>
@@ -4628,8 +4641,8 @@
         <w:rPr>
           <w:rFonts w:ascii="Courier New" w:hAnsi="Courier New"/>
           <w:b w:val="0"/>
-          <w:color w:val="7DD3FC"/>
-          <w:sz w:val="17"/>
+          <w:color w:val="02374F"/>
+          <w:sz w:val="18"/>
         </w:rPr>
         <w:br/>
       </w:r>
@@ -4638,8 +4651,8 @@
           <w:rStyle w:val="VerbatimChar"/>
           <w:rFonts w:ascii="Courier New" w:hAnsi="Courier New"/>
           <w:b w:val="0"/>
-          <w:color w:val="7DD3FC"/>
-          <w:sz w:val="17"/>
+          <w:color w:val="02374F"/>
+          <w:sz w:val="18"/>
         </w:rPr>
         <w:t xml:space="preserve">        → 031 /stories index</w:t>
       </w:r>
@@ -4647,8 +4660,8 @@
         <w:rPr>
           <w:rFonts w:ascii="Courier New" w:hAnsi="Courier New"/>
           <w:b w:val="0"/>
-          <w:color w:val="7DD3FC"/>
-          <w:sz w:val="17"/>
+          <w:color w:val="02374F"/>
+          <w:sz w:val="18"/>
         </w:rPr>
         <w:br/>
       </w:r>
@@ -4657,8 +4670,8 @@
           <w:rStyle w:val="VerbatimChar"/>
           <w:rFonts w:ascii="Courier New" w:hAnsi="Courier New"/>
           <w:b w:val="0"/>
-          <w:color w:val="7DD3FC"/>
-          <w:sz w:val="17"/>
+          <w:color w:val="02374F"/>
+          <w:sz w:val="18"/>
         </w:rPr>
         <w:t xml:space="preserve">      → 040 /schools page</w:t>
       </w:r>
@@ -4666,8 +4679,8 @@
         <w:rPr>
           <w:rFonts w:ascii="Courier New" w:hAnsi="Courier New"/>
           <w:b w:val="0"/>
-          <w:color w:val="7DD3FC"/>
-          <w:sz w:val="17"/>
+          <w:color w:val="02374F"/>
+          <w:sz w:val="18"/>
         </w:rPr>
         <w:br/>
       </w:r>
@@ -4676,8 +4689,8 @@
           <w:rStyle w:val="VerbatimChar"/>
           <w:rFonts w:ascii="Courier New" w:hAnsi="Courier New"/>
           <w:b w:val="0"/>
-          <w:color w:val="7DD3FC"/>
-          <w:sz w:val="17"/>
+          <w:color w:val="02374F"/>
+          <w:sz w:val="18"/>
         </w:rPr>
         <w:t xml:space="preserve">      → 050 /give gateway</w:t>
       </w:r>
@@ -4685,8 +4698,8 @@
         <w:rPr>
           <w:rFonts w:ascii="Courier New" w:hAnsi="Courier New"/>
           <w:b w:val="0"/>
-          <w:color w:val="7DD3FC"/>
-          <w:sz w:val="17"/>
+          <w:color w:val="02374F"/>
+          <w:sz w:val="18"/>
         </w:rPr>
         <w:br/>
       </w:r>
@@ -4695,8 +4708,8 @@
           <w:rStyle w:val="VerbatimChar"/>
           <w:rFonts w:ascii="Courier New" w:hAnsi="Courier New"/>
           <w:b w:val="0"/>
-          <w:color w:val="7DD3FC"/>
-          <w:sz w:val="17"/>
+          <w:color w:val="02374F"/>
+          <w:sz w:val="18"/>
         </w:rPr>
         <w:t xml:space="preserve">        → 060 Keela integration  ← needs Keela URLs from finance</w:t>
       </w:r>
@@ -4704,8 +4717,8 @@
         <w:rPr>
           <w:rFonts w:ascii="Courier New" w:hAnsi="Courier New"/>
           <w:b w:val="0"/>
-          <w:color w:val="7DD3FC"/>
-          <w:sz w:val="17"/>
+          <w:color w:val="02374F"/>
+          <w:sz w:val="18"/>
         </w:rPr>
         <w:br/>
       </w:r>
@@ -4714,8 +4727,8 @@
           <w:rStyle w:val="VerbatimChar"/>
           <w:rFonts w:ascii="Courier New" w:hAnsi="Courier New"/>
           <w:b w:val="0"/>
-          <w:color w:val="7DD3FC"/>
-          <w:sz w:val="17"/>
+          <w:color w:val="02374F"/>
+          <w:sz w:val="18"/>
         </w:rPr>
         <w:t xml:space="preserve">          → 051 /give/monthly (Homeroom conversion)</w:t>
       </w:r>
@@ -4723,8 +4736,8 @@
         <w:rPr>
           <w:rFonts w:ascii="Courier New" w:hAnsi="Courier New"/>
           <w:b w:val="0"/>
-          <w:color w:val="7DD3FC"/>
-          <w:sz w:val="17"/>
+          <w:color w:val="02374F"/>
+          <w:sz w:val="18"/>
         </w:rPr>
         <w:br/>
       </w:r>
@@ -4733,8 +4746,8 @@
           <w:rStyle w:val="VerbatimChar"/>
           <w:rFonts w:ascii="Courier New" w:hAnsi="Courier New"/>
           <w:b w:val="0"/>
-          <w:color w:val="7DD3FC"/>
-          <w:sz w:val="17"/>
+          <w:color w:val="02374F"/>
+          <w:sz w:val="18"/>
         </w:rPr>
         <w:t xml:space="preserve">      → 070 Newsletter integration</w:t>
       </w:r>
@@ -4742,8 +4755,8 @@
         <w:rPr>
           <w:rFonts w:ascii="Courier New" w:hAnsi="Courier New"/>
           <w:b w:val="0"/>
-          <w:color w:val="7DD3FC"/>
-          <w:sz w:val="17"/>
+          <w:color w:val="02374F"/>
+          <w:sz w:val="18"/>
         </w:rPr>
         <w:br/>
       </w:r>
@@ -4752,8 +4765,8 @@
           <w:rStyle w:val="VerbatimChar"/>
           <w:rFonts w:ascii="Courier New" w:hAnsi="Courier New"/>
           <w:b w:val="0"/>
-          <w:color w:val="7DD3FC"/>
-          <w:sz w:val="17"/>
+          <w:color w:val="02374F"/>
+          <w:sz w:val="18"/>
         </w:rPr>
         <w:t xml:space="preserve">      → 071 /privacy + /terms</w:t>
       </w:r>
@@ -4761,8 +4774,8 @@
         <w:rPr>
           <w:rFonts w:ascii="Courier New" w:hAnsi="Courier New"/>
           <w:b w:val="0"/>
-          <w:color w:val="7DD3FC"/>
-          <w:sz w:val="17"/>
+          <w:color w:val="02374F"/>
+          <w:sz w:val="18"/>
         </w:rPr>
         <w:br/>
       </w:r>
@@ -4771,8 +4784,8 @@
           <w:rStyle w:val="VerbatimChar"/>
           <w:rFonts w:ascii="Courier New" w:hAnsi="Courier New"/>
           <w:b w:val="0"/>
-          <w:color w:val="7DD3FC"/>
-          <w:sz w:val="17"/>
+          <w:color w:val="02374F"/>
+          <w:sz w:val="18"/>
         </w:rPr>
         <w:t xml:space="preserve">      → 080 Analytics</w:t>
       </w:r>
@@ -4780,8 +4793,8 @@
         <w:rPr>
           <w:rFonts w:ascii="Courier New" w:hAnsi="Courier New"/>
           <w:b w:val="0"/>
-          <w:color w:val="7DD3FC"/>
-          <w:sz w:val="17"/>
+          <w:color w:val="02374F"/>
+          <w:sz w:val="18"/>
         </w:rPr>
         <w:br/>
       </w:r>
@@ -4790,8 +4803,8 @@
           <w:rStyle w:val="VerbatimChar"/>
           <w:rFonts w:ascii="Courier New" w:hAnsi="Courier New"/>
           <w:b w:val="0"/>
-          <w:color w:val="7DD3FC"/>
-          <w:sz w:val="17"/>
+          <w:color w:val="02374F"/>
+          <w:sz w:val="18"/>
         </w:rPr>
         <w:t xml:space="preserve">        → 100 Pre-launch QA</w:t>
       </w:r>
@@ -4799,8 +4812,8 @@
         <w:rPr>
           <w:rFonts w:ascii="Courier New" w:hAnsi="Courier New"/>
           <w:b w:val="0"/>
-          <w:color w:val="7DD3FC"/>
-          <w:sz w:val="17"/>
+          <w:color w:val="02374F"/>
+          <w:sz w:val="18"/>
         </w:rPr>
         <w:br/>
       </w:r>
@@ -4809,8 +4822,8 @@
           <w:rStyle w:val="VerbatimChar"/>
           <w:rFonts w:ascii="Courier New" w:hAnsi="Courier New"/>
           <w:b w:val="0"/>
-          <w:color w:val="7DD3FC"/>
-          <w:sz w:val="17"/>
+          <w:color w:val="02374F"/>
+          <w:sz w:val="18"/>
         </w:rPr>
         <w:t xml:space="preserve">          → 101 Production deploy + DNS</w:t>
       </w:r>
@@ -4851,12 +4864,12 @@
         </w:trPr>
         <w:tc>
           <w:tcPr>
-            <w:shd w:val="clear" w:color="auto" w:fill="02374f"/>
-            <w:tcBorders>
-              <w:top w:val="single" w:sz="4" w:space="0" w:color="D1D9DC"/>
-              <w:left w:val="single" w:sz="4" w:space="0" w:color="D1D9DC"/>
-              <w:bottom w:val="single" w:sz="4" w:space="0" w:color="D1D9DC"/>
-              <w:right w:val="single" w:sz="4" w:space="0" w:color="D1D9DC"/>
+            <w:shd w:val="clear" w:color="auto" w:fill="D6EFF2"/>
+            <w:tcBorders>
+              <w:top w:val="single" w:sz="4" w:space="0" w:color="C0D6DC"/>
+              <w:left w:val="single" w:sz="4" w:space="0" w:color="C0D6DC"/>
+              <w:bottom w:val="single" w:sz="4" w:space="0" w:color="C0D6DC"/>
+              <w:right w:val="single" w:sz="4" w:space="0" w:color="C0D6DC"/>
             </w:tcBorders>
             <w:tcMar>
               <w:top w:w="60" w:type="dxa"/>
@@ -4874,7 +4887,7 @@
               <w:rPr>
                 <w:rFonts w:ascii="Calibri" w:hAnsi="Calibri"/>
                 <w:b/>
-                <w:color w:val="FFFFFF"/>
+                <w:color w:val="024E70"/>
                 <w:sz w:val="19"/>
               </w:rPr>
               <w:t xml:space="preserve">#</w:t>
@@ -4883,12 +4896,12 @@
         </w:tc>
         <w:tc>
           <w:tcPr>
-            <w:shd w:val="clear" w:color="auto" w:fill="02374f"/>
-            <w:tcBorders>
-              <w:top w:val="single" w:sz="4" w:space="0" w:color="D1D9DC"/>
-              <w:left w:val="single" w:sz="4" w:space="0" w:color="D1D9DC"/>
-              <w:bottom w:val="single" w:sz="4" w:space="0" w:color="D1D9DC"/>
-              <w:right w:val="single" w:sz="4" w:space="0" w:color="D1D9DC"/>
+            <w:shd w:val="clear" w:color="auto" w:fill="D6EFF2"/>
+            <w:tcBorders>
+              <w:top w:val="single" w:sz="4" w:space="0" w:color="C0D6DC"/>
+              <w:left w:val="single" w:sz="4" w:space="0" w:color="C0D6DC"/>
+              <w:bottom w:val="single" w:sz="4" w:space="0" w:color="C0D6DC"/>
+              <w:right w:val="single" w:sz="4" w:space="0" w:color="C0D6DC"/>
             </w:tcBorders>
             <w:tcMar>
               <w:top w:w="60" w:type="dxa"/>
@@ -4906,7 +4919,7 @@
               <w:rPr>
                 <w:rFonts w:ascii="Calibri" w:hAnsi="Calibri"/>
                 <w:b/>
-                <w:color w:val="FFFFFF"/>
+                <w:color w:val="024E70"/>
                 <w:sz w:val="19"/>
               </w:rPr>
               <w:t xml:space="preserve">Decision</w:t>
@@ -4915,12 +4928,12 @@
         </w:tc>
         <w:tc>
           <w:tcPr>
-            <w:shd w:val="clear" w:color="auto" w:fill="02374f"/>
-            <w:tcBorders>
-              <w:top w:val="single" w:sz="4" w:space="0" w:color="D1D9DC"/>
-              <w:left w:val="single" w:sz="4" w:space="0" w:color="D1D9DC"/>
-              <w:bottom w:val="single" w:sz="4" w:space="0" w:color="D1D9DC"/>
-              <w:right w:val="single" w:sz="4" w:space="0" w:color="D1D9DC"/>
+            <w:shd w:val="clear" w:color="auto" w:fill="D6EFF2"/>
+            <w:tcBorders>
+              <w:top w:val="single" w:sz="4" w:space="0" w:color="C0D6DC"/>
+              <w:left w:val="single" w:sz="4" w:space="0" w:color="C0D6DC"/>
+              <w:bottom w:val="single" w:sz="4" w:space="0" w:color="C0D6DC"/>
+              <w:right w:val="single" w:sz="4" w:space="0" w:color="C0D6DC"/>
             </w:tcBorders>
             <w:tcMar>
               <w:top w:w="60" w:type="dxa"/>
@@ -4938,7 +4951,7 @@
               <w:rPr>
                 <w:rFonts w:ascii="Calibri" w:hAnsi="Calibri"/>
                 <w:b/>
-                <w:color w:val="FFFFFF"/>
+                <w:color w:val="024E70"/>
                 <w:sz w:val="19"/>
               </w:rPr>
               <w:t xml:space="preserve">Owner</w:t>
@@ -4947,12 +4960,12 @@
         </w:tc>
         <w:tc>
           <w:tcPr>
-            <w:shd w:val="clear" w:color="auto" w:fill="02374f"/>
-            <w:tcBorders>
-              <w:top w:val="single" w:sz="4" w:space="0" w:color="D1D9DC"/>
-              <w:left w:val="single" w:sz="4" w:space="0" w:color="D1D9DC"/>
-              <w:bottom w:val="single" w:sz="4" w:space="0" w:color="D1D9DC"/>
-              <w:right w:val="single" w:sz="4" w:space="0" w:color="D1D9DC"/>
+            <w:shd w:val="clear" w:color="auto" w:fill="D6EFF2"/>
+            <w:tcBorders>
+              <w:top w:val="single" w:sz="4" w:space="0" w:color="C0D6DC"/>
+              <w:left w:val="single" w:sz="4" w:space="0" w:color="C0D6DC"/>
+              <w:bottom w:val="single" w:sz="4" w:space="0" w:color="C0D6DC"/>
+              <w:right w:val="single" w:sz="4" w:space="0" w:color="C0D6DC"/>
             </w:tcBorders>
             <w:tcMar>
               <w:top w:w="60" w:type="dxa"/>
@@ -4970,7 +4983,7 @@
               <w:rPr>
                 <w:rFonts w:ascii="Calibri" w:hAnsi="Calibri"/>
                 <w:b/>
-                <w:color w:val="FFFFFF"/>
+                <w:color w:val="024E70"/>
                 <w:sz w:val="19"/>
               </w:rPr>
               <w:t xml:space="preserve">Risk if delayed</w:t>
@@ -4983,10 +4996,10 @@
           <w:tcPr>
             <w:shd w:val="clear" w:color="auto" w:fill="FFFFFF"/>
             <w:tcBorders>
-              <w:top w:val="single" w:sz="4" w:space="0" w:color="D1D9DC"/>
-              <w:left w:val="single" w:sz="4" w:space="0" w:color="D1D9DC"/>
-              <w:bottom w:val="single" w:sz="4" w:space="0" w:color="D1D9DC"/>
-              <w:right w:val="single" w:sz="4" w:space="0" w:color="D1D9DC"/>
+              <w:top w:val="single" w:sz="4" w:space="0" w:color="C0D6DC"/>
+              <w:left w:val="single" w:sz="4" w:space="0" w:color="C0D6DC"/>
+              <w:bottom w:val="single" w:sz="4" w:space="0" w:color="C0D6DC"/>
+              <w:right w:val="single" w:sz="4" w:space="0" w:color="C0D6DC"/>
             </w:tcBorders>
             <w:tcMar>
               <w:top w:w="60" w:type="dxa"/>
@@ -5014,10 +5027,10 @@
           <w:tcPr>
             <w:shd w:val="clear" w:color="auto" w:fill="FFFFFF"/>
             <w:tcBorders>
-              <w:top w:val="single" w:sz="4" w:space="0" w:color="D1D9DC"/>
-              <w:left w:val="single" w:sz="4" w:space="0" w:color="D1D9DC"/>
-              <w:bottom w:val="single" w:sz="4" w:space="0" w:color="D1D9DC"/>
-              <w:right w:val="single" w:sz="4" w:space="0" w:color="D1D9DC"/>
+              <w:top w:val="single" w:sz="4" w:space="0" w:color="C0D6DC"/>
+              <w:left w:val="single" w:sz="4" w:space="0" w:color="C0D6DC"/>
+              <w:bottom w:val="single" w:sz="4" w:space="0" w:color="C0D6DC"/>
+              <w:right w:val="single" w:sz="4" w:space="0" w:color="C0D6DC"/>
             </w:tcBorders>
             <w:tcMar>
               <w:top w:w="60" w:type="dxa"/>
@@ -5063,10 +5076,10 @@
           <w:tcPr>
             <w:shd w:val="clear" w:color="auto" w:fill="FFFFFF"/>
             <w:tcBorders>
-              <w:top w:val="single" w:sz="4" w:space="0" w:color="D1D9DC"/>
-              <w:left w:val="single" w:sz="4" w:space="0" w:color="D1D9DC"/>
-              <w:bottom w:val="single" w:sz="4" w:space="0" w:color="D1D9DC"/>
-              <w:right w:val="single" w:sz="4" w:space="0" w:color="D1D9DC"/>
+              <w:top w:val="single" w:sz="4" w:space="0" w:color="C0D6DC"/>
+              <w:left w:val="single" w:sz="4" w:space="0" w:color="C0D6DC"/>
+              <w:bottom w:val="single" w:sz="4" w:space="0" w:color="C0D6DC"/>
+              <w:right w:val="single" w:sz="4" w:space="0" w:color="C0D6DC"/>
             </w:tcBorders>
             <w:tcMar>
               <w:top w:w="60" w:type="dxa"/>
@@ -5094,10 +5107,10 @@
           <w:tcPr>
             <w:shd w:val="clear" w:color="auto" w:fill="FFFFFF"/>
             <w:tcBorders>
-              <w:top w:val="single" w:sz="4" w:space="0" w:color="D1D9DC"/>
-              <w:left w:val="single" w:sz="4" w:space="0" w:color="D1D9DC"/>
-              <w:bottom w:val="single" w:sz="4" w:space="0" w:color="D1D9DC"/>
-              <w:right w:val="single" w:sz="4" w:space="0" w:color="D1D9DC"/>
+              <w:top w:val="single" w:sz="4" w:space="0" w:color="C0D6DC"/>
+              <w:left w:val="single" w:sz="4" w:space="0" w:color="C0D6DC"/>
+              <w:bottom w:val="single" w:sz="4" w:space="0" w:color="C0D6DC"/>
+              <w:right w:val="single" w:sz="4" w:space="0" w:color="C0D6DC"/>
             </w:tcBorders>
             <w:tcMar>
               <w:top w:w="60" w:type="dxa"/>
@@ -5125,12 +5138,12 @@
       <w:tr>
         <w:tc>
           <w:tcPr>
-            <w:shd w:val="clear" w:color="auto" w:fill="E8F1F2"/>
-            <w:tcBorders>
-              <w:top w:val="single" w:sz="4" w:space="0" w:color="D1D9DC"/>
-              <w:left w:val="single" w:sz="4" w:space="0" w:color="D1D9DC"/>
-              <w:bottom w:val="single" w:sz="4" w:space="0" w:color="D1D9DC"/>
-              <w:right w:val="single" w:sz="4" w:space="0" w:color="D1D9DC"/>
+            <w:shd w:val="clear" w:color="auto" w:fill="F7FAFB"/>
+            <w:tcBorders>
+              <w:top w:val="single" w:sz="4" w:space="0" w:color="C0D6DC"/>
+              <w:left w:val="single" w:sz="4" w:space="0" w:color="C0D6DC"/>
+              <w:bottom w:val="single" w:sz="4" w:space="0" w:color="C0D6DC"/>
+              <w:right w:val="single" w:sz="4" w:space="0" w:color="C0D6DC"/>
             </w:tcBorders>
             <w:tcMar>
               <w:top w:w="60" w:type="dxa"/>
@@ -5156,12 +5169,12 @@
         </w:tc>
         <w:tc>
           <w:tcPr>
-            <w:shd w:val="clear" w:color="auto" w:fill="E8F1F2"/>
-            <w:tcBorders>
-              <w:top w:val="single" w:sz="4" w:space="0" w:color="D1D9DC"/>
-              <w:left w:val="single" w:sz="4" w:space="0" w:color="D1D9DC"/>
-              <w:bottom w:val="single" w:sz="4" w:space="0" w:color="D1D9DC"/>
-              <w:right w:val="single" w:sz="4" w:space="0" w:color="D1D9DC"/>
+            <w:shd w:val="clear" w:color="auto" w:fill="F7FAFB"/>
+            <w:tcBorders>
+              <w:top w:val="single" w:sz="4" w:space="0" w:color="C0D6DC"/>
+              <w:left w:val="single" w:sz="4" w:space="0" w:color="C0D6DC"/>
+              <w:bottom w:val="single" w:sz="4" w:space="0" w:color="C0D6DC"/>
+              <w:right w:val="single" w:sz="4" w:space="0" w:color="C0D6DC"/>
             </w:tcBorders>
             <w:tcMar>
               <w:top w:w="60" w:type="dxa"/>
@@ -5189,12 +5202,12 @@
         </w:tc>
         <w:tc>
           <w:tcPr>
-            <w:shd w:val="clear" w:color="auto" w:fill="E8F1F2"/>
-            <w:tcBorders>
-              <w:top w:val="single" w:sz="4" w:space="0" w:color="D1D9DC"/>
-              <w:left w:val="single" w:sz="4" w:space="0" w:color="D1D9DC"/>
-              <w:bottom w:val="single" w:sz="4" w:space="0" w:color="D1D9DC"/>
-              <w:right w:val="single" w:sz="4" w:space="0" w:color="D1D9DC"/>
+            <w:shd w:val="clear" w:color="auto" w:fill="F7FAFB"/>
+            <w:tcBorders>
+              <w:top w:val="single" w:sz="4" w:space="0" w:color="C0D6DC"/>
+              <w:left w:val="single" w:sz="4" w:space="0" w:color="C0D6DC"/>
+              <w:bottom w:val="single" w:sz="4" w:space="0" w:color="C0D6DC"/>
+              <w:right w:val="single" w:sz="4" w:space="0" w:color="C0D6DC"/>
             </w:tcBorders>
             <w:tcMar>
               <w:top w:w="60" w:type="dxa"/>
@@ -5220,12 +5233,12 @@
         </w:tc>
         <w:tc>
           <w:tcPr>
-            <w:shd w:val="clear" w:color="auto" w:fill="E8F1F2"/>
-            <w:tcBorders>
-              <w:top w:val="single" w:sz="4" w:space="0" w:color="D1D9DC"/>
-              <w:left w:val="single" w:sz="4" w:space="0" w:color="D1D9DC"/>
-              <w:bottom w:val="single" w:sz="4" w:space="0" w:color="D1D9DC"/>
-              <w:right w:val="single" w:sz="4" w:space="0" w:color="D1D9DC"/>
+            <w:shd w:val="clear" w:color="auto" w:fill="F7FAFB"/>
+            <w:tcBorders>
+              <w:top w:val="single" w:sz="4" w:space="0" w:color="C0D6DC"/>
+              <w:left w:val="single" w:sz="4" w:space="0" w:color="C0D6DC"/>
+              <w:bottom w:val="single" w:sz="4" w:space="0" w:color="C0D6DC"/>
+              <w:right w:val="single" w:sz="4" w:space="0" w:color="C0D6DC"/>
             </w:tcBorders>
             <w:tcMar>
               <w:top w:w="60" w:type="dxa"/>
@@ -5255,10 +5268,10 @@
           <w:tcPr>
             <w:shd w:val="clear" w:color="auto" w:fill="FFFFFF"/>
             <w:tcBorders>
-              <w:top w:val="single" w:sz="4" w:space="0" w:color="D1D9DC"/>
-              <w:left w:val="single" w:sz="4" w:space="0" w:color="D1D9DC"/>
-              <w:bottom w:val="single" w:sz="4" w:space="0" w:color="D1D9DC"/>
-              <w:right w:val="single" w:sz="4" w:space="0" w:color="D1D9DC"/>
+              <w:top w:val="single" w:sz="4" w:space="0" w:color="C0D6DC"/>
+              <w:left w:val="single" w:sz="4" w:space="0" w:color="C0D6DC"/>
+              <w:bottom w:val="single" w:sz="4" w:space="0" w:color="C0D6DC"/>
+              <w:right w:val="single" w:sz="4" w:space="0" w:color="C0D6DC"/>
             </w:tcBorders>
             <w:tcMar>
               <w:top w:w="60" w:type="dxa"/>
@@ -5286,10 +5299,10 @@
           <w:tcPr>
             <w:shd w:val="clear" w:color="auto" w:fill="FFFFFF"/>
             <w:tcBorders>
-              <w:top w:val="single" w:sz="4" w:space="0" w:color="D1D9DC"/>
-              <w:left w:val="single" w:sz="4" w:space="0" w:color="D1D9DC"/>
-              <w:bottom w:val="single" w:sz="4" w:space="0" w:color="D1D9DC"/>
-              <w:right w:val="single" w:sz="4" w:space="0" w:color="D1D9DC"/>
+              <w:top w:val="single" w:sz="4" w:space="0" w:color="C0D6DC"/>
+              <w:left w:val="single" w:sz="4" w:space="0" w:color="C0D6DC"/>
+              <w:bottom w:val="single" w:sz="4" w:space="0" w:color="C0D6DC"/>
+              <w:right w:val="single" w:sz="4" w:space="0" w:color="C0D6DC"/>
             </w:tcBorders>
             <w:tcMar>
               <w:top w:w="60" w:type="dxa"/>
@@ -5335,10 +5348,10 @@
           <w:tcPr>
             <w:shd w:val="clear" w:color="auto" w:fill="FFFFFF"/>
             <w:tcBorders>
-              <w:top w:val="single" w:sz="4" w:space="0" w:color="D1D9DC"/>
-              <w:left w:val="single" w:sz="4" w:space="0" w:color="D1D9DC"/>
-              <w:bottom w:val="single" w:sz="4" w:space="0" w:color="D1D9DC"/>
-              <w:right w:val="single" w:sz="4" w:space="0" w:color="D1D9DC"/>
+              <w:top w:val="single" w:sz="4" w:space="0" w:color="C0D6DC"/>
+              <w:left w:val="single" w:sz="4" w:space="0" w:color="C0D6DC"/>
+              <w:bottom w:val="single" w:sz="4" w:space="0" w:color="C0D6DC"/>
+              <w:right w:val="single" w:sz="4" w:space="0" w:color="C0D6DC"/>
             </w:tcBorders>
             <w:tcMar>
               <w:top w:w="60" w:type="dxa"/>
@@ -5366,10 +5379,10 @@
           <w:tcPr>
             <w:shd w:val="clear" w:color="auto" w:fill="FFFFFF"/>
             <w:tcBorders>
-              <w:top w:val="single" w:sz="4" w:space="0" w:color="D1D9DC"/>
-              <w:left w:val="single" w:sz="4" w:space="0" w:color="D1D9DC"/>
-              <w:bottom w:val="single" w:sz="4" w:space="0" w:color="D1D9DC"/>
-              <w:right w:val="single" w:sz="4" w:space="0" w:color="D1D9DC"/>
+              <w:top w:val="single" w:sz="4" w:space="0" w:color="C0D6DC"/>
+              <w:left w:val="single" w:sz="4" w:space="0" w:color="C0D6DC"/>
+              <w:bottom w:val="single" w:sz="4" w:space="0" w:color="C0D6DC"/>
+              <w:right w:val="single" w:sz="4" w:space="0" w:color="C0D6DC"/>
             </w:tcBorders>
             <w:tcMar>
               <w:top w:w="60" w:type="dxa"/>
@@ -5430,12 +5443,12 @@
       <w:tr>
         <w:tc>
           <w:tcPr>
-            <w:shd w:val="clear" w:color="auto" w:fill="E8F1F2"/>
-            <w:tcBorders>
-              <w:top w:val="single" w:sz="4" w:space="0" w:color="D1D9DC"/>
-              <w:left w:val="single" w:sz="4" w:space="0" w:color="D1D9DC"/>
-              <w:bottom w:val="single" w:sz="4" w:space="0" w:color="D1D9DC"/>
-              <w:right w:val="single" w:sz="4" w:space="0" w:color="D1D9DC"/>
+            <w:shd w:val="clear" w:color="auto" w:fill="F7FAFB"/>
+            <w:tcBorders>
+              <w:top w:val="single" w:sz="4" w:space="0" w:color="C0D6DC"/>
+              <w:left w:val="single" w:sz="4" w:space="0" w:color="C0D6DC"/>
+              <w:bottom w:val="single" w:sz="4" w:space="0" w:color="C0D6DC"/>
+              <w:right w:val="single" w:sz="4" w:space="0" w:color="C0D6DC"/>
             </w:tcBorders>
             <w:tcMar>
               <w:top w:w="60" w:type="dxa"/>
@@ -5461,12 +5474,12 @@
         </w:tc>
         <w:tc>
           <w:tcPr>
-            <w:shd w:val="clear" w:color="auto" w:fill="E8F1F2"/>
-            <w:tcBorders>
-              <w:top w:val="single" w:sz="4" w:space="0" w:color="D1D9DC"/>
-              <w:left w:val="single" w:sz="4" w:space="0" w:color="D1D9DC"/>
-              <w:bottom w:val="single" w:sz="4" w:space="0" w:color="D1D9DC"/>
-              <w:right w:val="single" w:sz="4" w:space="0" w:color="D1D9DC"/>
+            <w:shd w:val="clear" w:color="auto" w:fill="F7FAFB"/>
+            <w:tcBorders>
+              <w:top w:val="single" w:sz="4" w:space="0" w:color="C0D6DC"/>
+              <w:left w:val="single" w:sz="4" w:space="0" w:color="C0D6DC"/>
+              <w:bottom w:val="single" w:sz="4" w:space="0" w:color="C0D6DC"/>
+              <w:right w:val="single" w:sz="4" w:space="0" w:color="C0D6DC"/>
             </w:tcBorders>
             <w:tcMar>
               <w:top w:w="60" w:type="dxa"/>
@@ -5510,12 +5523,12 @@
         </w:tc>
         <w:tc>
           <w:tcPr>
-            <w:shd w:val="clear" w:color="auto" w:fill="E8F1F2"/>
-            <w:tcBorders>
-              <w:top w:val="single" w:sz="4" w:space="0" w:color="D1D9DC"/>
-              <w:left w:val="single" w:sz="4" w:space="0" w:color="D1D9DC"/>
-              <w:bottom w:val="single" w:sz="4" w:space="0" w:color="D1D9DC"/>
-              <w:right w:val="single" w:sz="4" w:space="0" w:color="D1D9DC"/>
+            <w:shd w:val="clear" w:color="auto" w:fill="F7FAFB"/>
+            <w:tcBorders>
+              <w:top w:val="single" w:sz="4" w:space="0" w:color="C0D6DC"/>
+              <w:left w:val="single" w:sz="4" w:space="0" w:color="C0D6DC"/>
+              <w:bottom w:val="single" w:sz="4" w:space="0" w:color="C0D6DC"/>
+              <w:right w:val="single" w:sz="4" w:space="0" w:color="C0D6DC"/>
             </w:tcBorders>
             <w:tcMar>
               <w:top w:w="60" w:type="dxa"/>
@@ -5541,12 +5554,12 @@
         </w:tc>
         <w:tc>
           <w:tcPr>
-            <w:shd w:val="clear" w:color="auto" w:fill="E8F1F2"/>
-            <w:tcBorders>
-              <w:top w:val="single" w:sz="4" w:space="0" w:color="D1D9DC"/>
-              <w:left w:val="single" w:sz="4" w:space="0" w:color="D1D9DC"/>
-              <w:bottom w:val="single" w:sz="4" w:space="0" w:color="D1D9DC"/>
-              <w:right w:val="single" w:sz="4" w:space="0" w:color="D1D9DC"/>
+            <w:shd w:val="clear" w:color="auto" w:fill="F7FAFB"/>
+            <w:tcBorders>
+              <w:top w:val="single" w:sz="4" w:space="0" w:color="C0D6DC"/>
+              <w:left w:val="single" w:sz="4" w:space="0" w:color="C0D6DC"/>
+              <w:bottom w:val="single" w:sz="4" w:space="0" w:color="C0D6DC"/>
+              <w:right w:val="single" w:sz="4" w:space="0" w:color="C0D6DC"/>
             </w:tcBorders>
             <w:tcMar>
               <w:top w:w="60" w:type="dxa"/>
@@ -5593,10 +5606,10 @@
           <w:tcPr>
             <w:shd w:val="clear" w:color="auto" w:fill="FFFFFF"/>
             <w:tcBorders>
-              <w:top w:val="single" w:sz="4" w:space="0" w:color="D1D9DC"/>
-              <w:left w:val="single" w:sz="4" w:space="0" w:color="D1D9DC"/>
-              <w:bottom w:val="single" w:sz="4" w:space="0" w:color="D1D9DC"/>
-              <w:right w:val="single" w:sz="4" w:space="0" w:color="D1D9DC"/>
+              <w:top w:val="single" w:sz="4" w:space="0" w:color="C0D6DC"/>
+              <w:left w:val="single" w:sz="4" w:space="0" w:color="C0D6DC"/>
+              <w:bottom w:val="single" w:sz="4" w:space="0" w:color="C0D6DC"/>
+              <w:right w:val="single" w:sz="4" w:space="0" w:color="C0D6DC"/>
             </w:tcBorders>
             <w:tcMar>
               <w:top w:w="60" w:type="dxa"/>
@@ -5624,10 +5637,10 @@
           <w:tcPr>
             <w:shd w:val="clear" w:color="auto" w:fill="FFFFFF"/>
             <w:tcBorders>
-              <w:top w:val="single" w:sz="4" w:space="0" w:color="D1D9DC"/>
-              <w:left w:val="single" w:sz="4" w:space="0" w:color="D1D9DC"/>
-              <w:bottom w:val="single" w:sz="4" w:space="0" w:color="D1D9DC"/>
-              <w:right w:val="single" w:sz="4" w:space="0" w:color="D1D9DC"/>
+              <w:top w:val="single" w:sz="4" w:space="0" w:color="C0D6DC"/>
+              <w:left w:val="single" w:sz="4" w:space="0" w:color="C0D6DC"/>
+              <w:bottom w:val="single" w:sz="4" w:space="0" w:color="C0D6DC"/>
+              <w:right w:val="single" w:sz="4" w:space="0" w:color="C0D6DC"/>
             </w:tcBorders>
             <w:tcMar>
               <w:top w:w="60" w:type="dxa"/>
@@ -5657,10 +5670,10 @@
           <w:tcPr>
             <w:shd w:val="clear" w:color="auto" w:fill="FFFFFF"/>
             <w:tcBorders>
-              <w:top w:val="single" w:sz="4" w:space="0" w:color="D1D9DC"/>
-              <w:left w:val="single" w:sz="4" w:space="0" w:color="D1D9DC"/>
-              <w:bottom w:val="single" w:sz="4" w:space="0" w:color="D1D9DC"/>
-              <w:right w:val="single" w:sz="4" w:space="0" w:color="D1D9DC"/>
+              <w:top w:val="single" w:sz="4" w:space="0" w:color="C0D6DC"/>
+              <w:left w:val="single" w:sz="4" w:space="0" w:color="C0D6DC"/>
+              <w:bottom w:val="single" w:sz="4" w:space="0" w:color="C0D6DC"/>
+              <w:right w:val="single" w:sz="4" w:space="0" w:color="C0D6DC"/>
             </w:tcBorders>
             <w:tcMar>
               <w:top w:w="60" w:type="dxa"/>
@@ -5688,10 +5701,10 @@
           <w:tcPr>
             <w:shd w:val="clear" w:color="auto" w:fill="FFFFFF"/>
             <w:tcBorders>
-              <w:top w:val="single" w:sz="4" w:space="0" w:color="D1D9DC"/>
-              <w:left w:val="single" w:sz="4" w:space="0" w:color="D1D9DC"/>
-              <w:bottom w:val="single" w:sz="4" w:space="0" w:color="D1D9DC"/>
-              <w:right w:val="single" w:sz="4" w:space="0" w:color="D1D9DC"/>
+              <w:top w:val="single" w:sz="4" w:space="0" w:color="C0D6DC"/>
+              <w:left w:val="single" w:sz="4" w:space="0" w:color="C0D6DC"/>
+              <w:bottom w:val="single" w:sz="4" w:space="0" w:color="C0D6DC"/>
+              <w:right w:val="single" w:sz="4" w:space="0" w:color="C0D6DC"/>
             </w:tcBorders>
             <w:tcMar>
               <w:top w:w="60" w:type="dxa"/>
@@ -5752,12 +5765,12 @@
       <w:tr>
         <w:tc>
           <w:tcPr>
-            <w:shd w:val="clear" w:color="auto" w:fill="E8F1F2"/>
-            <w:tcBorders>
-              <w:top w:val="single" w:sz="4" w:space="0" w:color="D1D9DC"/>
-              <w:left w:val="single" w:sz="4" w:space="0" w:color="D1D9DC"/>
-              <w:bottom w:val="single" w:sz="4" w:space="0" w:color="D1D9DC"/>
-              <w:right w:val="single" w:sz="4" w:space="0" w:color="D1D9DC"/>
+            <w:shd w:val="clear" w:color="auto" w:fill="F7FAFB"/>
+            <w:tcBorders>
+              <w:top w:val="single" w:sz="4" w:space="0" w:color="C0D6DC"/>
+              <w:left w:val="single" w:sz="4" w:space="0" w:color="C0D6DC"/>
+              <w:bottom w:val="single" w:sz="4" w:space="0" w:color="C0D6DC"/>
+              <w:right w:val="single" w:sz="4" w:space="0" w:color="C0D6DC"/>
             </w:tcBorders>
             <w:tcMar>
               <w:top w:w="60" w:type="dxa"/>
@@ -5783,12 +5796,12 @@
         </w:tc>
         <w:tc>
           <w:tcPr>
-            <w:shd w:val="clear" w:color="auto" w:fill="E8F1F2"/>
-            <w:tcBorders>
-              <w:top w:val="single" w:sz="4" w:space="0" w:color="D1D9DC"/>
-              <w:left w:val="single" w:sz="4" w:space="0" w:color="D1D9DC"/>
-              <w:bottom w:val="single" w:sz="4" w:space="0" w:color="D1D9DC"/>
-              <w:right w:val="single" w:sz="4" w:space="0" w:color="D1D9DC"/>
+            <w:shd w:val="clear" w:color="auto" w:fill="F7FAFB"/>
+            <w:tcBorders>
+              <w:top w:val="single" w:sz="4" w:space="0" w:color="C0D6DC"/>
+              <w:left w:val="single" w:sz="4" w:space="0" w:color="C0D6DC"/>
+              <w:bottom w:val="single" w:sz="4" w:space="0" w:color="C0D6DC"/>
+              <w:right w:val="single" w:sz="4" w:space="0" w:color="C0D6DC"/>
             </w:tcBorders>
             <w:tcMar>
               <w:top w:w="60" w:type="dxa"/>
@@ -5816,12 +5829,12 @@
         </w:tc>
         <w:tc>
           <w:tcPr>
-            <w:shd w:val="clear" w:color="auto" w:fill="E8F1F2"/>
-            <w:tcBorders>
-              <w:top w:val="single" w:sz="4" w:space="0" w:color="D1D9DC"/>
-              <w:left w:val="single" w:sz="4" w:space="0" w:color="D1D9DC"/>
-              <w:bottom w:val="single" w:sz="4" w:space="0" w:color="D1D9DC"/>
-              <w:right w:val="single" w:sz="4" w:space="0" w:color="D1D9DC"/>
+            <w:shd w:val="clear" w:color="auto" w:fill="F7FAFB"/>
+            <w:tcBorders>
+              <w:top w:val="single" w:sz="4" w:space="0" w:color="C0D6DC"/>
+              <w:left w:val="single" w:sz="4" w:space="0" w:color="C0D6DC"/>
+              <w:bottom w:val="single" w:sz="4" w:space="0" w:color="C0D6DC"/>
+              <w:right w:val="single" w:sz="4" w:space="0" w:color="C0D6DC"/>
             </w:tcBorders>
             <w:tcMar>
               <w:top w:w="60" w:type="dxa"/>
@@ -5847,12 +5860,12 @@
         </w:tc>
         <w:tc>
           <w:tcPr>
-            <w:shd w:val="clear" w:color="auto" w:fill="E8F1F2"/>
-            <w:tcBorders>
-              <w:top w:val="single" w:sz="4" w:space="0" w:color="D1D9DC"/>
-              <w:left w:val="single" w:sz="4" w:space="0" w:color="D1D9DC"/>
-              <w:bottom w:val="single" w:sz="4" w:space="0" w:color="D1D9DC"/>
-              <w:right w:val="single" w:sz="4" w:space="0" w:color="D1D9DC"/>
+            <w:shd w:val="clear" w:color="auto" w:fill="F7FAFB"/>
+            <w:tcBorders>
+              <w:top w:val="single" w:sz="4" w:space="0" w:color="C0D6DC"/>
+              <w:left w:val="single" w:sz="4" w:space="0" w:color="C0D6DC"/>
+              <w:bottom w:val="single" w:sz="4" w:space="0" w:color="C0D6DC"/>
+              <w:right w:val="single" w:sz="4" w:space="0" w:color="C0D6DC"/>
             </w:tcBorders>
             <w:tcMar>
               <w:top w:w="60" w:type="dxa"/>
@@ -5882,10 +5895,10 @@
           <w:tcPr>
             <w:shd w:val="clear" w:color="auto" w:fill="FFFFFF"/>
             <w:tcBorders>
-              <w:top w:val="single" w:sz="4" w:space="0" w:color="D1D9DC"/>
-              <w:left w:val="single" w:sz="4" w:space="0" w:color="D1D9DC"/>
-              <w:bottom w:val="single" w:sz="4" w:space="0" w:color="D1D9DC"/>
-              <w:right w:val="single" w:sz="4" w:space="0" w:color="D1D9DC"/>
+              <w:top w:val="single" w:sz="4" w:space="0" w:color="C0D6DC"/>
+              <w:left w:val="single" w:sz="4" w:space="0" w:color="C0D6DC"/>
+              <w:bottom w:val="single" w:sz="4" w:space="0" w:color="C0D6DC"/>
+              <w:right w:val="single" w:sz="4" w:space="0" w:color="C0D6DC"/>
             </w:tcBorders>
             <w:tcMar>
               <w:top w:w="60" w:type="dxa"/>
@@ -5913,10 +5926,10 @@
           <w:tcPr>
             <w:shd w:val="clear" w:color="auto" w:fill="FFFFFF"/>
             <w:tcBorders>
-              <w:top w:val="single" w:sz="4" w:space="0" w:color="D1D9DC"/>
-              <w:left w:val="single" w:sz="4" w:space="0" w:color="D1D9DC"/>
-              <w:bottom w:val="single" w:sz="4" w:space="0" w:color="D1D9DC"/>
-              <w:right w:val="single" w:sz="4" w:space="0" w:color="D1D9DC"/>
+              <w:top w:val="single" w:sz="4" w:space="0" w:color="C0D6DC"/>
+              <w:left w:val="single" w:sz="4" w:space="0" w:color="C0D6DC"/>
+              <w:bottom w:val="single" w:sz="4" w:space="0" w:color="C0D6DC"/>
+              <w:right w:val="single" w:sz="4" w:space="0" w:color="C0D6DC"/>
             </w:tcBorders>
             <w:tcMar>
               <w:top w:w="60" w:type="dxa"/>
@@ -5962,10 +5975,10 @@
           <w:tcPr>
             <w:shd w:val="clear" w:color="auto" w:fill="FFFFFF"/>
             <w:tcBorders>
-              <w:top w:val="single" w:sz="4" w:space="0" w:color="D1D9DC"/>
-              <w:left w:val="single" w:sz="4" w:space="0" w:color="D1D9DC"/>
-              <w:bottom w:val="single" w:sz="4" w:space="0" w:color="D1D9DC"/>
-              <w:right w:val="single" w:sz="4" w:space="0" w:color="D1D9DC"/>
+              <w:top w:val="single" w:sz="4" w:space="0" w:color="C0D6DC"/>
+              <w:left w:val="single" w:sz="4" w:space="0" w:color="C0D6DC"/>
+              <w:bottom w:val="single" w:sz="4" w:space="0" w:color="C0D6DC"/>
+              <w:right w:val="single" w:sz="4" w:space="0" w:color="C0D6DC"/>
             </w:tcBorders>
             <w:tcMar>
               <w:top w:w="60" w:type="dxa"/>
@@ -5993,10 +6006,10 @@
           <w:tcPr>
             <w:shd w:val="clear" w:color="auto" w:fill="FFFFFF"/>
             <w:tcBorders>
-              <w:top w:val="single" w:sz="4" w:space="0" w:color="D1D9DC"/>
-              <w:left w:val="single" w:sz="4" w:space="0" w:color="D1D9DC"/>
-              <w:bottom w:val="single" w:sz="4" w:space="0" w:color="D1D9DC"/>
-              <w:right w:val="single" w:sz="4" w:space="0" w:color="D1D9DC"/>
+              <w:top w:val="single" w:sz="4" w:space="0" w:color="C0D6DC"/>
+              <w:left w:val="single" w:sz="4" w:space="0" w:color="C0D6DC"/>
+              <w:bottom w:val="single" w:sz="4" w:space="0" w:color="C0D6DC"/>
+              <w:right w:val="single" w:sz="4" w:space="0" w:color="C0D6DC"/>
             </w:tcBorders>
             <w:tcMar>
               <w:top w:w="60" w:type="dxa"/>
@@ -6088,12 +6101,12 @@
         </w:trPr>
         <w:tc>
           <w:tcPr>
-            <w:shd w:val="clear" w:color="auto" w:fill="02374f"/>
-            <w:tcBorders>
-              <w:top w:val="single" w:sz="4" w:space="0" w:color="D1D9DC"/>
-              <w:left w:val="single" w:sz="4" w:space="0" w:color="D1D9DC"/>
-              <w:bottom w:val="single" w:sz="4" w:space="0" w:color="D1D9DC"/>
-              <w:right w:val="single" w:sz="4" w:space="0" w:color="D1D9DC"/>
+            <w:shd w:val="clear" w:color="auto" w:fill="D6EFF2"/>
+            <w:tcBorders>
+              <w:top w:val="single" w:sz="4" w:space="0" w:color="C0D6DC"/>
+              <w:left w:val="single" w:sz="4" w:space="0" w:color="C0D6DC"/>
+              <w:bottom w:val="single" w:sz="4" w:space="0" w:color="C0D6DC"/>
+              <w:right w:val="single" w:sz="4" w:space="0" w:color="C0D6DC"/>
             </w:tcBorders>
             <w:tcMar>
               <w:top w:w="60" w:type="dxa"/>
@@ -6111,7 +6124,7 @@
               <w:rPr>
                 <w:rFonts w:ascii="Calibri" w:hAnsi="Calibri"/>
                 <w:b/>
-                <w:color w:val="FFFFFF"/>
+                <w:color w:val="024E70"/>
                 <w:sz w:val="19"/>
               </w:rPr>
               <w:t xml:space="preserve">Metric</w:t>
@@ -6120,12 +6133,12 @@
         </w:tc>
         <w:tc>
           <w:tcPr>
-            <w:shd w:val="clear" w:color="auto" w:fill="02374f"/>
-            <w:tcBorders>
-              <w:top w:val="single" w:sz="4" w:space="0" w:color="D1D9DC"/>
-              <w:left w:val="single" w:sz="4" w:space="0" w:color="D1D9DC"/>
-              <w:bottom w:val="single" w:sz="4" w:space="0" w:color="D1D9DC"/>
-              <w:right w:val="single" w:sz="4" w:space="0" w:color="D1D9DC"/>
+            <w:shd w:val="clear" w:color="auto" w:fill="D6EFF2"/>
+            <w:tcBorders>
+              <w:top w:val="single" w:sz="4" w:space="0" w:color="C0D6DC"/>
+              <w:left w:val="single" w:sz="4" w:space="0" w:color="C0D6DC"/>
+              <w:bottom w:val="single" w:sz="4" w:space="0" w:color="C0D6DC"/>
+              <w:right w:val="single" w:sz="4" w:space="0" w:color="C0D6DC"/>
             </w:tcBorders>
             <w:tcMar>
               <w:top w:w="60" w:type="dxa"/>
@@ -6143,7 +6156,7 @@
               <w:rPr>
                 <w:rFonts w:ascii="Calibri" w:hAnsi="Calibri"/>
                 <w:b/>
-                <w:color w:val="FFFFFF"/>
+                <w:color w:val="024E70"/>
                 <w:sz w:val="19"/>
               </w:rPr>
               <w:t xml:space="preserve">Target</w:t>
@@ -6156,10 +6169,10 @@
           <w:tcPr>
             <w:shd w:val="clear" w:color="auto" w:fill="FFFFFF"/>
             <w:tcBorders>
-              <w:top w:val="single" w:sz="4" w:space="0" w:color="D1D9DC"/>
-              <w:left w:val="single" w:sz="4" w:space="0" w:color="D1D9DC"/>
-              <w:bottom w:val="single" w:sz="4" w:space="0" w:color="D1D9DC"/>
-              <w:right w:val="single" w:sz="4" w:space="0" w:color="D1D9DC"/>
+              <w:top w:val="single" w:sz="4" w:space="0" w:color="C0D6DC"/>
+              <w:left w:val="single" w:sz="4" w:space="0" w:color="C0D6DC"/>
+              <w:bottom w:val="single" w:sz="4" w:space="0" w:color="C0D6DC"/>
+              <w:right w:val="single" w:sz="4" w:space="0" w:color="C0D6DC"/>
             </w:tcBorders>
             <w:tcMar>
               <w:top w:w="60" w:type="dxa"/>
@@ -6187,10 +6200,10 @@
           <w:tcPr>
             <w:shd w:val="clear" w:color="auto" w:fill="FFFFFF"/>
             <w:tcBorders>
-              <w:top w:val="single" w:sz="4" w:space="0" w:color="D1D9DC"/>
-              <w:left w:val="single" w:sz="4" w:space="0" w:color="D1D9DC"/>
-              <w:bottom w:val="single" w:sz="4" w:space="0" w:color="D1D9DC"/>
-              <w:right w:val="single" w:sz="4" w:space="0" w:color="D1D9DC"/>
+              <w:top w:val="single" w:sz="4" w:space="0" w:color="C0D6DC"/>
+              <w:left w:val="single" w:sz="4" w:space="0" w:color="C0D6DC"/>
+              <w:bottom w:val="single" w:sz="4" w:space="0" w:color="C0D6DC"/>
+              <w:right w:val="single" w:sz="4" w:space="0" w:color="C0D6DC"/>
             </w:tcBorders>
             <w:tcMar>
               <w:top w:w="60" w:type="dxa"/>
@@ -6218,12 +6231,12 @@
       <w:tr>
         <w:tc>
           <w:tcPr>
-            <w:shd w:val="clear" w:color="auto" w:fill="E8F1F2"/>
-            <w:tcBorders>
-              <w:top w:val="single" w:sz="4" w:space="0" w:color="D1D9DC"/>
-              <w:left w:val="single" w:sz="4" w:space="0" w:color="D1D9DC"/>
-              <w:bottom w:val="single" w:sz="4" w:space="0" w:color="D1D9DC"/>
-              <w:right w:val="single" w:sz="4" w:space="0" w:color="D1D9DC"/>
+            <w:shd w:val="clear" w:color="auto" w:fill="F7FAFB"/>
+            <w:tcBorders>
+              <w:top w:val="single" w:sz="4" w:space="0" w:color="C0D6DC"/>
+              <w:left w:val="single" w:sz="4" w:space="0" w:color="C0D6DC"/>
+              <w:bottom w:val="single" w:sz="4" w:space="0" w:color="C0D6DC"/>
+              <w:right w:val="single" w:sz="4" w:space="0" w:color="C0D6DC"/>
             </w:tcBorders>
             <w:tcMar>
               <w:top w:w="60" w:type="dxa"/>
@@ -6266,12 +6279,12 @@
         </w:tc>
         <w:tc>
           <w:tcPr>
-            <w:shd w:val="clear" w:color="auto" w:fill="E8F1F2"/>
-            <w:tcBorders>
-              <w:top w:val="single" w:sz="4" w:space="0" w:color="D1D9DC"/>
-              <w:left w:val="single" w:sz="4" w:space="0" w:color="D1D9DC"/>
-              <w:bottom w:val="single" w:sz="4" w:space="0" w:color="D1D9DC"/>
-              <w:right w:val="single" w:sz="4" w:space="0" w:color="D1D9DC"/>
+            <w:shd w:val="clear" w:color="auto" w:fill="F7FAFB"/>
+            <w:tcBorders>
+              <w:top w:val="single" w:sz="4" w:space="0" w:color="C0D6DC"/>
+              <w:left w:val="single" w:sz="4" w:space="0" w:color="C0D6DC"/>
+              <w:bottom w:val="single" w:sz="4" w:space="0" w:color="C0D6DC"/>
+              <w:right w:val="single" w:sz="4" w:space="0" w:color="C0D6DC"/>
             </w:tcBorders>
             <w:tcMar>
               <w:top w:w="60" w:type="dxa"/>
@@ -6301,10 +6314,10 @@
           <w:tcPr>
             <w:shd w:val="clear" w:color="auto" w:fill="FFFFFF"/>
             <w:tcBorders>
-              <w:top w:val="single" w:sz="4" w:space="0" w:color="D1D9DC"/>
-              <w:left w:val="single" w:sz="4" w:space="0" w:color="D1D9DC"/>
-              <w:bottom w:val="single" w:sz="4" w:space="0" w:color="D1D9DC"/>
-              <w:right w:val="single" w:sz="4" w:space="0" w:color="D1D9DC"/>
+              <w:top w:val="single" w:sz="4" w:space="0" w:color="C0D6DC"/>
+              <w:left w:val="single" w:sz="4" w:space="0" w:color="C0D6DC"/>
+              <w:bottom w:val="single" w:sz="4" w:space="0" w:color="C0D6DC"/>
+              <w:right w:val="single" w:sz="4" w:space="0" w:color="C0D6DC"/>
             </w:tcBorders>
             <w:tcMar>
               <w:top w:w="60" w:type="dxa"/>
@@ -6332,10 +6345,10 @@
           <w:tcPr>
             <w:shd w:val="clear" w:color="auto" w:fill="FFFFFF"/>
             <w:tcBorders>
-              <w:top w:val="single" w:sz="4" w:space="0" w:color="D1D9DC"/>
-              <w:left w:val="single" w:sz="4" w:space="0" w:color="D1D9DC"/>
-              <w:bottom w:val="single" w:sz="4" w:space="0" w:color="D1D9DC"/>
-              <w:right w:val="single" w:sz="4" w:space="0" w:color="D1D9DC"/>
+              <w:top w:val="single" w:sz="4" w:space="0" w:color="C0D6DC"/>
+              <w:left w:val="single" w:sz="4" w:space="0" w:color="C0D6DC"/>
+              <w:bottom w:val="single" w:sz="4" w:space="0" w:color="C0D6DC"/>
+              <w:right w:val="single" w:sz="4" w:space="0" w:color="C0D6DC"/>
             </w:tcBorders>
             <w:tcMar>
               <w:top w:w="60" w:type="dxa"/>
@@ -6363,12 +6376,12 @@
       <w:tr>
         <w:tc>
           <w:tcPr>
-            <w:shd w:val="clear" w:color="auto" w:fill="E8F1F2"/>
-            <w:tcBorders>
-              <w:top w:val="single" w:sz="4" w:space="0" w:color="D1D9DC"/>
-              <w:left w:val="single" w:sz="4" w:space="0" w:color="D1D9DC"/>
-              <w:bottom w:val="single" w:sz="4" w:space="0" w:color="D1D9DC"/>
-              <w:right w:val="single" w:sz="4" w:space="0" w:color="D1D9DC"/>
+            <w:shd w:val="clear" w:color="auto" w:fill="F7FAFB"/>
+            <w:tcBorders>
+              <w:top w:val="single" w:sz="4" w:space="0" w:color="C0D6DC"/>
+              <w:left w:val="single" w:sz="4" w:space="0" w:color="C0D6DC"/>
+              <w:bottom w:val="single" w:sz="4" w:space="0" w:color="C0D6DC"/>
+              <w:right w:val="single" w:sz="4" w:space="0" w:color="C0D6DC"/>
             </w:tcBorders>
             <w:tcMar>
               <w:top w:w="60" w:type="dxa"/>
@@ -6394,12 +6407,12 @@
         </w:tc>
         <w:tc>
           <w:tcPr>
-            <w:shd w:val="clear" w:color="auto" w:fill="E8F1F2"/>
-            <w:tcBorders>
-              <w:top w:val="single" w:sz="4" w:space="0" w:color="D1D9DC"/>
-              <w:left w:val="single" w:sz="4" w:space="0" w:color="D1D9DC"/>
-              <w:bottom w:val="single" w:sz="4" w:space="0" w:color="D1D9DC"/>
-              <w:right w:val="single" w:sz="4" w:space="0" w:color="D1D9DC"/>
+            <w:shd w:val="clear" w:color="auto" w:fill="F7FAFB"/>
+            <w:tcBorders>
+              <w:top w:val="single" w:sz="4" w:space="0" w:color="C0D6DC"/>
+              <w:left w:val="single" w:sz="4" w:space="0" w:color="C0D6DC"/>
+              <w:bottom w:val="single" w:sz="4" w:space="0" w:color="C0D6DC"/>
+              <w:right w:val="single" w:sz="4" w:space="0" w:color="C0D6DC"/>
             </w:tcBorders>
             <w:tcMar>
               <w:top w:w="60" w:type="dxa"/>
@@ -6429,10 +6442,10 @@
           <w:tcPr>
             <w:shd w:val="clear" w:color="auto" w:fill="FFFFFF"/>
             <w:tcBorders>
-              <w:top w:val="single" w:sz="4" w:space="0" w:color="D1D9DC"/>
-              <w:left w:val="single" w:sz="4" w:space="0" w:color="D1D9DC"/>
-              <w:bottom w:val="single" w:sz="4" w:space="0" w:color="D1D9DC"/>
-              <w:right w:val="single" w:sz="4" w:space="0" w:color="D1D9DC"/>
+              <w:top w:val="single" w:sz="4" w:space="0" w:color="C0D6DC"/>
+              <w:left w:val="single" w:sz="4" w:space="0" w:color="C0D6DC"/>
+              <w:bottom w:val="single" w:sz="4" w:space="0" w:color="C0D6DC"/>
+              <w:right w:val="single" w:sz="4" w:space="0" w:color="C0D6DC"/>
             </w:tcBorders>
             <w:tcMar>
               <w:top w:w="60" w:type="dxa"/>
@@ -6460,10 +6473,10 @@
           <w:tcPr>
             <w:shd w:val="clear" w:color="auto" w:fill="FFFFFF"/>
             <w:tcBorders>
-              <w:top w:val="single" w:sz="4" w:space="0" w:color="D1D9DC"/>
-              <w:left w:val="single" w:sz="4" w:space="0" w:color="D1D9DC"/>
-              <w:bottom w:val="single" w:sz="4" w:space="0" w:color="D1D9DC"/>
-              <w:right w:val="single" w:sz="4" w:space="0" w:color="D1D9DC"/>
+              <w:top w:val="single" w:sz="4" w:space="0" w:color="C0D6DC"/>
+              <w:left w:val="single" w:sz="4" w:space="0" w:color="C0D6DC"/>
+              <w:bottom w:val="single" w:sz="4" w:space="0" w:color="C0D6DC"/>
+              <w:right w:val="single" w:sz="4" w:space="0" w:color="C0D6DC"/>
             </w:tcBorders>
             <w:tcMar>
               <w:top w:w="60" w:type="dxa"/>
@@ -6491,12 +6504,12 @@
       <w:tr>
         <w:tc>
           <w:tcPr>
-            <w:shd w:val="clear" w:color="auto" w:fill="E8F1F2"/>
-            <w:tcBorders>
-              <w:top w:val="single" w:sz="4" w:space="0" w:color="D1D9DC"/>
-              <w:left w:val="single" w:sz="4" w:space="0" w:color="D1D9DC"/>
-              <w:bottom w:val="single" w:sz="4" w:space="0" w:color="D1D9DC"/>
-              <w:right w:val="single" w:sz="4" w:space="0" w:color="D1D9DC"/>
+            <w:shd w:val="clear" w:color="auto" w:fill="F7FAFB"/>
+            <w:tcBorders>
+              <w:top w:val="single" w:sz="4" w:space="0" w:color="C0D6DC"/>
+              <w:left w:val="single" w:sz="4" w:space="0" w:color="C0D6DC"/>
+              <w:bottom w:val="single" w:sz="4" w:space="0" w:color="C0D6DC"/>
+              <w:right w:val="single" w:sz="4" w:space="0" w:color="C0D6DC"/>
             </w:tcBorders>
             <w:tcMar>
               <w:top w:w="60" w:type="dxa"/>
@@ -6522,12 +6535,12 @@
         </w:tc>
         <w:tc>
           <w:tcPr>
-            <w:shd w:val="clear" w:color="auto" w:fill="E8F1F2"/>
-            <w:tcBorders>
-              <w:top w:val="single" w:sz="4" w:space="0" w:color="D1D9DC"/>
-              <w:left w:val="single" w:sz="4" w:space="0" w:color="D1D9DC"/>
-              <w:bottom w:val="single" w:sz="4" w:space="0" w:color="D1D9DC"/>
-              <w:right w:val="single" w:sz="4" w:space="0" w:color="D1D9DC"/>
+            <w:shd w:val="clear" w:color="auto" w:fill="F7FAFB"/>
+            <w:tcBorders>
+              <w:top w:val="single" w:sz="4" w:space="0" w:color="C0D6DC"/>
+              <w:left w:val="single" w:sz="4" w:space="0" w:color="C0D6DC"/>
+              <w:bottom w:val="single" w:sz="4" w:space="0" w:color="C0D6DC"/>
+              <w:right w:val="single" w:sz="4" w:space="0" w:color="C0D6DC"/>
             </w:tcBorders>
             <w:tcMar>
               <w:top w:w="60" w:type="dxa"/>
@@ -6557,10 +6570,10 @@
           <w:tcPr>
             <w:shd w:val="clear" w:color="auto" w:fill="FFFFFF"/>
             <w:tcBorders>
-              <w:top w:val="single" w:sz="4" w:space="0" w:color="D1D9DC"/>
-              <w:left w:val="single" w:sz="4" w:space="0" w:color="D1D9DC"/>
-              <w:bottom w:val="single" w:sz="4" w:space="0" w:color="D1D9DC"/>
-              <w:right w:val="single" w:sz="4" w:space="0" w:color="D1D9DC"/>
+              <w:top w:val="single" w:sz="4" w:space="0" w:color="C0D6DC"/>
+              <w:left w:val="single" w:sz="4" w:space="0" w:color="C0D6DC"/>
+              <w:bottom w:val="single" w:sz="4" w:space="0" w:color="C0D6DC"/>
+              <w:right w:val="single" w:sz="4" w:space="0" w:color="C0D6DC"/>
             </w:tcBorders>
             <w:tcMar>
               <w:top w:w="60" w:type="dxa"/>
@@ -6588,10 +6601,10 @@
           <w:tcPr>
             <w:shd w:val="clear" w:color="auto" w:fill="FFFFFF"/>
             <w:tcBorders>
-              <w:top w:val="single" w:sz="4" w:space="0" w:color="D1D9DC"/>
-              <w:left w:val="single" w:sz="4" w:space="0" w:color="D1D9DC"/>
-              <w:bottom w:val="single" w:sz="4" w:space="0" w:color="D1D9DC"/>
-              <w:right w:val="single" w:sz="4" w:space="0" w:color="D1D9DC"/>
+              <w:top w:val="single" w:sz="4" w:space="0" w:color="C0D6DC"/>
+              <w:left w:val="single" w:sz="4" w:space="0" w:color="C0D6DC"/>
+              <w:bottom w:val="single" w:sz="4" w:space="0" w:color="C0D6DC"/>
+              <w:right w:val="single" w:sz="4" w:space="0" w:color="C0D6DC"/>
             </w:tcBorders>
             <w:tcMar>
               <w:top w:w="60" w:type="dxa"/>
@@ -6651,12 +6664,12 @@
         </w:trPr>
         <w:tc>
           <w:tcPr>
-            <w:shd w:val="clear" w:color="auto" w:fill="02374f"/>
-            <w:tcBorders>
-              <w:top w:val="single" w:sz="4" w:space="0" w:color="D1D9DC"/>
-              <w:left w:val="single" w:sz="4" w:space="0" w:color="D1D9DC"/>
-              <w:bottom w:val="single" w:sz="4" w:space="0" w:color="D1D9DC"/>
-              <w:right w:val="single" w:sz="4" w:space="0" w:color="D1D9DC"/>
+            <w:shd w:val="clear" w:color="auto" w:fill="D6EFF2"/>
+            <w:tcBorders>
+              <w:top w:val="single" w:sz="4" w:space="0" w:color="C0D6DC"/>
+              <w:left w:val="single" w:sz="4" w:space="0" w:color="C0D6DC"/>
+              <w:bottom w:val="single" w:sz="4" w:space="0" w:color="C0D6DC"/>
+              <w:right w:val="single" w:sz="4" w:space="0" w:color="C0D6DC"/>
             </w:tcBorders>
             <w:tcMar>
               <w:top w:w="60" w:type="dxa"/>
@@ -6674,7 +6687,7 @@
               <w:rPr>
                 <w:rFonts w:ascii="Calibri" w:hAnsi="Calibri"/>
                 <w:b/>
-                <w:color w:val="FFFFFF"/>
+                <w:color w:val="024E70"/>
                 <w:sz w:val="19"/>
               </w:rPr>
               <w:t xml:space="preserve">Need</w:t>
@@ -6683,12 +6696,12 @@
         </w:tc>
         <w:tc>
           <w:tcPr>
-            <w:shd w:val="clear" w:color="auto" w:fill="02374f"/>
-            <w:tcBorders>
-              <w:top w:val="single" w:sz="4" w:space="0" w:color="D1D9DC"/>
-              <w:left w:val="single" w:sz="4" w:space="0" w:color="D1D9DC"/>
-              <w:bottom w:val="single" w:sz="4" w:space="0" w:color="D1D9DC"/>
-              <w:right w:val="single" w:sz="4" w:space="0" w:color="D1D9DC"/>
+            <w:shd w:val="clear" w:color="auto" w:fill="D6EFF2"/>
+            <w:tcBorders>
+              <w:top w:val="single" w:sz="4" w:space="0" w:color="C0D6DC"/>
+              <w:left w:val="single" w:sz="4" w:space="0" w:color="C0D6DC"/>
+              <w:bottom w:val="single" w:sz="4" w:space="0" w:color="C0D6DC"/>
+              <w:right w:val="single" w:sz="4" w:space="0" w:color="C0D6DC"/>
             </w:tcBorders>
             <w:tcMar>
               <w:top w:w="60" w:type="dxa"/>
@@ -6706,7 +6719,7 @@
               <w:rPr>
                 <w:rFonts w:ascii="Calibri" w:hAnsi="Calibri"/>
                 <w:b/>
-                <w:color w:val="FFFFFF"/>
+                <w:color w:val="024E70"/>
                 <w:sz w:val="19"/>
               </w:rPr>
               <w:t xml:space="preserve">Document</w:t>
@@ -6719,10 +6732,10 @@
           <w:tcPr>
             <w:shd w:val="clear" w:color="auto" w:fill="FFFFFF"/>
             <w:tcBorders>
-              <w:top w:val="single" w:sz="4" w:space="0" w:color="D1D9DC"/>
-              <w:left w:val="single" w:sz="4" w:space="0" w:color="D1D9DC"/>
-              <w:bottom w:val="single" w:sz="4" w:space="0" w:color="D1D9DC"/>
-              <w:right w:val="single" w:sz="4" w:space="0" w:color="D1D9DC"/>
+              <w:top w:val="single" w:sz="4" w:space="0" w:color="C0D6DC"/>
+              <w:left w:val="single" w:sz="4" w:space="0" w:color="C0D6DC"/>
+              <w:bottom w:val="single" w:sz="4" w:space="0" w:color="C0D6DC"/>
+              <w:right w:val="single" w:sz="4" w:space="0" w:color="C0D6DC"/>
             </w:tcBorders>
             <w:tcMar>
               <w:top w:w="60" w:type="dxa"/>
@@ -6750,10 +6763,10 @@
           <w:tcPr>
             <w:shd w:val="clear" w:color="auto" w:fill="FFFFFF"/>
             <w:tcBorders>
-              <w:top w:val="single" w:sz="4" w:space="0" w:color="D1D9DC"/>
-              <w:left w:val="single" w:sz="4" w:space="0" w:color="D1D9DC"/>
-              <w:bottom w:val="single" w:sz="4" w:space="0" w:color="D1D9DC"/>
-              <w:right w:val="single" w:sz="4" w:space="0" w:color="D1D9DC"/>
+              <w:top w:val="single" w:sz="4" w:space="0" w:color="C0D6DC"/>
+              <w:left w:val="single" w:sz="4" w:space="0" w:color="C0D6DC"/>
+              <w:bottom w:val="single" w:sz="4" w:space="0" w:color="C0D6DC"/>
+              <w:right w:val="single" w:sz="4" w:space="0" w:color="C0D6DC"/>
             </w:tcBorders>
             <w:tcMar>
               <w:top w:w="60" w:type="dxa"/>
@@ -6798,12 +6811,12 @@
       <w:tr>
         <w:tc>
           <w:tcPr>
-            <w:shd w:val="clear" w:color="auto" w:fill="E8F1F2"/>
-            <w:tcBorders>
-              <w:top w:val="single" w:sz="4" w:space="0" w:color="D1D9DC"/>
-              <w:left w:val="single" w:sz="4" w:space="0" w:color="D1D9DC"/>
-              <w:bottom w:val="single" w:sz="4" w:space="0" w:color="D1D9DC"/>
-              <w:right w:val="single" w:sz="4" w:space="0" w:color="D1D9DC"/>
+            <w:shd w:val="clear" w:color="auto" w:fill="F7FAFB"/>
+            <w:tcBorders>
+              <w:top w:val="single" w:sz="4" w:space="0" w:color="C0D6DC"/>
+              <w:left w:val="single" w:sz="4" w:space="0" w:color="C0D6DC"/>
+              <w:bottom w:val="single" w:sz="4" w:space="0" w:color="C0D6DC"/>
+              <w:right w:val="single" w:sz="4" w:space="0" w:color="C0D6DC"/>
             </w:tcBorders>
             <w:tcMar>
               <w:top w:w="60" w:type="dxa"/>
@@ -6829,12 +6842,12 @@
         </w:tc>
         <w:tc>
           <w:tcPr>
-            <w:shd w:val="clear" w:color="auto" w:fill="E8F1F2"/>
-            <w:tcBorders>
-              <w:top w:val="single" w:sz="4" w:space="0" w:color="D1D9DC"/>
-              <w:left w:val="single" w:sz="4" w:space="0" w:color="D1D9DC"/>
-              <w:bottom w:val="single" w:sz="4" w:space="0" w:color="D1D9DC"/>
-              <w:right w:val="single" w:sz="4" w:space="0" w:color="D1D9DC"/>
+            <w:shd w:val="clear" w:color="auto" w:fill="F7FAFB"/>
+            <w:tcBorders>
+              <w:top w:val="single" w:sz="4" w:space="0" w:color="C0D6DC"/>
+              <w:left w:val="single" w:sz="4" w:space="0" w:color="C0D6DC"/>
+              <w:bottom w:val="single" w:sz="4" w:space="0" w:color="C0D6DC"/>
+              <w:right w:val="single" w:sz="4" w:space="0" w:color="C0D6DC"/>
             </w:tcBorders>
             <w:tcMar>
               <w:top w:w="60" w:type="dxa"/>
@@ -6865,10 +6878,10 @@
           <w:tcPr>
             <w:shd w:val="clear" w:color="auto" w:fill="FFFFFF"/>
             <w:tcBorders>
-              <w:top w:val="single" w:sz="4" w:space="0" w:color="D1D9DC"/>
-              <w:left w:val="single" w:sz="4" w:space="0" w:color="D1D9DC"/>
-              <w:bottom w:val="single" w:sz="4" w:space="0" w:color="D1D9DC"/>
-              <w:right w:val="single" w:sz="4" w:space="0" w:color="D1D9DC"/>
+              <w:top w:val="single" w:sz="4" w:space="0" w:color="C0D6DC"/>
+              <w:left w:val="single" w:sz="4" w:space="0" w:color="C0D6DC"/>
+              <w:bottom w:val="single" w:sz="4" w:space="0" w:color="C0D6DC"/>
+              <w:right w:val="single" w:sz="4" w:space="0" w:color="C0D6DC"/>
             </w:tcBorders>
             <w:tcMar>
               <w:top w:w="60" w:type="dxa"/>
@@ -6896,10 +6909,10 @@
           <w:tcPr>
             <w:shd w:val="clear" w:color="auto" w:fill="FFFFFF"/>
             <w:tcBorders>
-              <w:top w:val="single" w:sz="4" w:space="0" w:color="D1D9DC"/>
-              <w:left w:val="single" w:sz="4" w:space="0" w:color="D1D9DC"/>
-              <w:bottom w:val="single" w:sz="4" w:space="0" w:color="D1D9DC"/>
-              <w:right w:val="single" w:sz="4" w:space="0" w:color="D1D9DC"/>
+              <w:top w:val="single" w:sz="4" w:space="0" w:color="C0D6DC"/>
+              <w:left w:val="single" w:sz="4" w:space="0" w:color="C0D6DC"/>
+              <w:bottom w:val="single" w:sz="4" w:space="0" w:color="C0D6DC"/>
+              <w:right w:val="single" w:sz="4" w:space="0" w:color="C0D6DC"/>
             </w:tcBorders>
             <w:tcMar>
               <w:top w:w="60" w:type="dxa"/>
@@ -6928,12 +6941,12 @@
       <w:tr>
         <w:tc>
           <w:tcPr>
-            <w:shd w:val="clear" w:color="auto" w:fill="E8F1F2"/>
-            <w:tcBorders>
-              <w:top w:val="single" w:sz="4" w:space="0" w:color="D1D9DC"/>
-              <w:left w:val="single" w:sz="4" w:space="0" w:color="D1D9DC"/>
-              <w:bottom w:val="single" w:sz="4" w:space="0" w:color="D1D9DC"/>
-              <w:right w:val="single" w:sz="4" w:space="0" w:color="D1D9DC"/>
+            <w:shd w:val="clear" w:color="auto" w:fill="F7FAFB"/>
+            <w:tcBorders>
+              <w:top w:val="single" w:sz="4" w:space="0" w:color="C0D6DC"/>
+              <w:left w:val="single" w:sz="4" w:space="0" w:color="C0D6DC"/>
+              <w:bottom w:val="single" w:sz="4" w:space="0" w:color="C0D6DC"/>
+              <w:right w:val="single" w:sz="4" w:space="0" w:color="C0D6DC"/>
             </w:tcBorders>
             <w:tcMar>
               <w:top w:w="60" w:type="dxa"/>
@@ -6976,12 +6989,12 @@
         </w:tc>
         <w:tc>
           <w:tcPr>
-            <w:shd w:val="clear" w:color="auto" w:fill="E8F1F2"/>
-            <w:tcBorders>
-              <w:top w:val="single" w:sz="4" w:space="0" w:color="D1D9DC"/>
-              <w:left w:val="single" w:sz="4" w:space="0" w:color="D1D9DC"/>
-              <w:bottom w:val="single" w:sz="4" w:space="0" w:color="D1D9DC"/>
-              <w:right w:val="single" w:sz="4" w:space="0" w:color="D1D9DC"/>
+            <w:shd w:val="clear" w:color="auto" w:fill="F7FAFB"/>
+            <w:tcBorders>
+              <w:top w:val="single" w:sz="4" w:space="0" w:color="C0D6DC"/>
+              <w:left w:val="single" w:sz="4" w:space="0" w:color="C0D6DC"/>
+              <w:bottom w:val="single" w:sz="4" w:space="0" w:color="C0D6DC"/>
+              <w:right w:val="single" w:sz="4" w:space="0" w:color="C0D6DC"/>
             </w:tcBorders>
             <w:tcMar>
               <w:top w:w="60" w:type="dxa"/>
@@ -7012,10 +7025,10 @@
           <w:tcPr>
             <w:shd w:val="clear" w:color="auto" w:fill="FFFFFF"/>
             <w:tcBorders>
-              <w:top w:val="single" w:sz="4" w:space="0" w:color="D1D9DC"/>
-              <w:left w:val="single" w:sz="4" w:space="0" w:color="D1D9DC"/>
-              <w:bottom w:val="single" w:sz="4" w:space="0" w:color="D1D9DC"/>
-              <w:right w:val="single" w:sz="4" w:space="0" w:color="D1D9DC"/>
+              <w:top w:val="single" w:sz="4" w:space="0" w:color="C0D6DC"/>
+              <w:left w:val="single" w:sz="4" w:space="0" w:color="C0D6DC"/>
+              <w:bottom w:val="single" w:sz="4" w:space="0" w:color="C0D6DC"/>
+              <w:right w:val="single" w:sz="4" w:space="0" w:color="C0D6DC"/>
             </w:tcBorders>
             <w:tcMar>
               <w:top w:w="60" w:type="dxa"/>
@@ -7043,10 +7056,10 @@
           <w:tcPr>
             <w:shd w:val="clear" w:color="auto" w:fill="FFFFFF"/>
             <w:tcBorders>
-              <w:top w:val="single" w:sz="4" w:space="0" w:color="D1D9DC"/>
-              <w:left w:val="single" w:sz="4" w:space="0" w:color="D1D9DC"/>
-              <w:bottom w:val="single" w:sz="4" w:space="0" w:color="D1D9DC"/>
-              <w:right w:val="single" w:sz="4" w:space="0" w:color="D1D9DC"/>
+              <w:top w:val="single" w:sz="4" w:space="0" w:color="C0D6DC"/>
+              <w:left w:val="single" w:sz="4" w:space="0" w:color="C0D6DC"/>
+              <w:bottom w:val="single" w:sz="4" w:space="0" w:color="C0D6DC"/>
+              <w:right w:val="single" w:sz="4" w:space="0" w:color="C0D6DC"/>
             </w:tcBorders>
             <w:tcMar>
               <w:top w:w="60" w:type="dxa"/>
@@ -7075,12 +7088,12 @@
       <w:tr>
         <w:tc>
           <w:tcPr>
-            <w:shd w:val="clear" w:color="auto" w:fill="E8F1F2"/>
-            <w:tcBorders>
-              <w:top w:val="single" w:sz="4" w:space="0" w:color="D1D9DC"/>
-              <w:left w:val="single" w:sz="4" w:space="0" w:color="D1D9DC"/>
-              <w:bottom w:val="single" w:sz="4" w:space="0" w:color="D1D9DC"/>
-              <w:right w:val="single" w:sz="4" w:space="0" w:color="D1D9DC"/>
+            <w:shd w:val="clear" w:color="auto" w:fill="F7FAFB"/>
+            <w:tcBorders>
+              <w:top w:val="single" w:sz="4" w:space="0" w:color="C0D6DC"/>
+              <w:left w:val="single" w:sz="4" w:space="0" w:color="C0D6DC"/>
+              <w:bottom w:val="single" w:sz="4" w:space="0" w:color="C0D6DC"/>
+              <w:right w:val="single" w:sz="4" w:space="0" w:color="C0D6DC"/>
             </w:tcBorders>
             <w:tcMar>
               <w:top w:w="60" w:type="dxa"/>
@@ -7106,12 +7119,12 @@
         </w:tc>
         <w:tc>
           <w:tcPr>
-            <w:shd w:val="clear" w:color="auto" w:fill="E8F1F2"/>
-            <w:tcBorders>
-              <w:top w:val="single" w:sz="4" w:space="0" w:color="D1D9DC"/>
-              <w:left w:val="single" w:sz="4" w:space="0" w:color="D1D9DC"/>
-              <w:bottom w:val="single" w:sz="4" w:space="0" w:color="D1D9DC"/>
-              <w:right w:val="single" w:sz="4" w:space="0" w:color="D1D9DC"/>
+            <w:shd w:val="clear" w:color="auto" w:fill="F7FAFB"/>
+            <w:tcBorders>
+              <w:top w:val="single" w:sz="4" w:space="0" w:color="C0D6DC"/>
+              <w:left w:val="single" w:sz="4" w:space="0" w:color="C0D6DC"/>
+              <w:bottom w:val="single" w:sz="4" w:space="0" w:color="C0D6DC"/>
+              <w:right w:val="single" w:sz="4" w:space="0" w:color="C0D6DC"/>
             </w:tcBorders>
             <w:tcMar>
               <w:top w:w="60" w:type="dxa"/>
@@ -7142,10 +7155,10 @@
           <w:tcPr>
             <w:shd w:val="clear" w:color="auto" w:fill="FFFFFF"/>
             <w:tcBorders>
-              <w:top w:val="single" w:sz="4" w:space="0" w:color="D1D9DC"/>
-              <w:left w:val="single" w:sz="4" w:space="0" w:color="D1D9DC"/>
-              <w:bottom w:val="single" w:sz="4" w:space="0" w:color="D1D9DC"/>
-              <w:right w:val="single" w:sz="4" w:space="0" w:color="D1D9DC"/>
+              <w:top w:val="single" w:sz="4" w:space="0" w:color="C0D6DC"/>
+              <w:left w:val="single" w:sz="4" w:space="0" w:color="C0D6DC"/>
+              <w:bottom w:val="single" w:sz="4" w:space="0" w:color="C0D6DC"/>
+              <w:right w:val="single" w:sz="4" w:space="0" w:color="C0D6DC"/>
             </w:tcBorders>
             <w:tcMar>
               <w:top w:w="60" w:type="dxa"/>
@@ -7173,10 +7186,10 @@
           <w:tcPr>
             <w:shd w:val="clear" w:color="auto" w:fill="FFFFFF"/>
             <w:tcBorders>
-              <w:top w:val="single" w:sz="4" w:space="0" w:color="D1D9DC"/>
-              <w:left w:val="single" w:sz="4" w:space="0" w:color="D1D9DC"/>
-              <w:bottom w:val="single" w:sz="4" w:space="0" w:color="D1D9DC"/>
-              <w:right w:val="single" w:sz="4" w:space="0" w:color="D1D9DC"/>
+              <w:top w:val="single" w:sz="4" w:space="0" w:color="C0D6DC"/>
+              <w:left w:val="single" w:sz="4" w:space="0" w:color="C0D6DC"/>
+              <w:bottom w:val="single" w:sz="4" w:space="0" w:color="C0D6DC"/>
+              <w:right w:val="single" w:sz="4" w:space="0" w:color="C0D6DC"/>
             </w:tcBorders>
             <w:tcMar>
               <w:top w:w="60" w:type="dxa"/>
@@ -7205,12 +7218,12 @@
       <w:tr>
         <w:tc>
           <w:tcPr>
-            <w:shd w:val="clear" w:color="auto" w:fill="E8F1F2"/>
-            <w:tcBorders>
-              <w:top w:val="single" w:sz="4" w:space="0" w:color="D1D9DC"/>
-              <w:left w:val="single" w:sz="4" w:space="0" w:color="D1D9DC"/>
-              <w:bottom w:val="single" w:sz="4" w:space="0" w:color="D1D9DC"/>
-              <w:right w:val="single" w:sz="4" w:space="0" w:color="D1D9DC"/>
+            <w:shd w:val="clear" w:color="auto" w:fill="F7FAFB"/>
+            <w:tcBorders>
+              <w:top w:val="single" w:sz="4" w:space="0" w:color="C0D6DC"/>
+              <w:left w:val="single" w:sz="4" w:space="0" w:color="C0D6DC"/>
+              <w:bottom w:val="single" w:sz="4" w:space="0" w:color="C0D6DC"/>
+              <w:right w:val="single" w:sz="4" w:space="0" w:color="C0D6DC"/>
             </w:tcBorders>
             <w:tcMar>
               <w:top w:w="60" w:type="dxa"/>
@@ -7236,12 +7249,12 @@
         </w:tc>
         <w:tc>
           <w:tcPr>
-            <w:shd w:val="clear" w:color="auto" w:fill="E8F1F2"/>
-            <w:tcBorders>
-              <w:top w:val="single" w:sz="4" w:space="0" w:color="D1D9DC"/>
-              <w:left w:val="single" w:sz="4" w:space="0" w:color="D1D9DC"/>
-              <w:bottom w:val="single" w:sz="4" w:space="0" w:color="D1D9DC"/>
-              <w:right w:val="single" w:sz="4" w:space="0" w:color="D1D9DC"/>
+            <w:shd w:val="clear" w:color="auto" w:fill="F7FAFB"/>
+            <w:tcBorders>
+              <w:top w:val="single" w:sz="4" w:space="0" w:color="C0D6DC"/>
+              <w:left w:val="single" w:sz="4" w:space="0" w:color="C0D6DC"/>
+              <w:bottom w:val="single" w:sz="4" w:space="0" w:color="C0D6DC"/>
+              <w:right w:val="single" w:sz="4" w:space="0" w:color="C0D6DC"/>
             </w:tcBorders>
             <w:tcMar>
               <w:top w:w="60" w:type="dxa"/>
@@ -7272,10 +7285,10 @@
           <w:tcPr>
             <w:shd w:val="clear" w:color="auto" w:fill="FFFFFF"/>
             <w:tcBorders>
-              <w:top w:val="single" w:sz="4" w:space="0" w:color="D1D9DC"/>
-              <w:left w:val="single" w:sz="4" w:space="0" w:color="D1D9DC"/>
-              <w:bottom w:val="single" w:sz="4" w:space="0" w:color="D1D9DC"/>
-              <w:right w:val="single" w:sz="4" w:space="0" w:color="D1D9DC"/>
+              <w:top w:val="single" w:sz="4" w:space="0" w:color="C0D6DC"/>
+              <w:left w:val="single" w:sz="4" w:space="0" w:color="C0D6DC"/>
+              <w:bottom w:val="single" w:sz="4" w:space="0" w:color="C0D6DC"/>
+              <w:right w:val="single" w:sz="4" w:space="0" w:color="C0D6DC"/>
             </w:tcBorders>
             <w:tcMar>
               <w:top w:w="60" w:type="dxa"/>
@@ -7303,10 +7316,10 @@
           <w:tcPr>
             <w:shd w:val="clear" w:color="auto" w:fill="FFFFFF"/>
             <w:tcBorders>
-              <w:top w:val="single" w:sz="4" w:space="0" w:color="D1D9DC"/>
-              <w:left w:val="single" w:sz="4" w:space="0" w:color="D1D9DC"/>
-              <w:bottom w:val="single" w:sz="4" w:space="0" w:color="D1D9DC"/>
-              <w:right w:val="single" w:sz="4" w:space="0" w:color="D1D9DC"/>
+              <w:top w:val="single" w:sz="4" w:space="0" w:color="C0D6DC"/>
+              <w:left w:val="single" w:sz="4" w:space="0" w:color="C0D6DC"/>
+              <w:bottom w:val="single" w:sz="4" w:space="0" w:color="C0D6DC"/>
+              <w:right w:val="single" w:sz="4" w:space="0" w:color="C0D6DC"/>
             </w:tcBorders>
             <w:tcMar>
               <w:top w:w="60" w:type="dxa"/>
@@ -7335,12 +7348,12 @@
       <w:tr>
         <w:tc>
           <w:tcPr>
-            <w:shd w:val="clear" w:color="auto" w:fill="E8F1F2"/>
-            <w:tcBorders>
-              <w:top w:val="single" w:sz="4" w:space="0" w:color="D1D9DC"/>
-              <w:left w:val="single" w:sz="4" w:space="0" w:color="D1D9DC"/>
-              <w:bottom w:val="single" w:sz="4" w:space="0" w:color="D1D9DC"/>
-              <w:right w:val="single" w:sz="4" w:space="0" w:color="D1D9DC"/>
+            <w:shd w:val="clear" w:color="auto" w:fill="F7FAFB"/>
+            <w:tcBorders>
+              <w:top w:val="single" w:sz="4" w:space="0" w:color="C0D6DC"/>
+              <w:left w:val="single" w:sz="4" w:space="0" w:color="C0D6DC"/>
+              <w:bottom w:val="single" w:sz="4" w:space="0" w:color="C0D6DC"/>
+              <w:right w:val="single" w:sz="4" w:space="0" w:color="C0D6DC"/>
             </w:tcBorders>
             <w:tcMar>
               <w:top w:w="60" w:type="dxa"/>
@@ -7366,12 +7379,12 @@
         </w:tc>
         <w:tc>
           <w:tcPr>
-            <w:shd w:val="clear" w:color="auto" w:fill="E8F1F2"/>
-            <w:tcBorders>
-              <w:top w:val="single" w:sz="4" w:space="0" w:color="D1D9DC"/>
-              <w:left w:val="single" w:sz="4" w:space="0" w:color="D1D9DC"/>
-              <w:bottom w:val="single" w:sz="4" w:space="0" w:color="D1D9DC"/>
-              <w:right w:val="single" w:sz="4" w:space="0" w:color="D1D9DC"/>
+            <w:shd w:val="clear" w:color="auto" w:fill="F7FAFB"/>
+            <w:tcBorders>
+              <w:top w:val="single" w:sz="4" w:space="0" w:color="C0D6DC"/>
+              <w:left w:val="single" w:sz="4" w:space="0" w:color="C0D6DC"/>
+              <w:bottom w:val="single" w:sz="4" w:space="0" w:color="C0D6DC"/>
+              <w:right w:val="single" w:sz="4" w:space="0" w:color="C0D6DC"/>
             </w:tcBorders>
             <w:tcMar>
               <w:top w:w="60" w:type="dxa"/>

</xml_diff>